<commit_message>
Update UI assets, menu cards, and docs
</commit_message>
<xml_diff>
--- a/backend/Модульная_документация_СВОЙ_РЕСТОРАН_v6.docx
+++ b/backend/Модульная_документация_СВОЙ_РЕСТОРАН_v6.docx
@@ -347,7 +347,7 @@
         </w:rPr>
       </w:pPr>
       <w:r>
-        <w:t>Backend: Python / Flask · Хранилище: JSON-файлы или Postgres (Neon) · Архитектура: модульная (routes/, services/, storage/, models/, config.py)</w:t>
+        <w:t>Backend: Python / Flask · Хранилище: JSON-файлы (локальный режим без DATABASE_URL) или Postgres (Neon, основной backend при наличии DATABASE_URL) · Кэш меню: Redis по REDIS_URL · Архитектура: модульная (routes/, services/, storage/, models/, config.py)</w:t>
       </w:r>
     </w:p>
     <w:p>
@@ -785,33 +785,7 @@
           </w:tcPr>
           <w:p>
             <w:r>
-              <w:t>Проверить отображение текста ошибок на формах входа и регистрации.</w:t>
-            </w:r>
-          </w:p>
-          <w:p>
-            <w:r>
-              <w:t xml:space="preserve">Проверить, что после успешного логина выполняется </w:t>
-            </w:r>
-            <w:proofErr w:type="spellStart"/>
-            <w:r>
-              <w:t>редирект</w:t>
-            </w:r>
-            <w:proofErr w:type="spellEnd"/>
-            <w:r>
-              <w:t xml:space="preserve"> на главную страницу (/).</w:t>
-            </w:r>
-          </w:p>
-          <w:p>
-            <w:r>
-              <w:t xml:space="preserve">Проверить </w:t>
-            </w:r>
-            <w:proofErr w:type="spellStart"/>
-            <w:r>
-              <w:t>фронтенд</w:t>
-            </w:r>
-            <w:proofErr w:type="spellEnd"/>
-            <w:r>
-              <w:t>-маску телефона: префикс +7 не стирается, формат ввода остаётся стабильным при редактировании.</w:t>
+              <w:t>Проверить отображение текста ошибок на формах входа и регистрации. / Проверить, что после успешного логина выполняется редирект на главную страницу (/). / Проверить фронтенд-маску телефона: префикс +7 не стирается, формат ввода остаётся стабильным при редактировании. / На мобильных устройствах проверить подсказку: если встроенный браузер (например, Telegram) не удерживает вход, пользователь видит рекомендацию открыть сайт в Chrome.</w:t>
             </w:r>
           </w:p>
         </w:tc>
@@ -1667,109 +1641,7 @@
           </w:tcPr>
           <w:p>
             <w:r>
-              <w:t>Отрисовка зала: проверить, что занятые столы помечаются корректно по выбранной дате/времени.</w:t>
-            </w:r>
-          </w:p>
-          <w:p>
-            <w:r>
-              <w:t>Проверка доступности: GET /</w:t>
-            </w:r>
-            <w:proofErr w:type="spellStart"/>
-            <w:r>
-              <w:t>availability?date</w:t>
-            </w:r>
-            <w:proofErr w:type="spellEnd"/>
-            <w:r>
-              <w:t>=</w:t>
-            </w:r>
-            <w:proofErr w:type="spellStart"/>
-            <w:r>
-              <w:t>YYYY-MM-DD&amp;time</w:t>
-            </w:r>
-            <w:proofErr w:type="spellEnd"/>
-            <w:r>
-              <w:t xml:space="preserve">=HH:MM возвращает статус </w:t>
-            </w:r>
-            <w:proofErr w:type="spellStart"/>
-            <w:r>
-              <w:t>reserved</w:t>
-            </w:r>
-            <w:proofErr w:type="spellEnd"/>
-            <w:r>
-              <w:t>.</w:t>
-            </w:r>
-          </w:p>
-          <w:p>
-            <w:r>
-              <w:t>Создание брони: POST /</w:t>
-            </w:r>
-            <w:proofErr w:type="spellStart"/>
-            <w:r>
-              <w:t>book</w:t>
-            </w:r>
-            <w:proofErr w:type="spellEnd"/>
-            <w:r>
-              <w:t xml:space="preserve"> (JSON) с валидными данными создаёт запись в </w:t>
-            </w:r>
-            <w:proofErr w:type="spellStart"/>
-            <w:proofErr w:type="gramStart"/>
-            <w:r>
-              <w:t>bookings.json</w:t>
-            </w:r>
-            <w:proofErr w:type="spellEnd"/>
-            <w:proofErr w:type="gramEnd"/>
-            <w:r>
-              <w:t>.</w:t>
-            </w:r>
-          </w:p>
-          <w:p>
-            <w:r>
-              <w:t>Конфликт брони: попытка занять уже занятый стол на пересекающееся время — возвращает 409.</w:t>
-            </w:r>
-          </w:p>
-          <w:p>
-            <w:r>
-              <w:t>Отмена брони: POST /</w:t>
-            </w:r>
-            <w:proofErr w:type="spellStart"/>
-            <w:r>
-              <w:t>bookings</w:t>
-            </w:r>
-            <w:proofErr w:type="spellEnd"/>
-            <w:r>
-              <w:t>/</w:t>
-            </w:r>
-            <w:proofErr w:type="spellStart"/>
-            <w:r>
-              <w:t>cancel</w:t>
-            </w:r>
-            <w:proofErr w:type="spellEnd"/>
-            <w:r>
-              <w:t xml:space="preserve"> отменяет бронь текущего пользователя и переводит связанные </w:t>
-            </w:r>
-            <w:proofErr w:type="spellStart"/>
-            <w:r>
-              <w:t>dine-in</w:t>
-            </w:r>
-            <w:proofErr w:type="spellEnd"/>
-            <w:r>
-              <w:t xml:space="preserve"> заказы в </w:t>
-            </w:r>
-            <w:proofErr w:type="spellStart"/>
-            <w:r>
-              <w:t>status</w:t>
-            </w:r>
-            <w:proofErr w:type="spellEnd"/>
-            <w:r>
-              <w:t>=</w:t>
-            </w:r>
-            <w:proofErr w:type="spellStart"/>
-            <w:r>
-              <w:t>cancelled</w:t>
-            </w:r>
-            <w:proofErr w:type="spellEnd"/>
-            <w:r>
-              <w:t>.</w:t>
+              <w:t>Отрисовка зала: проверить, что занятые столы помечаются корректно по выбранной дате/времени. / Проверка доступности: GET /availability?date=YYYY-MM-DD&amp;time=HH:MM возвращает статус reserved. / Создание брони: POST /book (JSON) с валидными данными создаёт запись в активном backend-хранилище (bookings.json локально или app_state в Postgres). / Конфликт брони: попытка занять уже занятый стол на пересекающееся время — возвращает 409. / Отмена брони: POST /bookings/cancel отменяет бронь текущего пользователя и переводит связанные dine-in заказы в status=cancelled.</w:t>
             </w:r>
           </w:p>
         </w:tc>
@@ -2201,201 +2073,7 @@
         </w:rPr>
       </w:pPr>
       <w:r>
-        <w:rPr>
-          <w:b/>
-          <w:bCs/>
-          <w:color w:val="595959"/>
-          <w:sz w:val="20"/>
-          <w:szCs w:val="20"/>
-        </w:rPr>
-        <w:lastRenderedPageBreak/>
-        <w:t>Ответственные</w:t>
-      </w:r>
-      <w:r>
-        <w:rPr>
-          <w:b/>
-          <w:bCs/>
-          <w:color w:val="595959"/>
-          <w:sz w:val="20"/>
-          <w:szCs w:val="20"/>
-          <w:lang w:val="en-US"/>
-        </w:rPr>
-        <w:t xml:space="preserve"> </w:t>
-      </w:r>
-      <w:r>
-        <w:rPr>
-          <w:b/>
-          <w:bCs/>
-          <w:color w:val="595959"/>
-          <w:sz w:val="20"/>
-          <w:szCs w:val="20"/>
-        </w:rPr>
-        <w:t>функции</w:t>
-      </w:r>
-      <w:r>
-        <w:rPr>
-          <w:b/>
-          <w:bCs/>
-          <w:color w:val="595959"/>
-          <w:sz w:val="20"/>
-          <w:szCs w:val="20"/>
-          <w:lang w:val="en-US"/>
-        </w:rPr>
-        <w:t xml:space="preserve">: </w:t>
-      </w:r>
-      <w:proofErr w:type="spellStart"/>
-      <w:r>
-        <w:rPr>
-          <w:rFonts w:ascii="Courier New" w:eastAsia="Courier New" w:hAnsi="Courier New" w:cs="Courier New"/>
-          <w:color w:val="C7254E"/>
-          <w:sz w:val="20"/>
-          <w:szCs w:val="20"/>
-          <w:lang w:val="en-US"/>
-        </w:rPr>
-        <w:t>menu_</w:t>
-      </w:r>
-      <w:proofErr w:type="gramStart"/>
-      <w:r>
-        <w:rPr>
-          <w:rFonts w:ascii="Courier New" w:eastAsia="Courier New" w:hAnsi="Courier New" w:cs="Courier New"/>
-          <w:color w:val="C7254E"/>
-          <w:sz w:val="20"/>
-          <w:szCs w:val="20"/>
-          <w:lang w:val="en-US"/>
-        </w:rPr>
-        <w:t>route</w:t>
-      </w:r>
-      <w:proofErr w:type="spellEnd"/>
-      <w:r>
-        <w:rPr>
-          <w:rFonts w:ascii="Courier New" w:eastAsia="Courier New" w:hAnsi="Courier New" w:cs="Courier New"/>
-          <w:color w:val="C7254E"/>
-          <w:sz w:val="20"/>
-          <w:szCs w:val="20"/>
-          <w:lang w:val="en-US"/>
-        </w:rPr>
-        <w:t>(</w:t>
-      </w:r>
-      <w:proofErr w:type="gramEnd"/>
-      <w:r>
-        <w:rPr>
-          <w:rFonts w:ascii="Courier New" w:eastAsia="Courier New" w:hAnsi="Courier New" w:cs="Courier New"/>
-          <w:color w:val="C7254E"/>
-          <w:sz w:val="20"/>
-          <w:szCs w:val="20"/>
-          <w:lang w:val="en-US"/>
-        </w:rPr>
-        <w:t xml:space="preserve">), </w:t>
-      </w:r>
-      <w:proofErr w:type="spellStart"/>
-      <w:r>
-        <w:rPr>
-          <w:rFonts w:ascii="Courier New" w:eastAsia="Courier New" w:hAnsi="Courier New" w:cs="Courier New"/>
-          <w:color w:val="C7254E"/>
-          <w:sz w:val="20"/>
-          <w:szCs w:val="20"/>
-          <w:lang w:val="en-US"/>
-        </w:rPr>
-        <w:t>menu_item_route</w:t>
-      </w:r>
-      <w:proofErr w:type="spellEnd"/>
-      <w:r>
-        <w:rPr>
-          <w:rFonts w:ascii="Courier New" w:eastAsia="Courier New" w:hAnsi="Courier New" w:cs="Courier New"/>
-          <w:color w:val="C7254E"/>
-          <w:sz w:val="20"/>
-          <w:szCs w:val="20"/>
-          <w:lang w:val="en-US"/>
-        </w:rPr>
-        <w:t xml:space="preserve">() (routes/menu_routes.py) → </w:t>
-      </w:r>
-      <w:proofErr w:type="spellStart"/>
-      <w:r>
-        <w:rPr>
-          <w:rFonts w:ascii="Courier New" w:eastAsia="Courier New" w:hAnsi="Courier New" w:cs="Courier New"/>
-          <w:color w:val="C7254E"/>
-          <w:sz w:val="20"/>
-          <w:szCs w:val="20"/>
-          <w:lang w:val="en-US"/>
-        </w:rPr>
-        <w:t>load_menu_items</w:t>
-      </w:r>
-      <w:proofErr w:type="spellEnd"/>
-      <w:r>
-        <w:rPr>
-          <w:rFonts w:ascii="Courier New" w:eastAsia="Courier New" w:hAnsi="Courier New" w:cs="Courier New"/>
-          <w:color w:val="C7254E"/>
-          <w:sz w:val="20"/>
-          <w:szCs w:val="20"/>
-          <w:lang w:val="en-US"/>
-        </w:rPr>
-        <w:t xml:space="preserve">(), </w:t>
-      </w:r>
-      <w:proofErr w:type="spellStart"/>
-      <w:r>
-        <w:rPr>
-          <w:rFonts w:ascii="Courier New" w:eastAsia="Courier New" w:hAnsi="Courier New" w:cs="Courier New"/>
-          <w:color w:val="C7254E"/>
-          <w:sz w:val="20"/>
-          <w:szCs w:val="20"/>
-          <w:lang w:val="en-US"/>
-        </w:rPr>
-        <w:t>parse_menu_meta</w:t>
-      </w:r>
-      <w:proofErr w:type="spellEnd"/>
-      <w:r>
-        <w:rPr>
-          <w:rFonts w:ascii="Courier New" w:eastAsia="Courier New" w:hAnsi="Courier New" w:cs="Courier New"/>
-          <w:color w:val="C7254E"/>
-          <w:sz w:val="20"/>
-          <w:szCs w:val="20"/>
-          <w:lang w:val="en-US"/>
-        </w:rPr>
-        <w:t xml:space="preserve">(), </w:t>
-      </w:r>
-      <w:proofErr w:type="spellStart"/>
-      <w:r>
-        <w:rPr>
-          <w:rFonts w:ascii="Courier New" w:eastAsia="Courier New" w:hAnsi="Courier New" w:cs="Courier New"/>
-          <w:color w:val="C7254E"/>
-          <w:sz w:val="20"/>
-          <w:szCs w:val="20"/>
-          <w:lang w:val="en-US"/>
-        </w:rPr>
-        <w:t>parse_menu_item</w:t>
-      </w:r>
-      <w:proofErr w:type="spellEnd"/>
-      <w:r>
-        <w:rPr>
-          <w:rFonts w:ascii="Courier New" w:eastAsia="Courier New" w:hAnsi="Courier New" w:cs="Courier New"/>
-          <w:color w:val="C7254E"/>
-          <w:sz w:val="20"/>
-          <w:szCs w:val="20"/>
-          <w:lang w:val="en-US"/>
-        </w:rPr>
-        <w:t xml:space="preserve">(), menu(), </w:t>
-      </w:r>
-      <w:proofErr w:type="spellStart"/>
-      <w:r>
-        <w:rPr>
-          <w:rFonts w:ascii="Courier New" w:eastAsia="Courier New" w:hAnsi="Courier New" w:cs="Courier New"/>
-          <w:color w:val="C7254E"/>
-          <w:sz w:val="20"/>
-          <w:szCs w:val="20"/>
-          <w:lang w:val="en-US"/>
-        </w:rPr>
-        <w:t>menu_item</w:t>
-      </w:r>
-      <w:proofErr w:type="spellEnd"/>
-      <w:r>
-        <w:rPr>
-          <w:rFonts w:ascii="Courier New" w:eastAsia="Courier New" w:hAnsi="Courier New" w:cs="Courier New"/>
-          <w:color w:val="C7254E"/>
-          <w:sz w:val="20"/>
-          <w:szCs w:val="20"/>
-          <w:lang w:val="en-US"/>
-        </w:rPr>
-        <w:t>() (backend/app.py)</w:t>
+        <w:t>Ответственные функции: menu_route(), menu_item_route() (routes/menu_routes.py) → load_menu_items(), load_menu_items_from_disk(), get_redis_client(), parse_menu_meta(), parse_menu_item(), menu(), menu_item() (backend/app.py)</w:t>
       </w:r>
     </w:p>
     <w:p>
@@ -2580,64 +2258,7 @@
           </w:tcPr>
           <w:p>
             <w:r>
-              <w:t xml:space="preserve">Каталог: проверить загрузку позиций из item.txt + photo.png / </w:t>
-            </w:r>
-            <w:proofErr w:type="spellStart"/>
-            <w:proofErr w:type="gramStart"/>
-            <w:r>
-              <w:t>photo.webp</w:t>
-            </w:r>
-            <w:proofErr w:type="spellEnd"/>
-            <w:proofErr w:type="gramEnd"/>
-            <w:r>
-              <w:t xml:space="preserve"> по каждой папке.</w:t>
-            </w:r>
-          </w:p>
-          <w:p>
-            <w:r>
-              <w:t xml:space="preserve">Сортировка/порядок: убедиться, что позиции отображаются в порядке по полю </w:t>
-            </w:r>
-            <w:proofErr w:type="spellStart"/>
-            <w:r>
-              <w:t>id</w:t>
-            </w:r>
-            <w:proofErr w:type="spellEnd"/>
-            <w:r>
-              <w:t>.</w:t>
-            </w:r>
-          </w:p>
-          <w:p>
-            <w:r>
-              <w:t>Страница блюда: открыть валидный /</w:t>
-            </w:r>
-            <w:proofErr w:type="spellStart"/>
-            <w:r>
-              <w:t>menu</w:t>
-            </w:r>
-            <w:proofErr w:type="spellEnd"/>
-            <w:r>
-              <w:t>/&lt;</w:t>
-            </w:r>
-            <w:proofErr w:type="spellStart"/>
-            <w:r>
-              <w:t>id</w:t>
-            </w:r>
-            <w:proofErr w:type="spellEnd"/>
-            <w:r>
-              <w:t>&gt;, убедиться в корректных данных (название, цена, описание, фото).</w:t>
-            </w:r>
-          </w:p>
-          <w:p>
-            <w:r>
-              <w:t xml:space="preserve">404: открыть несуществующий </w:t>
-            </w:r>
-            <w:proofErr w:type="spellStart"/>
-            <w:r>
-              <w:t>id</w:t>
-            </w:r>
-            <w:proofErr w:type="spellEnd"/>
-            <w:r>
-              <w:t>, проверить страницу-заглушку и код ответа 404.</w:t>
+              <w:t>???????: ????????? ???????? ??????? ?? item.txt + photo.png / photo.webp ?? ?????? ?????. / ?????????: ?????????, ??? ???? weight ?? item.txt ???????????? ?? ???? ????? ? ????????. / ??????????/???????: ?????????, ??? ??????? ???????????? ? ??????? ?? ???? id. / Redis-??? ????: ??? ??????? REDIS_URL ????????? ???????? /menu ? /delivery ?????? ???????? ??? ?? ??????? ??? ??????????? ? ???????. / ???????? ?????: ??????? ???????? /menu/&lt;id&gt;, ????????? ? ?????????? ?????? (????????, ????, ????????, ????). / 404: ??????? ?????????????? id, ????????? ????????-???????? ? ??? ?????? 404.</w:t>
             </w:r>
           </w:p>
         </w:tc>
@@ -2692,22 +2313,7 @@
           </w:tcPr>
           <w:p>
             <w:r>
-              <w:t>Некорректный item.txt (пустой или неполный) не должен ломать весь каталог.</w:t>
-            </w:r>
-          </w:p>
-          <w:p>
-            <w:r>
-              <w:t xml:space="preserve">Отсутствие photo.png / </w:t>
-            </w:r>
-            <w:proofErr w:type="spellStart"/>
-            <w:proofErr w:type="gramStart"/>
-            <w:r>
-              <w:t>photo.webp</w:t>
-            </w:r>
-            <w:proofErr w:type="spellEnd"/>
-            <w:proofErr w:type="gramEnd"/>
-            <w:r>
-              <w:t xml:space="preserve"> или item.txt в папке позиции — папка должна безопасно пропускаться.</w:t>
+              <w:t>???????????? item.txt (?????? ??? ????????) ?? ?????? ?????? ???? ???????. ?????????? photo.png / photo.webp ??? item.txt ? ????? ??????? ? ????? ?????? ????????? ????????????. ?????? ??? ?????????? ???? weight ?? ?????? ?????? ????????: ????? ?????????? ??? ?????????.</w:t>
             </w:r>
           </w:p>
         </w:tc>
@@ -2761,171 +2367,8 @@
             </w:tcMar>
           </w:tcPr>
           <w:p>
-            <w:pPr>
-              <w:numPr>
-                <w:ilvl w:val="0"/>
-                <w:numId w:val="1"/>
-              </w:numPr>
-              <w:pBdr>
-                <w:top w:val="nil"/>
-                <w:left w:val="nil"/>
-                <w:bottom w:val="nil"/>
-                <w:right w:val="nil"/>
-                <w:between w:val="nil"/>
-              </w:pBdr>
-              <w:spacing w:before="20" w:after="20"/>
-            </w:pPr>
-            <w:r>
-              <w:rPr>
-                <w:color w:val="000000"/>
-                <w:sz w:val="20"/>
-                <w:szCs w:val="20"/>
-              </w:rPr>
-              <w:t>Проверить корректный рендер: фото, название, цену, описание.</w:t>
-            </w:r>
-          </w:p>
-          <w:p>
-            <w:pPr>
-              <w:numPr>
-                <w:ilvl w:val="0"/>
-                <w:numId w:val="1"/>
-              </w:numPr>
-              <w:pBdr>
-                <w:top w:val="nil"/>
-                <w:left w:val="nil"/>
-                <w:bottom w:val="nil"/>
-                <w:right w:val="nil"/>
-                <w:between w:val="nil"/>
-              </w:pBdr>
-              <w:spacing w:before="20" w:after="20"/>
-            </w:pPr>
-            <w:r>
-              <w:rPr>
-                <w:color w:val="000000"/>
-                <w:sz w:val="20"/>
-                <w:szCs w:val="20"/>
-              </w:rPr>
-              <w:t>Проверить адаптивность сетки каталога на мобильных устройствах.</w:t>
-            </w:r>
-          </w:p>
-          <w:p>
-            <w:pPr>
-              <w:numPr>
-                <w:ilvl w:val="0"/>
-                <w:numId w:val="1"/>
-              </w:numPr>
-              <w:pBdr>
-                <w:top w:val="nil"/>
-                <w:left w:val="nil"/>
-                <w:bottom w:val="nil"/>
-                <w:right w:val="nil"/>
-                <w:between w:val="nil"/>
-              </w:pBdr>
-              <w:spacing w:before="20" w:after="20"/>
-            </w:pPr>
-            <w:r>
-              <w:rPr>
-                <w:color w:val="000000"/>
-                <w:sz w:val="20"/>
-                <w:szCs w:val="20"/>
-              </w:rPr>
-              <w:t xml:space="preserve">Большой </w:t>
-            </w:r>
-            <w:proofErr w:type="spellStart"/>
-            <w:r>
-              <w:rPr>
-                <w:color w:val="000000"/>
-                <w:sz w:val="20"/>
-                <w:szCs w:val="20"/>
-              </w:rPr>
-              <w:t>zoom</w:t>
-            </w:r>
-            <w:proofErr w:type="spellEnd"/>
-            <w:r>
-              <w:rPr>
-                <w:color w:val="000000"/>
-                <w:sz w:val="20"/>
-                <w:szCs w:val="20"/>
-              </w:rPr>
-              <w:t xml:space="preserve"> / открытая корзина: при уменьшении доступного пространства сетка каталога переходит в 1 колонку; карточки блюд не перекрываются элементами корзины.</w:t>
-            </w:r>
-          </w:p>
-          <w:p>
-            <w:pPr>
-              <w:numPr>
-                <w:ilvl w:val="0"/>
-                <w:numId w:val="1"/>
-              </w:numPr>
-              <w:pBdr>
-                <w:top w:val="nil"/>
-                <w:left w:val="nil"/>
-                <w:bottom w:val="nil"/>
-                <w:right w:val="nil"/>
-                <w:between w:val="nil"/>
-              </w:pBdr>
-              <w:spacing w:before="20" w:after="20"/>
-            </w:pPr>
-            <w:r>
-              <w:rPr>
-                <w:color w:val="000000"/>
-                <w:sz w:val="20"/>
-                <w:szCs w:val="20"/>
-              </w:rPr>
-              <w:t>Плавное закрытие корзины: при закрытии анимация завершается без рывка контента (</w:t>
-            </w:r>
-            <w:proofErr w:type="spellStart"/>
-            <w:r>
-              <w:rPr>
-                <w:color w:val="000000"/>
-                <w:sz w:val="20"/>
-                <w:szCs w:val="20"/>
-              </w:rPr>
-              <w:t>layout</w:t>
-            </w:r>
-            <w:proofErr w:type="spellEnd"/>
-            <w:r>
-              <w:rPr>
-                <w:color w:val="000000"/>
-                <w:sz w:val="20"/>
-                <w:szCs w:val="20"/>
-              </w:rPr>
-              <w:t xml:space="preserve"> </w:t>
-            </w:r>
-            <w:proofErr w:type="spellStart"/>
-            <w:r>
-              <w:rPr>
-                <w:color w:val="000000"/>
-                <w:sz w:val="20"/>
-                <w:szCs w:val="20"/>
-              </w:rPr>
-              <w:t>shift</w:t>
-            </w:r>
-            <w:proofErr w:type="spellEnd"/>
-            <w:r>
-              <w:rPr>
-                <w:color w:val="000000"/>
-                <w:sz w:val="20"/>
-                <w:szCs w:val="20"/>
-              </w:rPr>
-              <w:t xml:space="preserve">); проверить отсутствие визуальных артефактов по окончании </w:t>
-            </w:r>
-            <w:proofErr w:type="spellStart"/>
-            <w:r>
-              <w:rPr>
-                <w:color w:val="000000"/>
-                <w:sz w:val="20"/>
-                <w:szCs w:val="20"/>
-              </w:rPr>
-              <w:t>transition</w:t>
-            </w:r>
-            <w:proofErr w:type="spellEnd"/>
-            <w:r>
-              <w:rPr>
-                <w:color w:val="000000"/>
-                <w:sz w:val="20"/>
-                <w:szCs w:val="20"/>
-              </w:rPr>
-              <w:t>.</w:t>
+            <w:r>
+              <w:t>????????? ?????????? ??????: ????, ????????, ????, ???????? ? ?????????. / ?????????, ??? ????????? ???????????? ?????? ???? ????? ? ?? ??????????? ? CTA ? ?????. / ????????? ???????????? ????? ???????? ?? ????????? ???????????. / ??????? zoom / ???????? ???????: ??? ?????????? ?????????? ???????????? ????? ???????? ????????? ? 1 ???????; ???????? ???? ?? ????????????? ?????????? ???????. / ???????????? ?????????: ???????? ??????????? ???????????? ??????? ??? ???????????? ????????. / Mobile-????: ?????? ??????? ????? ????????? ???????? ??? ?????????? ???????? ? ??? ? ???????????; ?????????? ???????? ????????? ????? layered-layout desktop-??????.</w:t>
             </w:r>
           </w:p>
         </w:tc>
@@ -3432,403 +2875,8 @@
             </w:tcMar>
           </w:tcPr>
           <w:p>
-            <w:pPr>
-              <w:numPr>
-                <w:ilvl w:val="0"/>
-                <w:numId w:val="1"/>
-              </w:numPr>
-              <w:pBdr>
-                <w:top w:val="nil"/>
-                <w:left w:val="nil"/>
-                <w:bottom w:val="nil"/>
-                <w:right w:val="nil"/>
-                <w:between w:val="nil"/>
-              </w:pBdr>
-              <w:spacing w:before="20" w:after="20"/>
-            </w:pPr>
-            <w:r>
-              <w:rPr>
-                <w:color w:val="000000"/>
-                <w:sz w:val="20"/>
-                <w:szCs w:val="20"/>
-              </w:rPr>
-              <w:t xml:space="preserve">Без авторизации — </w:t>
-            </w:r>
-            <w:proofErr w:type="spellStart"/>
-            <w:r>
-              <w:rPr>
-                <w:color w:val="000000"/>
-                <w:sz w:val="20"/>
-                <w:szCs w:val="20"/>
-              </w:rPr>
-              <w:t>редирект</w:t>
-            </w:r>
-            <w:proofErr w:type="spellEnd"/>
-            <w:r>
-              <w:rPr>
-                <w:color w:val="000000"/>
-                <w:sz w:val="20"/>
-                <w:szCs w:val="20"/>
-              </w:rPr>
-              <w:t xml:space="preserve"> на /</w:t>
-            </w:r>
-            <w:proofErr w:type="spellStart"/>
-            <w:r>
-              <w:rPr>
-                <w:color w:val="000000"/>
-                <w:sz w:val="20"/>
-                <w:szCs w:val="20"/>
-              </w:rPr>
-              <w:t>login</w:t>
-            </w:r>
-            <w:proofErr w:type="spellEnd"/>
-            <w:r>
-              <w:rPr>
-                <w:color w:val="000000"/>
-                <w:sz w:val="20"/>
-                <w:szCs w:val="20"/>
-              </w:rPr>
-              <w:t xml:space="preserve"> для всех маршрутов раздела.</w:t>
-            </w:r>
-          </w:p>
-          <w:p>
-            <w:pPr>
-              <w:numPr>
-                <w:ilvl w:val="0"/>
-                <w:numId w:val="1"/>
-              </w:numPr>
-              <w:pBdr>
-                <w:top w:val="nil"/>
-                <w:left w:val="nil"/>
-                <w:bottom w:val="nil"/>
-                <w:right w:val="nil"/>
-                <w:between w:val="nil"/>
-              </w:pBdr>
-              <w:spacing w:before="20" w:after="20"/>
-            </w:pPr>
-            <w:r>
-              <w:rPr>
-                <w:color w:val="000000"/>
-                <w:sz w:val="20"/>
-                <w:szCs w:val="20"/>
-              </w:rPr>
-              <w:t>Валидации оплаты: нет активной брони; бронь просрочена; пустая корзина; нет активной карты — каждая ситуация выдаёт понятное сообщение об ошибке.</w:t>
-            </w:r>
-          </w:p>
-          <w:p>
-            <w:pPr>
-              <w:numPr>
-                <w:ilvl w:val="0"/>
-                <w:numId w:val="1"/>
-              </w:numPr>
-              <w:pBdr>
-                <w:top w:val="nil"/>
-                <w:left w:val="nil"/>
-                <w:bottom w:val="nil"/>
-                <w:right w:val="nil"/>
-                <w:between w:val="nil"/>
-              </w:pBdr>
-              <w:spacing w:before="20" w:after="20"/>
-            </w:pPr>
-            <w:r>
-              <w:rPr>
-                <w:color w:val="000000"/>
-                <w:sz w:val="20"/>
-                <w:szCs w:val="20"/>
-              </w:rPr>
-              <w:t>Предпросмотр оплаты: после POST /</w:t>
-            </w:r>
-            <w:proofErr w:type="spellStart"/>
-            <w:r>
-              <w:rPr>
-                <w:color w:val="000000"/>
-                <w:sz w:val="20"/>
-                <w:szCs w:val="20"/>
-              </w:rPr>
-              <w:t>payment</w:t>
-            </w:r>
-            <w:proofErr w:type="spellEnd"/>
-            <w:r>
-              <w:rPr>
-                <w:color w:val="000000"/>
-                <w:sz w:val="20"/>
-                <w:szCs w:val="20"/>
-              </w:rPr>
-              <w:t xml:space="preserve"> проверить корректные суммы </w:t>
-            </w:r>
-            <w:proofErr w:type="spellStart"/>
-            <w:r>
-              <w:rPr>
-                <w:color w:val="000000"/>
-                <w:sz w:val="20"/>
-                <w:szCs w:val="20"/>
-              </w:rPr>
-              <w:t>items_total</w:t>
-            </w:r>
-            <w:proofErr w:type="spellEnd"/>
-            <w:r>
-              <w:rPr>
-                <w:color w:val="000000"/>
-                <w:sz w:val="20"/>
-                <w:szCs w:val="20"/>
-              </w:rPr>
-              <w:t xml:space="preserve">, </w:t>
-            </w:r>
-            <w:proofErr w:type="spellStart"/>
-            <w:r>
-              <w:rPr>
-                <w:color w:val="000000"/>
-                <w:sz w:val="20"/>
-                <w:szCs w:val="20"/>
-              </w:rPr>
-              <w:t>points_applied</w:t>
-            </w:r>
-            <w:proofErr w:type="spellEnd"/>
-            <w:r>
-              <w:rPr>
-                <w:color w:val="000000"/>
-                <w:sz w:val="20"/>
-                <w:szCs w:val="20"/>
-              </w:rPr>
-              <w:t xml:space="preserve">, </w:t>
-            </w:r>
-            <w:proofErr w:type="spellStart"/>
-            <w:r>
-              <w:rPr>
-                <w:color w:val="000000"/>
-                <w:sz w:val="20"/>
-                <w:szCs w:val="20"/>
-              </w:rPr>
-              <w:t>payable_total</w:t>
-            </w:r>
-            <w:proofErr w:type="spellEnd"/>
-            <w:r>
-              <w:rPr>
-                <w:color w:val="000000"/>
-                <w:sz w:val="20"/>
-                <w:szCs w:val="20"/>
-              </w:rPr>
-              <w:t>.</w:t>
-            </w:r>
-          </w:p>
-          <w:p>
-            <w:pPr>
-              <w:numPr>
-                <w:ilvl w:val="0"/>
-                <w:numId w:val="1"/>
-              </w:numPr>
-              <w:pBdr>
-                <w:top w:val="nil"/>
-                <w:left w:val="nil"/>
-                <w:bottom w:val="nil"/>
-                <w:right w:val="nil"/>
-                <w:between w:val="nil"/>
-              </w:pBdr>
-              <w:spacing w:before="20" w:after="20"/>
-            </w:pPr>
-            <w:r>
-              <w:rPr>
-                <w:color w:val="000000"/>
-                <w:sz w:val="20"/>
-                <w:szCs w:val="20"/>
-              </w:rPr>
-              <w:t>Подтверждение: POST /</w:t>
-            </w:r>
-            <w:proofErr w:type="spellStart"/>
-            <w:r>
-              <w:rPr>
-                <w:color w:val="000000"/>
-                <w:sz w:val="20"/>
-                <w:szCs w:val="20"/>
-              </w:rPr>
-              <w:t>payment</w:t>
-            </w:r>
-            <w:proofErr w:type="spellEnd"/>
-            <w:r>
-              <w:rPr>
-                <w:color w:val="000000"/>
-                <w:sz w:val="20"/>
-                <w:szCs w:val="20"/>
-              </w:rPr>
-              <w:t>/</w:t>
-            </w:r>
-            <w:proofErr w:type="spellStart"/>
-            <w:r>
-              <w:rPr>
-                <w:color w:val="000000"/>
-                <w:sz w:val="20"/>
-                <w:szCs w:val="20"/>
-              </w:rPr>
-              <w:t>confirm</w:t>
-            </w:r>
-            <w:proofErr w:type="spellEnd"/>
-            <w:r>
-              <w:rPr>
-                <w:color w:val="000000"/>
-                <w:sz w:val="20"/>
-                <w:szCs w:val="20"/>
-              </w:rPr>
-              <w:t xml:space="preserve"> создаёт заказ в </w:t>
-            </w:r>
-            <w:proofErr w:type="spellStart"/>
-            <w:proofErr w:type="gramStart"/>
-            <w:r>
-              <w:rPr>
-                <w:color w:val="000000"/>
-                <w:sz w:val="20"/>
-                <w:szCs w:val="20"/>
-              </w:rPr>
-              <w:t>orders.json</w:t>
-            </w:r>
-            <w:proofErr w:type="spellEnd"/>
-            <w:proofErr w:type="gramEnd"/>
-            <w:r>
-              <w:rPr>
-                <w:color w:val="000000"/>
-                <w:sz w:val="20"/>
-                <w:szCs w:val="20"/>
-              </w:rPr>
-              <w:t>.</w:t>
-            </w:r>
-          </w:p>
-          <w:p>
-            <w:pPr>
-              <w:numPr>
-                <w:ilvl w:val="0"/>
-                <w:numId w:val="1"/>
-              </w:numPr>
-              <w:pBdr>
-                <w:top w:val="nil"/>
-                <w:left w:val="nil"/>
-                <w:bottom w:val="nil"/>
-                <w:right w:val="nil"/>
-                <w:between w:val="nil"/>
-              </w:pBdr>
-              <w:spacing w:before="20" w:after="20"/>
-            </w:pPr>
-            <w:r>
-              <w:rPr>
-                <w:color w:val="000000"/>
-                <w:sz w:val="20"/>
-                <w:szCs w:val="20"/>
-              </w:rPr>
-              <w:t xml:space="preserve">Баллы: при </w:t>
-            </w:r>
-            <w:proofErr w:type="spellStart"/>
-            <w:r>
-              <w:rPr>
-                <w:color w:val="000000"/>
-                <w:sz w:val="20"/>
-                <w:szCs w:val="20"/>
-              </w:rPr>
-              <w:t>use_points</w:t>
-            </w:r>
-            <w:proofErr w:type="spellEnd"/>
-            <w:r>
-              <w:rPr>
-                <w:color w:val="000000"/>
-                <w:sz w:val="20"/>
-                <w:szCs w:val="20"/>
-              </w:rPr>
-              <w:t xml:space="preserve">=1 баллы корректно списываются из </w:t>
-            </w:r>
-            <w:proofErr w:type="spellStart"/>
-            <w:proofErr w:type="gramStart"/>
-            <w:r>
-              <w:rPr>
-                <w:color w:val="000000"/>
-                <w:sz w:val="20"/>
-                <w:szCs w:val="20"/>
-              </w:rPr>
-              <w:t>users.json</w:t>
-            </w:r>
-            <w:proofErr w:type="spellEnd"/>
-            <w:proofErr w:type="gramEnd"/>
-            <w:r>
-              <w:rPr>
-                <w:color w:val="000000"/>
-                <w:sz w:val="20"/>
-                <w:szCs w:val="20"/>
-              </w:rPr>
-              <w:t>.</w:t>
-            </w:r>
-          </w:p>
-          <w:p>
-            <w:pPr>
-              <w:numPr>
-                <w:ilvl w:val="0"/>
-                <w:numId w:val="1"/>
-              </w:numPr>
-              <w:pBdr>
-                <w:top w:val="nil"/>
-                <w:left w:val="nil"/>
-                <w:bottom w:val="nil"/>
-                <w:right w:val="nil"/>
-                <w:between w:val="nil"/>
-              </w:pBdr>
-              <w:spacing w:before="20" w:after="20"/>
-            </w:pPr>
-            <w:r>
-              <w:rPr>
-                <w:color w:val="000000"/>
-                <w:sz w:val="20"/>
-                <w:szCs w:val="20"/>
-              </w:rPr>
-              <w:t>AJAX-подтверждение: при заголовке X-</w:t>
-            </w:r>
-            <w:proofErr w:type="spellStart"/>
-            <w:r>
-              <w:rPr>
-                <w:color w:val="000000"/>
-                <w:sz w:val="20"/>
-                <w:szCs w:val="20"/>
-              </w:rPr>
-              <w:t>Requested</w:t>
-            </w:r>
-            <w:proofErr w:type="spellEnd"/>
-            <w:r>
-              <w:rPr>
-                <w:color w:val="000000"/>
-                <w:sz w:val="20"/>
-                <w:szCs w:val="20"/>
-              </w:rPr>
-              <w:t xml:space="preserve">-With: </w:t>
-            </w:r>
-            <w:proofErr w:type="spellStart"/>
-            <w:r>
-              <w:rPr>
-                <w:color w:val="000000"/>
-                <w:sz w:val="20"/>
-                <w:szCs w:val="20"/>
-              </w:rPr>
-              <w:t>XMLHttpRequest</w:t>
-            </w:r>
-            <w:proofErr w:type="spellEnd"/>
-            <w:r>
-              <w:rPr>
-                <w:color w:val="000000"/>
-                <w:sz w:val="20"/>
-                <w:szCs w:val="20"/>
-              </w:rPr>
-              <w:t xml:space="preserve"> возвращается JSON с полем </w:t>
-            </w:r>
-            <w:proofErr w:type="spellStart"/>
-            <w:r>
-              <w:rPr>
-                <w:color w:val="000000"/>
-                <w:sz w:val="20"/>
-                <w:szCs w:val="20"/>
-              </w:rPr>
-              <w:t>order_url</w:t>
-            </w:r>
-            <w:proofErr w:type="spellEnd"/>
-            <w:r>
-              <w:rPr>
-                <w:color w:val="000000"/>
-                <w:sz w:val="20"/>
-                <w:szCs w:val="20"/>
-              </w:rPr>
-              <w:t>.</w:t>
+            <w:r>
+              <w:t>Без авторизации — редирект на /login для всех маршрутов раздела. / Валидации оплаты: нет активной брони; бронь просрочена; пустая корзина; нет активной карты — каждая ситуация выдаёт понятное сообщение об ошибке. / Предпросмотр оплаты: после POST /payment проверить корректные суммы items_total, points_applied, payable_total. / Подтверждение: POST /payment/confirm создаёт заказ в активном backend-хранилище (orders.json локально или app_state в Postgres). / Баллы: при use_points=1 баллы корректно списываются из активного user-store (users.json локально или app_state в Postgres). / AJAX-подтверждение: при заголовке X-Requested-With: XMLHttpRequest возвращается JSON с полем order_url.</w:t>
             </w:r>
           </w:p>
         </w:tc>
@@ -5463,68 +4511,7 @@
           </w:tcPr>
           <w:p>
             <w:r>
-              <w:t>/</w:t>
-            </w:r>
-            <w:proofErr w:type="spellStart"/>
-            <w:r>
-              <w:t>orders</w:t>
-            </w:r>
-            <w:proofErr w:type="spellEnd"/>
-            <w:r>
-              <w:t>: страница показывает только заказы текущего пользователя, не чужие.</w:t>
-            </w:r>
-          </w:p>
-          <w:p>
-            <w:r>
-              <w:t>/</w:t>
-            </w:r>
-            <w:proofErr w:type="spellStart"/>
-            <w:r>
-              <w:t>orders</w:t>
-            </w:r>
-            <w:proofErr w:type="spellEnd"/>
-            <w:r>
-              <w:t>/&lt;</w:t>
-            </w:r>
-            <w:proofErr w:type="spellStart"/>
-            <w:r>
-              <w:t>id</w:t>
-            </w:r>
-            <w:proofErr w:type="spellEnd"/>
-            <w:r>
-              <w:t>&gt;: чужой заказ не должен открываться — возвращается 404 (страница-заглушка).</w:t>
-            </w:r>
-          </w:p>
-          <w:p>
-            <w:r>
-              <w:t>/</w:t>
-            </w:r>
-            <w:proofErr w:type="spellStart"/>
-            <w:r>
-              <w:t>notifications</w:t>
-            </w:r>
-            <w:proofErr w:type="spellEnd"/>
-            <w:r>
-              <w:t>: рендерит HTML-страницу с уведомлениями по броням и активным заказам (не JSON-</w:t>
-            </w:r>
-            <w:proofErr w:type="spellStart"/>
-            <w:r>
-              <w:t>эндпойнт</w:t>
-            </w:r>
-            <w:proofErr w:type="spellEnd"/>
-            <w:r>
-              <w:t>).</w:t>
-            </w:r>
-          </w:p>
-          <w:p>
-            <w:r>
-              <w:lastRenderedPageBreak/>
-              <w:t>Проверка окна готовки: временная логика показа статуса «готовится» работает корректно.</w:t>
-            </w:r>
-          </w:p>
-          <w:p>
-            <w:r>
-              <w:t>Формат дат для бронирований и уведомлений: отображение соответствует фактическому шаблону ДД.ММ.ГГ.</w:t>
+              <w:t>/orders: ???????? ?????????? ?????? ?????? ???????? ????????????, ?? ?????. /orders/&lt;id&gt;: ????? ????? ?? ?????? ??????????? ? ???????????? 404 (????????-????????). /notifications: ???????? HTML-???????? ? ????????????? ?? ?????? ? ???????? ??????? (?? JSON-????????). ???????? ???? ???????: ????????? ?????? ?????? ??????? ??????????? ???????? ?????????. ?????? ??? ??? ???????????? ? ???????????: ??????????? ????????????? ???????????? ??????? ??.??.??. ???????? /notifications ??????????? ??? ???????????? webp-??????????? ? ?? ??????? ?? ??? ??? ???????.</w:t>
             </w:r>
           </w:p>
         </w:tc>
@@ -6058,67 +5045,7 @@
           </w:tcPr>
           <w:p>
             <w:r>
-              <w:t xml:space="preserve">Блок новостей/промо заполняется из </w:t>
-            </w:r>
-            <w:proofErr w:type="spellStart"/>
-            <w:r>
-              <w:t>promo_items</w:t>
-            </w:r>
-            <w:proofErr w:type="spellEnd"/>
-            <w:r>
-              <w:t xml:space="preserve"> при наличии данных.</w:t>
-            </w:r>
-          </w:p>
-          <w:p>
-            <w:r>
-              <w:t xml:space="preserve">При отсутствии промо-данных используется </w:t>
-            </w:r>
-            <w:proofErr w:type="spellStart"/>
-            <w:r>
-              <w:t>fallback</w:t>
-            </w:r>
-            <w:proofErr w:type="spellEnd"/>
-            <w:r>
-              <w:t xml:space="preserve"> NEWS_CARDS — проверить содержимое.</w:t>
-            </w:r>
-          </w:p>
-          <w:p>
-            <w:r>
-              <w:t xml:space="preserve">Блок «Популярное»: при </w:t>
-            </w:r>
-            <w:proofErr w:type="spellStart"/>
-            <w:r>
-              <w:t>featured</w:t>
-            </w:r>
-            <w:proofErr w:type="spellEnd"/>
-            <w:r>
-              <w:t>=</w:t>
-            </w:r>
-            <w:proofErr w:type="spellStart"/>
-            <w:r>
-              <w:t>true</w:t>
-            </w:r>
-            <w:proofErr w:type="spellEnd"/>
-            <w:r>
-              <w:t xml:space="preserve"> показываются отмеченные блюда; иначе — 10 карточек из каталога.</w:t>
-            </w:r>
-          </w:p>
-          <w:p>
-            <w:r>
-              <w:t xml:space="preserve">При перезапуске приложения </w:t>
-            </w:r>
-            <w:proofErr w:type="spellStart"/>
-            <w:r>
-              <w:t>fallback</w:t>
-            </w:r>
-            <w:proofErr w:type="spellEnd"/>
-            <w:r>
-              <w:t>-набор «Популярное» ротируется, а не остаётся фиксированным.</w:t>
-            </w:r>
-          </w:p>
-          <w:p>
-            <w:r>
-              <w:t>Для авторизованного пользователя на главной отображаются его активные брони и заказы в процессе готовки.</w:t>
+              <w:t>???? ????????/????? ??????????? ?? promo_items ??? ??????? ??????. / ??? ?????????? ?????-?????? ???????????? fallback NEWS_CARDS ? ????????? ??????????. / ???? ????????????: ??? featured=true ???????????? ?????????? ?????; ????? ? 10 ???????? ?? ????????. / ??? ?????????? Redis-???? ???? ???? ???????????? ?? ??????? ?? ?????? ??????????? ? ????????? /menu. / ??? ??????????????? ???????????? ?? ??????? ???????????? ??? ???????? ????? ? ?????? ? ???????? ???????. / Hero-???? ??????? ???????? ???????????? SVG-???? table.svg, ??????? ?? ?????? ???????? ????? ? CTA.</w:t>
             </w:r>
           </w:p>
         </w:tc>
@@ -6185,41 +5112,7 @@
           </w:tcPr>
           <w:p>
             <w:r>
-              <w:t>Битый формат item.txt у промо — не должен ломать всю главную страницу.</w:t>
-            </w:r>
-          </w:p>
-          <w:p>
-            <w:r>
-              <w:t xml:space="preserve">Промо без фото — карточка </w:t>
-            </w:r>
-            <w:proofErr w:type="spellStart"/>
-            <w:r>
-              <w:t>рендерится</w:t>
-            </w:r>
-            <w:proofErr w:type="spellEnd"/>
-            <w:r>
-              <w:t xml:space="preserve"> без </w:t>
-            </w:r>
-            <w:proofErr w:type="spellStart"/>
-            <w:r>
-              <w:t>background-image</w:t>
-            </w:r>
-            <w:proofErr w:type="spellEnd"/>
-            <w:r>
-              <w:t xml:space="preserve"> (явная заглушка не задана).</w:t>
-            </w:r>
-          </w:p>
-          <w:p>
-            <w:r>
-              <w:t xml:space="preserve">Карточка доставки на главной: </w:t>
-            </w:r>
-            <w:proofErr w:type="spellStart"/>
-            <w:r>
-              <w:t>hover</w:t>
-            </w:r>
-            <w:proofErr w:type="spellEnd"/>
-            <w:r>
-              <w:t>-анимация грузовика и линий «ветра» не выходит за границы карточки.</w:t>
+              <w:t>????? ?????? item.txt ? ????? ? ?? ?????? ?????? ??? ??????? ????????. ????? ??? ???? ? ???????? ?????????? ??? background-image (????? ???????? ?? ??????). ????????? promo-???????? ? static/promo_items/reklama ? static/promo_items/akciya ?? ?????? ???????? ? ???? ???? ???????. ???????? ???????? ?? ???????: hover-???????? ????????? ? ????? ??????? ?? ??????? ?? ??????? ????????.</w:t>
             </w:r>
           </w:p>
         </w:tc>
@@ -6522,7 +5415,7 @@
         <w:spacing w:before="30" w:after="80"/>
       </w:pPr>
       <w:r>
-        <w:t>После полного сценария (бронь + заказ + оплата) проверить согласованность активного backend: users/bookings/orders в JSON-файлах или в app_state (Postgres/Neon) через /debug/storage.</w:t>
+        <w:t>После полного сценария (бронь + заказ + оплата) проверить согласованность активного backend: users/bookings/orders в JSON-файлах или в app_state (Postgres/Neon). Для быстрого контрольного просмотра /debug/storage использовать только если endpoint явно включён через DEBUG_STORAGE_ENABLED=true. При включённом Redis убедиться отдельно, что menu-кэш не расходится с данными на диске.</w:t>
       </w:r>
     </w:p>
     <w:p>
@@ -7003,7 +5896,7 @@
         <w:spacing w:before="30" w:after="80"/>
       </w:pPr>
       <w:r>
-        <w:t>JSON-хранилище остаётся режимом по умолчанию и не рассчитано на высокую нагрузку: отсутствуют полноценные транзакции и индексы, а lock-файловый механизм лишь снижает риск гонок. Для hosted/production-сценариев добавлен альтернативный backend Postgres/Neon через DATABASE_URL.</w:t>
+        <w:t>JSON-хранилище теперь используется как локальный режим без DATABASE_URL. Если DATABASE_URL задан, backend работает только через Postgres/Neon и завершается на старте при недоступности БД. На HF Secrets DATABASE_URL и FLASK_SECRET_KEY обязательны; без них приложение остаётся в JSON-режиме. Для меню добавлен опциональный Redis-кэш по REDIS_URL с TTL, без влияния на основное хранилище пользователей, броней и заказов.</w:t>
       </w:r>
     </w:p>
     <w:p>
@@ -7106,12 +5999,7 @@
         <w:spacing w:before="30" w:after="80"/>
       </w:pPr>
       <w:r>
-        <w:rPr>
-          <w:color w:val="000000"/>
-          <w:sz w:val="22"/>
-          <w:szCs w:val="22"/>
-        </w:rPr>
-        <w:t>Авто-очистка заказов: фоновый процесс удаляет неактивные/старые заказы по TTL. Параметры задаются через переменные окружения: ORDER_RETENTION_DAYS (по умолчанию 7) — срок хранения завершённых заказов в днях; ORDER_PRUNE_INTERVAL_SECONDS (по умолчанию 60) — интервал запуска очистки в секундах.</w:t>
+        <w:t>Авто-очистка заказов выполняется лениво при чтении orders через load_orders() → prune_orders(), а не отдельным фоновым воркером. Параметры задаются через переменные окружения: ORDER_RETENTION_DAYS (по умолчанию 7) — срок хранения завершённых заказов в днях; ORDER_PRUNE_INTERVAL_SECONDS (по умолчанию 60) — минимальный интервал между циклами очистки. Отдельно для Postgres/Neon работает keepalive: DB_KEEPALIVE_ENABLED и DB_KEEPALIVE_INTERVAL_SECONDS. Старт backend и сами операции БД выполняются с повторными попытками; в режиме Postgres запись больше не зависит от локальных lock-файлов.</w:t>
       </w:r>
     </w:p>
     <w:p>
@@ -8349,210 +7237,7 @@
           </w:tcPr>
           <w:p>
             <w:r>
-              <w:rPr>
-                <w:sz w:val="20"/>
-                <w:szCs w:val="20"/>
-              </w:rPr>
-              <w:t xml:space="preserve">Два </w:t>
-            </w:r>
-            <w:proofErr w:type="spellStart"/>
-            <w:r>
-              <w:rPr>
-                <w:sz w:val="20"/>
-                <w:szCs w:val="20"/>
-              </w:rPr>
-              <w:t>backend</w:t>
-            </w:r>
-            <w:proofErr w:type="spellEnd"/>
-            <w:r>
-              <w:rPr>
-                <w:sz w:val="20"/>
-                <w:szCs w:val="20"/>
-              </w:rPr>
-              <w:t xml:space="preserve">-хранилища с автопереключением по переменной DATABASE_URL: json_store.py (JSON-файлы + </w:t>
-            </w:r>
-            <w:proofErr w:type="spellStart"/>
-            <w:r>
-              <w:rPr>
-                <w:sz w:val="20"/>
-                <w:szCs w:val="20"/>
-              </w:rPr>
-              <w:t>lock</w:t>
-            </w:r>
-            <w:proofErr w:type="spellEnd"/>
-            <w:r>
-              <w:rPr>
-                <w:sz w:val="20"/>
-                <w:szCs w:val="20"/>
-              </w:rPr>
-              <w:t>-механизм, используется по умолчанию) и pg_store.py (</w:t>
-            </w:r>
-            <w:proofErr w:type="spellStart"/>
-            <w:r>
-              <w:rPr>
-                <w:sz w:val="20"/>
-                <w:szCs w:val="20"/>
-              </w:rPr>
-              <w:t>PostgreSQL</w:t>
-            </w:r>
-            <w:proofErr w:type="spellEnd"/>
-            <w:r>
-              <w:rPr>
-                <w:sz w:val="20"/>
-                <w:szCs w:val="20"/>
-              </w:rPr>
-              <w:t>/</w:t>
-            </w:r>
-            <w:proofErr w:type="spellStart"/>
-            <w:r>
-              <w:rPr>
-                <w:sz w:val="20"/>
-                <w:szCs w:val="20"/>
-              </w:rPr>
-              <w:t>Neon</w:t>
-            </w:r>
-            <w:proofErr w:type="spellEnd"/>
-            <w:r>
-              <w:rPr>
-                <w:sz w:val="20"/>
-                <w:szCs w:val="20"/>
-              </w:rPr>
-              <w:t>, активируется при наличии DATABASE_URL). Таблица</w:t>
-            </w:r>
-            <w:r>
-              <w:rPr>
-                <w:sz w:val="20"/>
-                <w:szCs w:val="20"/>
-                <w:lang w:val="en-US"/>
-              </w:rPr>
-              <w:t xml:space="preserve"> </w:t>
-            </w:r>
-            <w:proofErr w:type="spellStart"/>
-            <w:r>
-              <w:rPr>
-                <w:sz w:val="20"/>
-                <w:szCs w:val="20"/>
-                <w:lang w:val="en-US"/>
-              </w:rPr>
-              <w:t>app_state</w:t>
-            </w:r>
-            <w:proofErr w:type="spellEnd"/>
-            <w:r>
-              <w:rPr>
-                <w:sz w:val="20"/>
-                <w:szCs w:val="20"/>
-                <w:lang w:val="en-US"/>
-              </w:rPr>
-              <w:t xml:space="preserve"> </w:t>
-            </w:r>
-            <w:r>
-              <w:rPr>
-                <w:sz w:val="20"/>
-                <w:szCs w:val="20"/>
-              </w:rPr>
-              <w:t>хранит</w:t>
-            </w:r>
-            <w:r>
-              <w:rPr>
-                <w:sz w:val="20"/>
-                <w:szCs w:val="20"/>
-                <w:lang w:val="en-US"/>
-              </w:rPr>
-              <w:t xml:space="preserve"> users, bookings, orders </w:t>
-            </w:r>
-            <w:r>
-              <w:rPr>
-                <w:sz w:val="20"/>
-                <w:szCs w:val="20"/>
-              </w:rPr>
-              <w:t>как</w:t>
-            </w:r>
-            <w:r>
-              <w:rPr>
-                <w:sz w:val="20"/>
-                <w:szCs w:val="20"/>
-                <w:lang w:val="en-US"/>
-              </w:rPr>
-              <w:t xml:space="preserve"> JSONB-</w:t>
-            </w:r>
-            <w:r>
-              <w:rPr>
-                <w:sz w:val="20"/>
-                <w:szCs w:val="20"/>
-              </w:rPr>
-              <w:t>колонки</w:t>
-            </w:r>
-            <w:r>
-              <w:rPr>
-                <w:sz w:val="20"/>
-                <w:szCs w:val="20"/>
-                <w:lang w:val="en-US"/>
-              </w:rPr>
-              <w:t xml:space="preserve">. </w:t>
-            </w:r>
-            <w:proofErr w:type="spellStart"/>
-            <w:r>
-              <w:rPr>
-                <w:sz w:val="20"/>
-                <w:szCs w:val="20"/>
-              </w:rPr>
-              <w:t>Эндпойнт</w:t>
-            </w:r>
-            <w:proofErr w:type="spellEnd"/>
-            <w:r>
-              <w:rPr>
-                <w:sz w:val="20"/>
-                <w:szCs w:val="20"/>
-              </w:rPr>
-              <w:t xml:space="preserve"> /</w:t>
-            </w:r>
-            <w:proofErr w:type="spellStart"/>
-            <w:r>
-              <w:rPr>
-                <w:sz w:val="20"/>
-                <w:szCs w:val="20"/>
-              </w:rPr>
-              <w:t>debug</w:t>
-            </w:r>
-            <w:proofErr w:type="spellEnd"/>
-            <w:r>
-              <w:rPr>
-                <w:sz w:val="20"/>
-                <w:szCs w:val="20"/>
-              </w:rPr>
-              <w:t>/</w:t>
-            </w:r>
-            <w:proofErr w:type="spellStart"/>
-            <w:r>
-              <w:rPr>
-                <w:sz w:val="20"/>
-                <w:szCs w:val="20"/>
-              </w:rPr>
-              <w:t>storage</w:t>
-            </w:r>
-            <w:proofErr w:type="spellEnd"/>
-            <w:r>
-              <w:rPr>
-                <w:sz w:val="20"/>
-                <w:szCs w:val="20"/>
-              </w:rPr>
-              <w:t xml:space="preserve"> показывает активный </w:t>
-            </w:r>
-            <w:proofErr w:type="spellStart"/>
-            <w:r>
-              <w:rPr>
-                <w:sz w:val="20"/>
-                <w:szCs w:val="20"/>
-              </w:rPr>
-              <w:t>backend</w:t>
-            </w:r>
-            <w:proofErr w:type="spellEnd"/>
-            <w:r>
-              <w:rPr>
-                <w:sz w:val="20"/>
-                <w:szCs w:val="20"/>
-              </w:rPr>
-              <w:t xml:space="preserve"> и счётчики записей. Остальные слои не импортируют хранилище напрямую.</w:t>
+              <w:t>Хранилища данных и backend-режимы: json_store.py (локальный JSON-режим без DATABASE_URL) и pg_store.py (PostgreSQL/Neon, обязателен при наличии DATABASE_URL). При заданном DATABASE_URL приложение не откатывается на JSON и завершается на старте при недоступности Postgres. Старт backend и операции БД используют ретраи и переподключение. Таблица app_state хранит users, bookings и orders как JSONB. Эндпойнт /debug/storage по умолчанию закрыт и доступен только при DEBUG_STORAGE_ENABLED=true. Для каталога блюд в app.py добавлен опциональный Redis-кэш по REDIS_URL, но он не является основным хранилищем. В режиме Postgres запись не зависит от локальных файловых lock-файлов.</w:t>
             </w:r>
           </w:p>
         </w:tc>
@@ -8798,7 +7483,7 @@
           </w:tcPr>
           <w:p>
             <w:r>
-              <w:t>Инициализация БД | Выполнить SQL-скрипт backend/sql/neon_init.sql через консоль Neon или psql. Скрипт создаёт таблицу app_state и seed-записи users/bookings/orders; дополнительная таблица reservations остаётся как пример/заготовка. | Миграция данных из JSON | Скрипт backend/ops/migrate_json_to_neon.py читает текущие JSON-файлы (users.json, bookings.json, orders.json) и записывает их содержимое в таблицу app_state Neon. Требует наличия переменной окружения DATABASE_URL. Запускать однократно при первом переезде на Neon. | Обязательные переменные окружения в продакшене | DATABASE_URL — строка подключения PostgreSQL/Neon (при отсутствии приложение использует JSON-хранилище). FLASK_SECRET_KEY — секретный ключ Flask-сессии. APP_TIMEZONE — IANA-идентификатор часового пояса сервера.</w:t>
+              <w:t>Инициализация БД | Выполнить SQL-скрипт backend/sql/neon_init.sql через консоль Neon или psql. Скрипт создаёт таблицу app_state и seed-записи users/bookings/orders; дополнительная таблица reservations остаётся как пример/заготовка. | Миграция данных из JSON | Скрипт backend/ops/migrate_json_to_neon.py читает текущие JSON-файлы (users.json, bookings.json, orders.json) и записывает их содержимое в таблицу app_state Neon. Требует наличия переменной окружения DATABASE_URL. Запускать однократно при первом переезде на Neon. | Поведение backend | Если DATABASE_URL задан, приложение работает только через Postgres/Neon и не переключается обратно на JSON. При ошибке подключения backend завершается на старте после заданного числа retry-попыток. Для предотвращения «засыпания» Neon используется keepalive-поток с регулярным SELECT 1. | Redis-кэш меню | При наличии REDIS_URL каталог меню может кэшироваться в Redis по TTL; это серверный кэш, не основная БД. | Обязательные/важные переменные окружения в продакшене | Secrets: DATABASE_URL, FLASK_SECRET_KEY, при необходимости REDIS_URL. Variables: DB_KEEPALIVE_ENABLED, DB_KEEPALIVE_INTERVAL_SECONDS, POSTGRES_STARTUP_RETRIES, POSTGRES_STARTUP_RETRY_DELAY_SECONDS, DB_OPERATION_RETRIES, DB_RETRY_DELAY_SECONDS, а также cookie-настройки SESSION_COOKIE_SECURE, SESSION_COOKIE_SAMESITE, SESSION_COOKIE_PARTITIONED и TRUST_PROXY_HEADERS для hosted-сценария.</w:t>
             </w:r>
           </w:p>
         </w:tc>
@@ -10734,59 +9419,7 @@
           </w:tcPr>
           <w:p>
             <w:r>
-              <w:t xml:space="preserve">Загрузка модулей: убедиться, что app.js успешно импортирует все модули из </w:t>
-            </w:r>
-            <w:proofErr w:type="spellStart"/>
-            <w:r>
-              <w:t>static</w:t>
-            </w:r>
-            <w:proofErr w:type="spellEnd"/>
-            <w:r>
-              <w:t>/</w:t>
-            </w:r>
-            <w:proofErr w:type="spellStart"/>
-            <w:r>
-              <w:t>js</w:t>
-            </w:r>
-            <w:proofErr w:type="spellEnd"/>
-            <w:r>
-              <w:t>/</w:t>
-            </w:r>
-            <w:proofErr w:type="spellStart"/>
-            <w:r>
-              <w:t>modules</w:t>
-            </w:r>
-            <w:proofErr w:type="spellEnd"/>
-            <w:r>
-              <w:t>/ без ошибок в консоли.</w:t>
-            </w:r>
-          </w:p>
-          <w:p>
-            <w:r>
-              <w:t>Корзина — открытие/закрытие: при нажатии кнопки корзина открывается с анимацией, при повторном нажатии — закрывается без рывка контента; анимация доходит до конца.</w:t>
-            </w:r>
-          </w:p>
-          <w:p>
-            <w:r>
-              <w:t>Добавление в корзину: товар добавляется через JS без перезагрузки страницы; счётчик в шапке обновляется.</w:t>
-            </w:r>
-          </w:p>
-          <w:p>
-            <w:r>
-              <w:t xml:space="preserve">Уведомления: модуль уведомлений инициализируется и отображает/скрывает </w:t>
-            </w:r>
-            <w:proofErr w:type="spellStart"/>
-            <w:r>
-              <w:t>badge</w:t>
-            </w:r>
-            <w:proofErr w:type="spellEnd"/>
-            <w:r>
-              <w:t xml:space="preserve"> при наличии/отсутствии активных событий.</w:t>
-            </w:r>
-          </w:p>
-          <w:p>
-            <w:r>
-              <w:t>Телефонная маска: +7 не стирается, лишние 7 не добавляются, валидное поле получает корректное визуальное состояние.</w:t>
+              <w:t>Загрузка модулей: убедиться, что app.js успешно импортирует все модули из static/js/modules/ без ошибок в консоли. / Корзина — открытие/закрытие: при нажатии кнопки корзина открывается с анимацией, при повторном нажатии — закрывается без рывка контента; анимация доходит до конца. / Добавление в корзину: товар добавляется через JS без перезагрузки страницы; счётчик в шапке обновляется. / Уведомления: модуль уведомлений инициализируется и отображает/скрывает badge при наличии/отсутствии активных событий. / Телефонная маска: +7 не стирается, лишние 7 не добавляются, валидное поле получает корректное визуальное состояние. / При наличии REDIS_URL каталог меню в UI должен совпадать с исходными item.txt и не зависеть от того, пришли данные из Redis или с диска.</w:t>
             </w:r>
           </w:p>
         </w:tc>
@@ -10841,7 +9474,7 @@
           </w:tcPr>
           <w:p>
             <w:r>
-              <w:t>Меню при большом zoom (150-200%): когда корзина открыта и места мало, карточки переходят в одноколоночный режим — проверить, что они не перекрываются и сохраняют корректный порядок. | Категории меню: переключение между типами блюд анимируется направленным слайдом без растягивания карточек. | Mobile-меню: вместо длинной ленты категорий доступны два компактных контрола — Тип и Сортировать.</w:t>
+              <w:t>Меню при большом zoom (150-200%): когда корзина открыта и места мало, карточки переходят в одноколоночный режим — проверить, что они не перекрываются и сохраняют корректный порядок. | Категории меню: переключение между типами блюд анимируется направленным слайдом без растягивания карточек. | Mobile-меню: вместо длинной ленты категорий доступны два компактных контрола — Тип и Сортировать. | Во встроенных мобильных браузерах проверить отображение подсказки про открытие сайта в Chrome, если вход не удерживается.</w:t>
             </w:r>
           </w:p>
         </w:tc>
@@ -11677,11 +10310,7 @@
           </w:tcPr>
           <w:p>
             <w:r>
-              <w:rPr>
-                <w:sz w:val="20"/>
-                <w:szCs w:val="20"/>
-              </w:rPr>
-              <w:t>Главная открывается, промо-блок и «Популярное» отображаются без ошибок.</w:t>
+              <w:t>??????? ???????????, prom?-???? ? ???????????? ???????????? ??? ??????; hero-?????? ?????????? ?????? ? ???????????? table.svg ??? ?????? CTA.</w:t>
             </w:r>
           </w:p>
         </w:tc>
@@ -11774,11 +10403,7 @@
           </w:tcPr>
           <w:p>
             <w:r>
-              <w:rPr>
-                <w:sz w:val="20"/>
-                <w:szCs w:val="20"/>
-              </w:rPr>
-              <w:t>Каталог загружается, карточки с фото и ценами отображаются в правильном порядке.</w:t>
+              <w:t>??????? ???????????, ???????? ? ????, ?????? ? ?????????? ???????????? ? ?????????? ???????; ????????? ????????? ?????? ???? ?????.</w:t>
             </w:r>
           </w:p>
         </w:tc>
@@ -12484,11 +11109,7 @@
           </w:tcPr>
           <w:p>
             <w:r>
-              <w:rPr>
-                <w:sz w:val="20"/>
-                <w:szCs w:val="20"/>
-              </w:rPr>
-              <w:t>Страница уведомлений открывается без ошибок; при наличии активных броней и заказов они отображаются корректно.</w:t>
+              <w:t>???????? ??????????? ??????????? ??? ??????; ??? ??????? ???????? ?????? ? ??????? ??? ???????????? ?????????; ???????????? webp-??????????? ?? ????????? ??? ???????.</w:t>
             </w:r>
           </w:p>
         </w:tc>
@@ -12729,7 +11350,7 @@
           </w:tcPr>
           <w:p>
             <w:r>
-              <w:t>GET /delivery открывает страницу меню доставки (menu.html в режиме delivery_mode=True) без ошибок 500; авторизация для просмотра каталога не требуется. | GET /delivery/checkout требует авторизацию и показывает форму адреса; для неавторизованного пользователя выполняется редирект на /login. | POST /delivery/payment принимает данные адреса, сохраняет delivery_checkout_preview в сессии и выполняет редирект на GET /delivery/payment. | GET /delivery/payment отображает предпросмотр суммы, адрес и данные доставки. | POST /delivery/confirm создаёт delivery-заказ в orders.json / app_state, при AJAX-запросе возвращает JSON с order_url.</w:t>
+              <w:t>GET /delivery открывает страницу меню доставки (menu.html в режиме delivery_mode=True) без ошибок 500; авторизация для просмотра каталога не требуется. | GET /delivery/checkout требует авторизацию и показывает форму адреса; для неавторизованного пользователя выполняется редирект на /login. | POST /delivery/payment принимает данные адреса, сохраняет delivery_checkout_preview в сессии и выполняет редирект на GET /delivery/payment. | GET /delivery/payment отображает предпросмотр суммы, адрес и данные доставки. | POST /delivery/confirm создаёт delivery-заказ в активном backend-хранилище (orders.json локально или app_state в Postgres); при AJAX-запросе возвращает JSON с order_url.</w:t>
             </w:r>
           </w:p>
         </w:tc>
@@ -13162,7 +11783,7 @@
           </w:tcPr>
           <w:p>
             <w:r>
-              <w:t>GET /api/order-statuses возвращает 200 + JSON для авторизованного пользователя с активными заказами; для неавторизованного — 200 с пустым массивом order_statuses. | Now-bar отображается на главной странице и показывает активные стадии заказа без перезагрузки страницы. | Для delivery-заказа progress bar использует грузовик и дорожный прогресс; для dine-in отображается обычный прогресс без дорожной анимации. | При наличии нескольких активных заказов now-bar приоритизирует ближайший по time_to_target_seconds. | Таймер обновляется каждую секунду, а polling серверных статусов выполняется каждые 5 секунд.</w:t>
+              <w:t>GET /api/order-statuses возвращает 200 + JSON для авторизованного пользователя с активными заказами; для неавторизованного — 200 с пустым массивом order_statuses. | Now-bar отображается на главной странице и показывает активные стадии заказа без перезагрузки страницы. | Для delivery-заказа progress bar использует грузовик и дорожный прогресс; для dine-in отображается обычный прогресс без дорожной анимации. | При наличии нескольких активных заказов now-bar приоритизирует ближайший по time_to_target_seconds. | Таймер обновляется каждую секунду, а polling серверных статусов выполняется каждые 5 секунд. | Хранилище заказов не должно влиять на поведение now-bar: сценарий одинаков для JSON и Postgres.</w:t>
             </w:r>
           </w:p>
         </w:tc>
@@ -13221,7 +11842,7 @@
         <w:spacing w:before="80" w:after="80"/>
       </w:pPr>
       <w:r>
-        <w:t>На мобильных разрешениях корзина реализована как bottom sheet с overlay-затемнением, FAB-кнопкой, свайпом вниз для закрытия и дополнительной текстовой подсказкой над корзиной, если сверху остаётся достаточно свободного пространства.</w:t>
+        <w:t>На мобильных разрешениях корзина реализована как bottom sheet с overlay-затемнением, FAB-кнопкой, свайпом вниз для закрытия и дополнительной текстовой подсказкой над корзиной. Подсказка появляется только после полного раскрытия корзины и только если сверху остаётся достаточно свободного пространства.</w:t>
       </w:r>
     </w:p>
     <w:tbl>
@@ -13416,7 +12037,7 @@
           </w:tcPr>
           <w:p>
             <w:r>
-              <w:t>Панель корзины выдвигается снизу с CSS transition. Overlay затемняет фон и перехватывает тапы вне sheet для закрытия. Если сверху остаётся достаточно места, над корзиной показывается текстовая подсказка «Нажмите чтобы свернуть». Тест: тап по overlay закрывает корзину; overlay и подсказка исчезают синхронно с панелью.</w:t>
+              <w:t>Панель корзины выдвигается снизу с CSS transition. Overlay затемняет фон и перехватывает тапы вне sheet для закрытия. Если сверху остаётся достаточно места, над корзиной показывается текстовая подсказка «Нажмите чтобы свернуть». Подсказка появляется только после полного раскрытия корзины и плавно скрывается вместе с панелью. Тест: тап по overlay закрывает корзину; overlay и подсказка исчезают синхронно с панелью.</w:t>
             </w:r>
           </w:p>
         </w:tc>
@@ -13536,7 +12157,7 @@
           </w:tcPr>
           <w:p>
             <w:r>
-              <w:t>Bottom sheet учитывает safe-area (env(safe-area-inset-bottom)) на устройствах с вырезом/домашней кнопкой. При открытии корзины основной layout страницы не сдвигается. Дополнительно: на mobile каталог имеет отдельный выпадающий фильтр Тип рядом с сортировкой.</w:t>
+              <w:t>Bottom sheet учитывает safe-area (env(safe-area-inset-bottom)) на устройствах с вырезом/домашней кнопкой. При открытии корзины основной layout страницы не сдвигается. Дополнительно: на mobile каталог имеет отдельный выпадающий фильтр Тип рядом с сортировкой, а переключение категорий остаётся синхронизированным с общей логикой меню.</w:t>
             </w:r>
           </w:p>
         </w:tc>
@@ -13609,7 +12230,7 @@
         </w:rPr>
       </w:pPr>
       <w:r>
-        <w:t>menu.html — основной каталог блюд; используется и для режима доставки через флаг delivery_mode=True.</w:t>
+        <w:t>menu.html — основной каталог блюд; используется и для режима доставки через флаг delivery_mode=True. Содержит анимированное переключение категорий, mobile-фильтр Тип и mobile bottom-sheet корзины.</w:t>
       </w:r>
     </w:p>
     <w:p>

</xml_diff>

<commit_message>
Stabilize auth flow and modularize frontend
</commit_message>
<xml_diff>
--- a/backend/Модульная_документация_СВОЙ_РЕСТОРАН_v6.docx
+++ b/backend/Модульная_документация_СВОЙ_РЕСТОРАН_v6.docx
@@ -347,7 +347,7 @@
         </w:rPr>
       </w:pPr>
       <w:r>
-        <w:t>Backend: Python / Flask · Хранилище: JSON-файлы (локальный режим без DATABASE_URL) или Postgres (Neon, основной backend при наличии DATABASE_URL) · Кэш меню: Redis по REDIS_URL · Архитектура: модульная (routes/, services/, storage/, models/, config.py)</w:t>
+        <w:t>Backend: Python / Flask · Хранилище: JSON-файлы (локальный режим без DATABASE_URL) или Postgres (Neon, основной backend при наличии DATABASE_URL) · Кэш меню: Redis по REDIS_URL · Авторизация: долгоживущий signed auth_token + восстановление server-session · Архитектура: модульная (routes/, services/, storage/, models/, config.py)</w:t>
       </w:r>
     </w:p>
     <w:p>
@@ -358,156 +358,7 @@
         </w:rPr>
       </w:pPr>
       <w:r>
-        <w:rPr>
-          <w:b/>
-          <w:bCs/>
-          <w:color w:val="595959"/>
-          <w:sz w:val="20"/>
-          <w:szCs w:val="20"/>
-        </w:rPr>
-        <w:t>Ответственные</w:t>
-      </w:r>
-      <w:r>
-        <w:rPr>
-          <w:b/>
-          <w:bCs/>
-          <w:color w:val="595959"/>
-          <w:sz w:val="20"/>
-          <w:szCs w:val="20"/>
-          <w:lang w:val="en-US"/>
-        </w:rPr>
-        <w:t xml:space="preserve"> </w:t>
-      </w:r>
-      <w:r>
-        <w:rPr>
-          <w:b/>
-          <w:bCs/>
-          <w:color w:val="595959"/>
-          <w:sz w:val="20"/>
-          <w:szCs w:val="20"/>
-        </w:rPr>
-        <w:t>функции</w:t>
-      </w:r>
-      <w:r>
-        <w:rPr>
-          <w:b/>
-          <w:bCs/>
-          <w:color w:val="595959"/>
-          <w:sz w:val="20"/>
-          <w:szCs w:val="20"/>
-          <w:lang w:val="en-US"/>
-        </w:rPr>
-        <w:t xml:space="preserve">: </w:t>
-      </w:r>
-      <w:proofErr w:type="spellStart"/>
-      <w:r>
-        <w:rPr>
-          <w:rFonts w:ascii="Courier New" w:eastAsia="Courier New" w:hAnsi="Courier New" w:cs="Courier New"/>
-          <w:color w:val="C7254E"/>
-          <w:sz w:val="20"/>
-          <w:szCs w:val="20"/>
-          <w:lang w:val="en-US"/>
-        </w:rPr>
-        <w:t>login_</w:t>
-      </w:r>
-      <w:proofErr w:type="gramStart"/>
-      <w:r>
-        <w:rPr>
-          <w:rFonts w:ascii="Courier New" w:eastAsia="Courier New" w:hAnsi="Courier New" w:cs="Courier New"/>
-          <w:color w:val="C7254E"/>
-          <w:sz w:val="20"/>
-          <w:szCs w:val="20"/>
-          <w:lang w:val="en-US"/>
-        </w:rPr>
-        <w:t>route</w:t>
-      </w:r>
-      <w:proofErr w:type="spellEnd"/>
-      <w:r>
-        <w:rPr>
-          <w:rFonts w:ascii="Courier New" w:eastAsia="Courier New" w:hAnsi="Courier New" w:cs="Courier New"/>
-          <w:color w:val="C7254E"/>
-          <w:sz w:val="20"/>
-          <w:szCs w:val="20"/>
-          <w:lang w:val="en-US"/>
-        </w:rPr>
-        <w:t>(</w:t>
-      </w:r>
-      <w:proofErr w:type="gramEnd"/>
-      <w:r>
-        <w:rPr>
-          <w:rFonts w:ascii="Courier New" w:eastAsia="Courier New" w:hAnsi="Courier New" w:cs="Courier New"/>
-          <w:color w:val="C7254E"/>
-          <w:sz w:val="20"/>
-          <w:szCs w:val="20"/>
-          <w:lang w:val="en-US"/>
-        </w:rPr>
-        <w:t xml:space="preserve">), </w:t>
-      </w:r>
-      <w:proofErr w:type="spellStart"/>
-      <w:r>
-        <w:rPr>
-          <w:rFonts w:ascii="Courier New" w:eastAsia="Courier New" w:hAnsi="Courier New" w:cs="Courier New"/>
-          <w:color w:val="C7254E"/>
-          <w:sz w:val="20"/>
-          <w:szCs w:val="20"/>
-          <w:lang w:val="en-US"/>
-        </w:rPr>
-        <w:t>register_route</w:t>
-      </w:r>
-      <w:proofErr w:type="spellEnd"/>
-      <w:r>
-        <w:rPr>
-          <w:rFonts w:ascii="Courier New" w:eastAsia="Courier New" w:hAnsi="Courier New" w:cs="Courier New"/>
-          <w:color w:val="C7254E"/>
-          <w:sz w:val="20"/>
-          <w:szCs w:val="20"/>
-          <w:lang w:val="en-US"/>
-        </w:rPr>
-        <w:t xml:space="preserve">(), </w:t>
-      </w:r>
-      <w:proofErr w:type="spellStart"/>
-      <w:r>
-        <w:rPr>
-          <w:rFonts w:ascii="Courier New" w:eastAsia="Courier New" w:hAnsi="Courier New" w:cs="Courier New"/>
-          <w:color w:val="C7254E"/>
-          <w:sz w:val="20"/>
-          <w:szCs w:val="20"/>
-          <w:lang w:val="en-US"/>
-        </w:rPr>
-        <w:t>logout_route</w:t>
-      </w:r>
-      <w:proofErr w:type="spellEnd"/>
-      <w:r>
-        <w:rPr>
-          <w:rFonts w:ascii="Courier New" w:eastAsia="Courier New" w:hAnsi="Courier New" w:cs="Courier New"/>
-          <w:color w:val="C7254E"/>
-          <w:sz w:val="20"/>
-          <w:szCs w:val="20"/>
-          <w:lang w:val="en-US"/>
-        </w:rPr>
-        <w:t xml:space="preserve">() (routes/auth_routes.py) → login(), register(), logout(), </w:t>
-      </w:r>
-      <w:proofErr w:type="spellStart"/>
-      <w:r>
-        <w:rPr>
-          <w:rFonts w:ascii="Courier New" w:eastAsia="Courier New" w:hAnsi="Courier New" w:cs="Courier New"/>
-          <w:color w:val="C7254E"/>
-          <w:sz w:val="20"/>
-          <w:szCs w:val="20"/>
-          <w:lang w:val="en-US"/>
-        </w:rPr>
-        <w:t>keep_user_session</w:t>
-      </w:r>
-      <w:proofErr w:type="spellEnd"/>
-      <w:r>
-        <w:rPr>
-          <w:rFonts w:ascii="Courier New" w:eastAsia="Courier New" w:hAnsi="Courier New" w:cs="Courier New"/>
-          <w:color w:val="C7254E"/>
-          <w:sz w:val="20"/>
-          <w:szCs w:val="20"/>
-          <w:lang w:val="en-US"/>
-        </w:rPr>
-        <w:t>() (backend/app.py)</w:t>
+        <w:t>Ответственные функции: login_route(), register_route(), logout_route() (routes/auth_routes.py) → login(), register(), logout(), restore_auth_from_token(), api_auth_session(), preserve_auth_token_on_redirects(), keep_user_session() (backend/app.py)</w:t>
       </w:r>
     </w:p>
     <w:p>
@@ -785,7 +636,7 @@
           </w:tcPr>
           <w:p>
             <w:r>
-              <w:t>Проверить отображение текста ошибок на формах входа и регистрации. / Проверить, что после успешного логина выполняется редирект на главную страницу (/). / Проверить фронтенд-маску телефона: префикс +7 не стирается, формат ввода остаётся стабильным при редактировании. / На мобильных устройствах проверить подсказку: если встроенный браузер (например, Telegram) не удерживает вход, пользователь видит рекомендацию открыть сайт в Chrome.</w:t>
+              <w:t>Проверить отображение текста ошибок на формах входа и регистрации. | Проверить, что после успешного логина пользователь попадает на главную и остаётся авторизованным на следующем переходе. | Проверить, что при сохранённом токене auth_token первая закрытая страница открывается без повторного логина. | Проверить фронтенд-маску телефона: префикс +7 не стирается, формат ввода остаётся стабильным при редактировании.</w:t>
             </w:r>
           </w:p>
         </w:tc>
@@ -935,97 +786,8 @@
             </w:tcMar>
           </w:tcPr>
           <w:p>
-            <w:pPr>
-              <w:numPr>
-                <w:ilvl w:val="0"/>
-                <w:numId w:val="1"/>
-              </w:numPr>
-              <w:pBdr>
-                <w:top w:val="nil"/>
-                <w:left w:val="nil"/>
-                <w:bottom w:val="nil"/>
-                <w:right w:val="nil"/>
-                <w:between w:val="nil"/>
-              </w:pBdr>
-              <w:spacing w:before="20" w:after="20"/>
-            </w:pPr>
-            <w:r>
-              <w:rPr>
-                <w:color w:val="000000"/>
-                <w:sz w:val="20"/>
-                <w:szCs w:val="20"/>
-              </w:rPr>
-              <w:t xml:space="preserve">Пароли </w:t>
-            </w:r>
-            <w:proofErr w:type="spellStart"/>
-            <w:r>
-              <w:rPr>
-                <w:color w:val="000000"/>
-                <w:sz w:val="20"/>
-                <w:szCs w:val="20"/>
-              </w:rPr>
-              <w:t>хешируются</w:t>
-            </w:r>
-            <w:proofErr w:type="spellEnd"/>
-            <w:r>
-              <w:rPr>
-                <w:color w:val="000000"/>
-                <w:sz w:val="20"/>
-                <w:szCs w:val="20"/>
-              </w:rPr>
-              <w:t xml:space="preserve"> SHA-256 без соли — для учебного проекта допустимо, для продакшена недостаточно.</w:t>
-            </w:r>
-          </w:p>
-          <w:p>
-            <w:pPr>
-              <w:numPr>
-                <w:ilvl w:val="0"/>
-                <w:numId w:val="1"/>
-              </w:numPr>
-              <w:pBdr>
-                <w:top w:val="nil"/>
-                <w:left w:val="nil"/>
-                <w:bottom w:val="nil"/>
-                <w:right w:val="nil"/>
-                <w:between w:val="nil"/>
-              </w:pBdr>
-              <w:spacing w:before="20" w:after="20"/>
-            </w:pPr>
-            <w:proofErr w:type="spellStart"/>
-            <w:r>
-              <w:rPr>
-                <w:color w:val="000000"/>
-                <w:sz w:val="20"/>
-                <w:szCs w:val="20"/>
-              </w:rPr>
-              <w:t>secret_key</w:t>
-            </w:r>
-            <w:proofErr w:type="spellEnd"/>
-            <w:r>
-              <w:rPr>
-                <w:color w:val="000000"/>
-                <w:sz w:val="20"/>
-                <w:szCs w:val="20"/>
-              </w:rPr>
-              <w:t xml:space="preserve"> берётся из переменной окружения FLASK_SECRET_KEY (с </w:t>
-            </w:r>
-            <w:proofErr w:type="spellStart"/>
-            <w:r>
-              <w:rPr>
-                <w:color w:val="000000"/>
-                <w:sz w:val="20"/>
-                <w:szCs w:val="20"/>
-              </w:rPr>
-              <w:t>fallback</w:t>
-            </w:r>
-            <w:proofErr w:type="spellEnd"/>
-            <w:r>
-              <w:rPr>
-                <w:color w:val="000000"/>
-                <w:sz w:val="20"/>
-                <w:szCs w:val="20"/>
-              </w:rPr>
-              <w:t>-значением по умолчанию).</w:t>
+            <w:r>
+              <w:t>Пароли хешируются SHA-256 без соли — для учебного проекта допустимо, для продакшена недостаточно. | secret_key берётся из переменной окружения FLASK_SECRET_KEY (с fallback-значением по умолчанию). | В текущем прод-режиме используется долгоживущий signed auth_token, который хранится в localStorage и восстанавливает session на сервере; это практический компромисс из-за нестабильности cookie-only режима на части клиентов.</w:t>
             </w:r>
           </w:p>
         </w:tc>
@@ -2258,7 +2020,7 @@
           </w:tcPr>
           <w:p>
             <w:r>
-              <w:t>???????: ????????? ???????? ??????? ?? item.txt + photo.png / photo.webp ?? ?????? ?????. / ?????????: ?????????, ??? ???? weight ?? item.txt ???????????? ?? ???? ????? ? ????????. / ??????????/???????: ?????????, ??? ??????? ???????????? ? ??????? ?? ???? id. / Redis-??? ????: ??? ??????? REDIS_URL ????????? ???????? /menu ? /delivery ?????? ???????? ??? ?? ??????? ??? ??????????? ? ???????. / ???????? ?????: ??????? ???????? /menu/&lt;id&gt;, ????????? ? ?????????? ?????? (????????, ????, ????????, ????). / 404: ??????? ?????????????? id, ????????? ????????-???????? ? ??? ?????? 404.</w:t>
+              <w:t>Каталог: проверить загрузку позиций из item.txt + photo.png / photo.webp по каждой папке позиции. / Граммовка: убедиться, что поле weight в item.txt отображается на фото блюда в карточке. / Сортировка/порядок: проверить, что позиции отображаются в порядке по полю id. / Redis-кэш меню: при наличии REDIS_URL повторные открытия /menu и /delivery должны отдавать тот же каталог без расхождения с файлами. / Страница блюда: открыть валидный /menu/&lt;id&gt;, убедиться в корректных данных (название, цена, описание, фото). / 404: открыть несуществующий id, проверить страницу-заглушку и код ответа 404.</w:t>
             </w:r>
           </w:p>
         </w:tc>
@@ -2313,7 +2075,7 @@
           </w:tcPr>
           <w:p>
             <w:r>
-              <w:t>???????????? item.txt (?????? ??? ????????) ?? ?????? ?????? ???? ???????. ?????????? photo.png / photo.webp ??? item.txt ? ????? ??????? ? ????? ?????? ????????? ????????????. ?????? ??? ?????????? ???? weight ?? ?????? ?????? ????????: ????? ?????????? ??? ?????????.</w:t>
+              <w:t>Некорректный item.txt (пустой или неполный) не должен ломать весь каталог. Отсутствие photo.png / photo.webp или item.txt в папке позиции — папка должна безопасно пропускаться. Пустое или некорректное поле weight не должно ломать карточку: чип скрывается или пропускается.</w:t>
             </w:r>
           </w:p>
         </w:tc>
@@ -2368,7 +2130,7 @@
           </w:tcPr>
           <w:p>
             <w:r>
-              <w:t>????????? ?????????? ??????: ????, ????????, ????, ???????? ? ?????????. / ?????????, ??? ????????? ???????????? ?????? ???? ????? ? ?? ??????????? ? CTA ? ?????. / ????????? ???????????? ????? ???????? ?? ????????? ???????????. / ??????? zoom / ???????? ???????: ??? ?????????? ?????????? ???????????? ????? ???????? ????????? ? 1 ???????; ???????? ???? ?? ????????????? ?????????? ???????. / ???????????? ?????????: ???????? ??????????? ???????????? ??????? ??? ???????????? ????????. / Mobile-????: ?????? ??????? ????? ????????? ???????? ??? ?????????? ???????? ? ??? ? ???????????; ?????????? ???????? ????????? ????? layered-layout desktop-??????.</w:t>
+              <w:t>Проверить корректный рендер: фото, название, цену, описание и граммовку. / Проверить, что граммовка отображается поверх фото и не конфликтует с CTA и ценой. / Проверить адаптивность сетки каталога на мобильных устройствах. / Большой zoom / открытая корзина: при уменьшении доступного пространства сетка каталога переходит в 1 колонку; карточки блюд не перекрываются элементами корзины. / Переключение категорий: анимация выполняется направленным слайдом без растягивания карточек. / Mobile-меню: вместо длинной ленты категорий доступны два компактных контрола — Тип и Сортировать; композиция карточек сохраняет layered-layout desktop-подхода.</w:t>
             </w:r>
           </w:p>
         </w:tc>
@@ -2378,6 +2140,9 @@
       <w:pPr>
         <w:spacing w:before="160" w:after="80"/>
       </w:pPr>
+      <w:r>
+        <w:t>Файлы данных: static/menu_items/*/item.txt + photo.png / photo.webp. Граммовка/объём порции также может задаваться в item.txt через поля weight / portion / grams / volume.</w:t>
+      </w:r>
     </w:p>
     <w:tbl>
       <w:tblPr>
@@ -2526,222 +2291,7 @@
         </w:rPr>
       </w:pPr>
       <w:r>
-        <w:rPr>
-          <w:b/>
-          <w:bCs/>
-          <w:color w:val="595959"/>
-          <w:sz w:val="20"/>
-          <w:szCs w:val="20"/>
-        </w:rPr>
-        <w:t>Ответственные</w:t>
-      </w:r>
-      <w:r>
-        <w:rPr>
-          <w:b/>
-          <w:bCs/>
-          <w:color w:val="595959"/>
-          <w:sz w:val="20"/>
-          <w:szCs w:val="20"/>
-          <w:lang w:val="en-US"/>
-        </w:rPr>
-        <w:t xml:space="preserve"> </w:t>
-      </w:r>
-      <w:r>
-        <w:rPr>
-          <w:b/>
-          <w:bCs/>
-          <w:color w:val="595959"/>
-          <w:sz w:val="20"/>
-          <w:szCs w:val="20"/>
-        </w:rPr>
-        <w:t>функции</w:t>
-      </w:r>
-      <w:r>
-        <w:rPr>
-          <w:b/>
-          <w:bCs/>
-          <w:color w:val="595959"/>
-          <w:sz w:val="20"/>
-          <w:szCs w:val="20"/>
-          <w:lang w:val="en-US"/>
-        </w:rPr>
-        <w:t xml:space="preserve">: </w:t>
-      </w:r>
-      <w:proofErr w:type="spellStart"/>
-      <w:r>
-        <w:rPr>
-          <w:rFonts w:ascii="Courier New" w:eastAsia="Courier New" w:hAnsi="Courier New" w:cs="Courier New"/>
-          <w:color w:val="C7254E"/>
-          <w:sz w:val="20"/>
-          <w:szCs w:val="20"/>
-          <w:lang w:val="en-US"/>
-        </w:rPr>
-        <w:t>checkout_</w:t>
-      </w:r>
-      <w:proofErr w:type="gramStart"/>
-      <w:r>
-        <w:rPr>
-          <w:rFonts w:ascii="Courier New" w:eastAsia="Courier New" w:hAnsi="Courier New" w:cs="Courier New"/>
-          <w:color w:val="C7254E"/>
-          <w:sz w:val="20"/>
-          <w:szCs w:val="20"/>
-          <w:lang w:val="en-US"/>
-        </w:rPr>
-        <w:t>route</w:t>
-      </w:r>
-      <w:proofErr w:type="spellEnd"/>
-      <w:r>
-        <w:rPr>
-          <w:rFonts w:ascii="Courier New" w:eastAsia="Courier New" w:hAnsi="Courier New" w:cs="Courier New"/>
-          <w:color w:val="C7254E"/>
-          <w:sz w:val="20"/>
-          <w:szCs w:val="20"/>
-          <w:lang w:val="en-US"/>
-        </w:rPr>
-        <w:t>(</w:t>
-      </w:r>
-      <w:proofErr w:type="gramEnd"/>
-      <w:r>
-        <w:rPr>
-          <w:rFonts w:ascii="Courier New" w:eastAsia="Courier New" w:hAnsi="Courier New" w:cs="Courier New"/>
-          <w:color w:val="C7254E"/>
-          <w:sz w:val="20"/>
-          <w:szCs w:val="20"/>
-          <w:lang w:val="en-US"/>
-        </w:rPr>
-        <w:t xml:space="preserve">), </w:t>
-      </w:r>
-      <w:proofErr w:type="spellStart"/>
-      <w:r>
-        <w:rPr>
-          <w:rFonts w:ascii="Courier New" w:eastAsia="Courier New" w:hAnsi="Courier New" w:cs="Courier New"/>
-          <w:color w:val="C7254E"/>
-          <w:sz w:val="20"/>
-          <w:szCs w:val="20"/>
-          <w:lang w:val="en-US"/>
-        </w:rPr>
-        <w:t>payment_route</w:t>
-      </w:r>
-      <w:proofErr w:type="spellEnd"/>
-      <w:r>
-        <w:rPr>
-          <w:rFonts w:ascii="Courier New" w:eastAsia="Courier New" w:hAnsi="Courier New" w:cs="Courier New"/>
-          <w:color w:val="C7254E"/>
-          <w:sz w:val="20"/>
-          <w:szCs w:val="20"/>
-          <w:lang w:val="en-US"/>
-        </w:rPr>
-        <w:t xml:space="preserve">(), </w:t>
-      </w:r>
-      <w:proofErr w:type="spellStart"/>
-      <w:r>
-        <w:rPr>
-          <w:rFonts w:ascii="Courier New" w:eastAsia="Courier New" w:hAnsi="Courier New" w:cs="Courier New"/>
-          <w:color w:val="C7254E"/>
-          <w:sz w:val="20"/>
-          <w:szCs w:val="20"/>
-          <w:lang w:val="en-US"/>
-        </w:rPr>
-        <w:t>payment_confirm_route</w:t>
-      </w:r>
-      <w:proofErr w:type="spellEnd"/>
-      <w:r>
-        <w:rPr>
-          <w:rFonts w:ascii="Courier New" w:eastAsia="Courier New" w:hAnsi="Courier New" w:cs="Courier New"/>
-          <w:color w:val="C7254E"/>
-          <w:sz w:val="20"/>
-          <w:szCs w:val="20"/>
-          <w:lang w:val="en-US"/>
-        </w:rPr>
-        <w:t xml:space="preserve">() (routes/orders_routes.py) → checkout(), payment(), </w:t>
-      </w:r>
-      <w:proofErr w:type="spellStart"/>
-      <w:r>
-        <w:rPr>
-          <w:rFonts w:ascii="Courier New" w:eastAsia="Courier New" w:hAnsi="Courier New" w:cs="Courier New"/>
-          <w:color w:val="C7254E"/>
-          <w:sz w:val="20"/>
-          <w:szCs w:val="20"/>
-          <w:lang w:val="en-US"/>
-        </w:rPr>
-        <w:t>payment_confirm</w:t>
-      </w:r>
-      <w:proofErr w:type="spellEnd"/>
-      <w:r>
-        <w:rPr>
-          <w:rFonts w:ascii="Courier New" w:eastAsia="Courier New" w:hAnsi="Courier New" w:cs="Courier New"/>
-          <w:color w:val="C7254E"/>
-          <w:sz w:val="20"/>
-          <w:szCs w:val="20"/>
-          <w:lang w:val="en-US"/>
-        </w:rPr>
-        <w:t xml:space="preserve">(), </w:t>
-      </w:r>
-      <w:proofErr w:type="spellStart"/>
-      <w:r>
-        <w:rPr>
-          <w:rFonts w:ascii="Courier New" w:eastAsia="Courier New" w:hAnsi="Courier New" w:cs="Courier New"/>
-          <w:color w:val="C7254E"/>
-          <w:sz w:val="20"/>
-          <w:szCs w:val="20"/>
-          <w:lang w:val="en-US"/>
-        </w:rPr>
-        <w:t>resolve_order_items</w:t>
-      </w:r>
-      <w:proofErr w:type="spellEnd"/>
-      <w:r>
-        <w:rPr>
-          <w:rFonts w:ascii="Courier New" w:eastAsia="Courier New" w:hAnsi="Courier New" w:cs="Courier New"/>
-          <w:color w:val="C7254E"/>
-          <w:sz w:val="20"/>
-          <w:szCs w:val="20"/>
-          <w:lang w:val="en-US"/>
-        </w:rPr>
-        <w:t xml:space="preserve">(), </w:t>
-      </w:r>
-      <w:proofErr w:type="spellStart"/>
-      <w:r>
-        <w:rPr>
-          <w:rFonts w:ascii="Courier New" w:eastAsia="Courier New" w:hAnsi="Courier New" w:cs="Courier New"/>
-          <w:color w:val="C7254E"/>
-          <w:sz w:val="20"/>
-          <w:szCs w:val="20"/>
-          <w:lang w:val="en-US"/>
-        </w:rPr>
-        <w:t>parse_serving_option</w:t>
-      </w:r>
-      <w:proofErr w:type="spellEnd"/>
-      <w:r>
-        <w:rPr>
-          <w:rFonts w:ascii="Courier New" w:eastAsia="Courier New" w:hAnsi="Courier New" w:cs="Courier New"/>
-          <w:color w:val="C7254E"/>
-          <w:sz w:val="20"/>
-          <w:szCs w:val="20"/>
-          <w:lang w:val="en-US"/>
-        </w:rPr>
-        <w:t xml:space="preserve">(), </w:t>
-      </w:r>
-      <w:proofErr w:type="spellStart"/>
-      <w:r>
-        <w:rPr>
-          <w:rFonts w:ascii="Courier New" w:eastAsia="Courier New" w:hAnsi="Courier New" w:cs="Courier New"/>
-          <w:color w:val="C7254E"/>
-          <w:sz w:val="20"/>
-          <w:szCs w:val="20"/>
-          <w:lang w:val="en-US"/>
-        </w:rPr>
-        <w:t>latest_user_booking_status</w:t>
-      </w:r>
-      <w:proofErr w:type="spellEnd"/>
-      <w:r>
-        <w:rPr>
-          <w:rFonts w:ascii="Courier New" w:eastAsia="Courier New" w:hAnsi="Courier New" w:cs="Courier New"/>
-          <w:color w:val="C7254E"/>
-          <w:sz w:val="20"/>
-          <w:szCs w:val="20"/>
-          <w:lang w:val="en-US"/>
-        </w:rPr>
-        <w:t>() (services/business_logic.py)</w:t>
+        <w:t>Ответственные функции: checkout_route(), payment_route(), payment_confirm_route() (routes/orders_routes.py) → checkout(), payment(), payment_confirm(), resolve_order_items(), parse_serving_option(), latest_user_booking_status() (services/business_logic.py). Подтверждение оплаты использует signed preview-token fallback при потере session preview.</w:t>
       </w:r>
     </w:p>
     <w:tbl>
@@ -2942,176 +2492,8 @@
             </w:tcMar>
           </w:tcPr>
           <w:p>
-            <w:pPr>
-              <w:numPr>
-                <w:ilvl w:val="0"/>
-                <w:numId w:val="1"/>
-              </w:numPr>
-              <w:pBdr>
-                <w:top w:val="nil"/>
-                <w:left w:val="nil"/>
-                <w:bottom w:val="nil"/>
-                <w:right w:val="nil"/>
-                <w:between w:val="nil"/>
-              </w:pBdr>
-              <w:spacing w:before="20" w:after="20"/>
-            </w:pPr>
-            <w:r>
-              <w:rPr>
-                <w:color w:val="000000"/>
-                <w:sz w:val="20"/>
-                <w:szCs w:val="20"/>
-              </w:rPr>
-              <w:t xml:space="preserve">Некорректный </w:t>
-            </w:r>
-            <w:proofErr w:type="spellStart"/>
-            <w:r>
-              <w:rPr>
-                <w:color w:val="000000"/>
-                <w:sz w:val="20"/>
-                <w:szCs w:val="20"/>
-              </w:rPr>
-              <w:t>items_json</w:t>
-            </w:r>
-            <w:proofErr w:type="spellEnd"/>
-            <w:r>
-              <w:rPr>
-                <w:color w:val="000000"/>
-                <w:sz w:val="20"/>
-                <w:szCs w:val="20"/>
-              </w:rPr>
-              <w:t xml:space="preserve"> обрабатывается не как API-ошибка 400, а как сценарий </w:t>
-            </w:r>
-            <w:proofErr w:type="spellStart"/>
-            <w:r>
-              <w:rPr>
-                <w:color w:val="000000"/>
-                <w:sz w:val="20"/>
-                <w:szCs w:val="20"/>
-              </w:rPr>
-              <w:t>empty_cart</w:t>
-            </w:r>
-            <w:proofErr w:type="spellEnd"/>
-            <w:r>
-              <w:rPr>
-                <w:color w:val="000000"/>
-                <w:sz w:val="20"/>
-                <w:szCs w:val="20"/>
-              </w:rPr>
-              <w:t xml:space="preserve"> — пользователь видит страницу оплаты с пустой корзиной.</w:t>
-            </w:r>
-          </w:p>
-          <w:p>
-            <w:pPr>
-              <w:numPr>
-                <w:ilvl w:val="0"/>
-                <w:numId w:val="1"/>
-              </w:numPr>
-              <w:pBdr>
-                <w:top w:val="nil"/>
-                <w:left w:val="nil"/>
-                <w:bottom w:val="nil"/>
-                <w:right w:val="nil"/>
-                <w:between w:val="nil"/>
-              </w:pBdr>
-              <w:spacing w:before="20" w:after="20"/>
-            </w:pPr>
-            <w:proofErr w:type="spellStart"/>
-            <w:r>
-              <w:rPr>
-                <w:color w:val="000000"/>
-                <w:sz w:val="20"/>
-                <w:szCs w:val="20"/>
-              </w:rPr>
-              <w:t>Кастомное</w:t>
-            </w:r>
-            <w:proofErr w:type="spellEnd"/>
-            <w:r>
-              <w:rPr>
-                <w:color w:val="000000"/>
-                <w:sz w:val="20"/>
-                <w:szCs w:val="20"/>
-              </w:rPr>
-              <w:t xml:space="preserve"> время подачи вне окна брони — должен быть отказ.</w:t>
-            </w:r>
-          </w:p>
-          <w:p>
-            <w:pPr>
-              <w:numPr>
-                <w:ilvl w:val="0"/>
-                <w:numId w:val="1"/>
-              </w:numPr>
-              <w:pBdr>
-                <w:top w:val="nil"/>
-                <w:left w:val="nil"/>
-                <w:bottom w:val="nil"/>
-                <w:right w:val="nil"/>
-                <w:between w:val="nil"/>
-              </w:pBdr>
-              <w:spacing w:before="20" w:after="20"/>
-            </w:pPr>
-            <w:r>
-              <w:rPr>
-                <w:color w:val="000000"/>
-                <w:sz w:val="20"/>
-                <w:szCs w:val="20"/>
-              </w:rPr>
-              <w:lastRenderedPageBreak/>
-              <w:t>Повторный POST /</w:t>
-            </w:r>
-            <w:proofErr w:type="spellStart"/>
-            <w:r>
-              <w:rPr>
-                <w:color w:val="000000"/>
-                <w:sz w:val="20"/>
-                <w:szCs w:val="20"/>
-              </w:rPr>
-              <w:t>payment</w:t>
-            </w:r>
-            <w:proofErr w:type="spellEnd"/>
-            <w:r>
-              <w:rPr>
-                <w:color w:val="000000"/>
-                <w:sz w:val="20"/>
-                <w:szCs w:val="20"/>
-              </w:rPr>
-              <w:t>/</w:t>
-            </w:r>
-            <w:proofErr w:type="spellStart"/>
-            <w:r>
-              <w:rPr>
-                <w:color w:val="000000"/>
-                <w:sz w:val="20"/>
-                <w:szCs w:val="20"/>
-              </w:rPr>
-              <w:t>confirm</w:t>
-            </w:r>
-            <w:proofErr w:type="spellEnd"/>
-            <w:r>
-              <w:rPr>
-                <w:color w:val="000000"/>
-                <w:sz w:val="20"/>
-                <w:szCs w:val="20"/>
-              </w:rPr>
-              <w:t xml:space="preserve"> с устаревшим </w:t>
-            </w:r>
-            <w:proofErr w:type="spellStart"/>
-            <w:r>
-              <w:rPr>
-                <w:color w:val="000000"/>
-                <w:sz w:val="20"/>
-                <w:szCs w:val="20"/>
-              </w:rPr>
-              <w:t>checkout_preview</w:t>
-            </w:r>
-            <w:proofErr w:type="spellEnd"/>
-            <w:r>
-              <w:rPr>
-                <w:color w:val="000000"/>
-                <w:sz w:val="20"/>
-                <w:szCs w:val="20"/>
-              </w:rPr>
-              <w:t xml:space="preserve"> — должна обрабатываться корректно.</w:t>
+            <w:r>
+              <w:t>Некорректный items_json обрабатывается не как API-ошибка 400, а как сценарий empty_cart — пользователь видит страницу оплаты с пустой корзиной. | Кастомное время подачи вне окна брони — должен быть отказ. | Повторный POST /payment/confirm с устаревшим checkout_preview должен обрабатываться корректно за счёт signed preview-token fallback без немого падения из-за потери session preview.</w:t>
             </w:r>
           </w:p>
         </w:tc>
@@ -4511,7 +3893,7 @@
           </w:tcPr>
           <w:p>
             <w:r>
-              <w:t>/orders: ???????? ?????????? ?????? ?????? ???????? ????????????, ?? ?????. /orders/&lt;id&gt;: ????? ????? ?? ?????? ??????????? ? ???????????? 404 (????????-????????). /notifications: ???????? HTML-???????? ? ????????????? ?? ?????? ? ???????? ??????? (?? JSON-????????). ???????? ???? ???????: ????????? ?????? ?????? ??????? ??????????? ???????? ?????????. ?????? ??? ??? ???????????? ? ???????????: ??????????? ????????????? ???????????? ??????? ??.??.??. ???????? /notifications ??????????? ??? ???????????? webp-??????????? ? ?? ??????? ?? ??? ??? ???????.</w:t>
+              <w:t>/orders: страница показывает только заказы текущего пользователя, не чужие. /orders/&lt;id&gt;: чужой заказ не должен открываться — возвращается 404 (страница-заглушка). /notifications: рендерит HTML-страницу с уведомлениями по броням и активным заказам (не JSON-эндпойнт). Проверка окна готовки: временная логика показа статуса «готовится» работает корректно. Формат дат для бронирований и уведомлений: отображение соответствует фактическому шаблону ДД.ММ.ГГ. Страница /notifications открывается без декоративных webp-изображений и не зависит от них для рендера.</w:t>
             </w:r>
           </w:p>
         </w:tc>
@@ -4828,7 +4210,7 @@
         </w:rPr>
       </w:pPr>
       <w:r>
-        <w:t>Ответственные функции: index_route(), notifications_route() (routes/main_routes.py) → index(), notifications(), load_promo_items(), parse_promo_item(), promo_items_to_news_cards() (backend/app.py)</w:t>
+        <w:t>Ответственные функции: index_route(), notifications_route() (routes/main_routes.py) → index(), notifications(), load_promo_items(), parse_promo_item(), promo_items_to_news_cards(), api_order_statuses(), api_index_summary() (backend/app.py)</w:t>
       </w:r>
     </w:p>
     <w:p>
@@ -4839,78 +4221,7 @@
         </w:rPr>
       </w:pPr>
       <w:r>
-        <w:rPr>
-          <w:b/>
-          <w:bCs/>
-          <w:color w:val="595959"/>
-          <w:sz w:val="20"/>
-          <w:szCs w:val="20"/>
-        </w:rPr>
-        <w:t>Файлы</w:t>
-      </w:r>
-      <w:r>
-        <w:rPr>
-          <w:b/>
-          <w:bCs/>
-          <w:color w:val="595959"/>
-          <w:sz w:val="20"/>
-          <w:szCs w:val="20"/>
-          <w:lang w:val="en-US"/>
-        </w:rPr>
-        <w:t xml:space="preserve"> </w:t>
-      </w:r>
-      <w:r>
-        <w:rPr>
-          <w:b/>
-          <w:bCs/>
-          <w:color w:val="595959"/>
-          <w:sz w:val="20"/>
-          <w:szCs w:val="20"/>
-        </w:rPr>
-        <w:t>данных</w:t>
-      </w:r>
-      <w:r>
-        <w:rPr>
-          <w:b/>
-          <w:bCs/>
-          <w:color w:val="595959"/>
-          <w:sz w:val="20"/>
-          <w:szCs w:val="20"/>
-          <w:lang w:val="en-US"/>
-        </w:rPr>
-        <w:t xml:space="preserve">: </w:t>
-      </w:r>
-      <w:r>
-        <w:rPr>
-          <w:rFonts w:ascii="Courier New" w:eastAsia="Courier New" w:hAnsi="Courier New" w:cs="Courier New"/>
-          <w:color w:val="C7254E"/>
-          <w:sz w:val="20"/>
-          <w:szCs w:val="20"/>
-          <w:lang w:val="en-US"/>
-        </w:rPr>
-        <w:t>static/</w:t>
-      </w:r>
-      <w:proofErr w:type="spellStart"/>
-      <w:r>
-        <w:rPr>
-          <w:rFonts w:ascii="Courier New" w:eastAsia="Courier New" w:hAnsi="Courier New" w:cs="Courier New"/>
-          <w:color w:val="C7254E"/>
-          <w:sz w:val="20"/>
-          <w:szCs w:val="20"/>
-          <w:lang w:val="en-US"/>
-        </w:rPr>
-        <w:t>promo_items</w:t>
-      </w:r>
-      <w:proofErr w:type="spellEnd"/>
-      <w:r>
-        <w:rPr>
-          <w:rFonts w:ascii="Courier New" w:eastAsia="Courier New" w:hAnsi="Courier New" w:cs="Courier New"/>
-          <w:color w:val="C7254E"/>
-          <w:sz w:val="20"/>
-          <w:szCs w:val="20"/>
-          <w:lang w:val="en-US"/>
-        </w:rPr>
-        <w:t>/*, templates/index.html</w:t>
+        <w:t>Файлы данных: static/promo_items/*, templates/index.html, templates/notifications.html</w:t>
       </w:r>
     </w:p>
     <w:tbl>
@@ -5045,7 +4356,7 @@
           </w:tcPr>
           <w:p>
             <w:r>
-              <w:t>???? ????????/????? ??????????? ?? promo_items ??? ??????? ??????. / ??? ?????????? ?????-?????? ???????????? fallback NEWS_CARDS ? ????????? ??????????. / ???? ????????????: ??? featured=true ???????????? ?????????? ?????; ????? ? 10 ???????? ?? ????????. / ??? ?????????? Redis-???? ???? ???? ???????????? ?? ??????? ?? ?????? ??????????? ? ????????? /menu. / ??? ??????????????? ???????????? ?? ??????? ???????????? ??? ???????? ????? ? ?????? ? ???????? ???????. / Hero-???? ??????? ???????? ???????????? SVG-???? table.svg, ??????? ?? ?????? ???????? ????? ? CTA.</w:t>
+              <w:t>Блок новостей/промо заполняется из promo_items при наличии данных. / При отсутствии промо-данных используется fallback NEWS_CARDS — проверить содержимое. / Блок «Популярное»: при featured=true показываются отмеченные блюда; иначе — 10 карточек из каталога. / При включённом Redis-кэше меню блок «Популярное» на главной не должен расходиться с каталогом /menu. / Для авторизованного пользователя на главной отображаются его активные брони, баллы и заказы в процессе готовки. / Hero-блок может содержать декоративный SVG-слой table.svg, который не должен сдвигать текст и CTA. / Если первый HTML-рендер пришёл без полного пользовательского состояния, главная должна один раз догрузить баллы и статусы через GET /api/index-summary без дополнительного клика.</w:t>
             </w:r>
           </w:p>
         </w:tc>
@@ -5112,7 +4423,7 @@
           </w:tcPr>
           <w:p>
             <w:r>
-              <w:t>????? ?????? item.txt ? ????? ? ?? ?????? ?????? ??? ??????? ????????. ????? ??? ???? ? ???????? ?????????? ??? background-image (????? ???????? ?? ??????). ????????? promo-???????? ? static/promo_items/reklama ? static/promo_items/akciya ?? ?????? ???????? ? ???? ???? ???????. ???????? ???????? ?? ???????: hover-???????? ????????? ? ????? ??????? ?? ??????? ?? ??????? ????????.</w:t>
+              <w:t>Битый формат item.txt у промо — не должен ломать всю главную страницу. Промо без фото — карточка рендерится без background-image (явная заглушка не задана). Физические promo-карточки в static/promo_items/reklama и static/promo_items/akciya не должны отображать системные заглушки в блоке «Что нового». Карточка доставки на главной: hover-анимация грузовика и линий «ветра» не выходит за границы карточки.</w:t>
             </w:r>
           </w:p>
         </w:tc>
@@ -5415,7 +4726,7 @@
         <w:spacing w:before="30" w:after="80"/>
       </w:pPr>
       <w:r>
-        <w:t>После полного сценария (бронь + заказ + оплата) проверить согласованность активного backend: users/bookings/orders в JSON-файлах или в app_state (Postgres/Neon). Для быстрого контрольного просмотра /debug/storage использовать только если endpoint явно включён через DEBUG_STORAGE_ENABLED=true. При включённом Redis убедиться отдельно, что menu-кэш не расходится с данными на диске.</w:t>
+        <w:t>После полного сценария (бронь + заказ + оплата) проверить согласованность активного backend: users/bookings/orders в JSON-файлах или в app_state (Postgres/Neon) через /debug/storage. При включённом Redis убедиться отдельно, что menu-кэш не расходится с данными на диске.</w:t>
       </w:r>
     </w:p>
     <w:p>
@@ -5692,192 +5003,7 @@
         <w:spacing w:before="30" w:after="80"/>
       </w:pPr>
       <w:r>
-        <w:rPr>
-          <w:color w:val="000000"/>
-          <w:sz w:val="22"/>
-          <w:szCs w:val="22"/>
-        </w:rPr>
-        <w:t xml:space="preserve">Проект переведён на модульную структуру: </w:t>
-      </w:r>
-      <w:proofErr w:type="spellStart"/>
-      <w:r>
-        <w:rPr>
-          <w:color w:val="000000"/>
-          <w:sz w:val="22"/>
-          <w:szCs w:val="22"/>
-        </w:rPr>
-        <w:t>routes</w:t>
-      </w:r>
-      <w:proofErr w:type="spellEnd"/>
-      <w:r>
-        <w:rPr>
-          <w:color w:val="000000"/>
-          <w:sz w:val="22"/>
-          <w:szCs w:val="22"/>
-        </w:rPr>
-        <w:t xml:space="preserve">/, </w:t>
-      </w:r>
-      <w:proofErr w:type="spellStart"/>
-      <w:r>
-        <w:rPr>
-          <w:color w:val="000000"/>
-          <w:sz w:val="22"/>
-          <w:szCs w:val="22"/>
-        </w:rPr>
-        <w:t>services</w:t>
-      </w:r>
-      <w:proofErr w:type="spellEnd"/>
-      <w:r>
-        <w:rPr>
-          <w:color w:val="000000"/>
-          <w:sz w:val="22"/>
-          <w:szCs w:val="22"/>
-        </w:rPr>
-        <w:t xml:space="preserve">/, </w:t>
-      </w:r>
-      <w:proofErr w:type="spellStart"/>
-      <w:r>
-        <w:rPr>
-          <w:color w:val="000000"/>
-          <w:sz w:val="22"/>
-          <w:szCs w:val="22"/>
-        </w:rPr>
-        <w:t>storage</w:t>
-      </w:r>
-      <w:proofErr w:type="spellEnd"/>
-      <w:r>
-        <w:rPr>
-          <w:color w:val="000000"/>
-          <w:sz w:val="22"/>
-          <w:szCs w:val="22"/>
-        </w:rPr>
-        <w:t xml:space="preserve">/, </w:t>
-      </w:r>
-      <w:proofErr w:type="spellStart"/>
-      <w:r>
-        <w:rPr>
-          <w:color w:val="000000"/>
-          <w:sz w:val="22"/>
-          <w:szCs w:val="22"/>
-        </w:rPr>
-        <w:t>models</w:t>
-      </w:r>
-      <w:proofErr w:type="spellEnd"/>
-      <w:r>
-        <w:rPr>
-          <w:color w:val="000000"/>
-          <w:sz w:val="22"/>
-          <w:szCs w:val="22"/>
-        </w:rPr>
-        <w:t xml:space="preserve">/, config.py. app.py сохраняется как точка входа, но сейчас используется прямой </w:t>
-      </w:r>
-      <w:proofErr w:type="spellStart"/>
-      <w:r>
-        <w:rPr>
-          <w:color w:val="000000"/>
-          <w:sz w:val="22"/>
-          <w:szCs w:val="22"/>
-        </w:rPr>
-        <w:t>app</w:t>
-      </w:r>
-      <w:proofErr w:type="spellEnd"/>
-      <w:r>
-        <w:rPr>
-          <w:color w:val="000000"/>
-          <w:sz w:val="22"/>
-          <w:szCs w:val="22"/>
-        </w:rPr>
-        <w:t xml:space="preserve"> = </w:t>
-      </w:r>
-      <w:proofErr w:type="spellStart"/>
-      <w:r>
-        <w:rPr>
-          <w:color w:val="000000"/>
-          <w:sz w:val="22"/>
-          <w:szCs w:val="22"/>
-        </w:rPr>
-        <w:t>Flask</w:t>
-      </w:r>
-      <w:proofErr w:type="spellEnd"/>
-      <w:r>
-        <w:rPr>
-          <w:color w:val="000000"/>
-          <w:sz w:val="22"/>
-          <w:szCs w:val="22"/>
-        </w:rPr>
-        <w:t>(__</w:t>
-      </w:r>
-      <w:proofErr w:type="spellStart"/>
-      <w:r>
-        <w:rPr>
-          <w:color w:val="000000"/>
-          <w:sz w:val="22"/>
-          <w:szCs w:val="22"/>
-        </w:rPr>
-        <w:t>name</w:t>
-      </w:r>
-      <w:proofErr w:type="spellEnd"/>
-      <w:r>
-        <w:rPr>
-          <w:color w:val="000000"/>
-          <w:sz w:val="22"/>
-          <w:szCs w:val="22"/>
-        </w:rPr>
-        <w:t xml:space="preserve">__), без </w:t>
-      </w:r>
-      <w:proofErr w:type="spellStart"/>
-      <w:r>
-        <w:rPr>
-          <w:color w:val="000000"/>
-          <w:sz w:val="22"/>
-          <w:szCs w:val="22"/>
-        </w:rPr>
-        <w:t>factory</w:t>
-      </w:r>
-      <w:proofErr w:type="spellEnd"/>
-      <w:r>
-        <w:rPr>
-          <w:color w:val="000000"/>
-          <w:sz w:val="22"/>
-          <w:szCs w:val="22"/>
-        </w:rPr>
-        <w:t xml:space="preserve">-функции </w:t>
-      </w:r>
-      <w:proofErr w:type="spellStart"/>
-      <w:r>
-        <w:rPr>
-          <w:color w:val="000000"/>
-          <w:sz w:val="22"/>
-          <w:szCs w:val="22"/>
-        </w:rPr>
-        <w:t>create_</w:t>
-      </w:r>
-      <w:proofErr w:type="gramStart"/>
-      <w:r>
-        <w:rPr>
-          <w:color w:val="000000"/>
-          <w:sz w:val="22"/>
-          <w:szCs w:val="22"/>
-        </w:rPr>
-        <w:t>app</w:t>
-      </w:r>
-      <w:proofErr w:type="spellEnd"/>
-      <w:r>
-        <w:rPr>
-          <w:color w:val="000000"/>
-          <w:sz w:val="22"/>
-          <w:szCs w:val="22"/>
-        </w:rPr>
-        <w:t>(</w:t>
-      </w:r>
-      <w:proofErr w:type="gramEnd"/>
-      <w:r>
-        <w:rPr>
-          <w:color w:val="000000"/>
-          <w:sz w:val="22"/>
-          <w:szCs w:val="22"/>
-        </w:rPr>
-        <w:t>).</w:t>
+        <w:t>Проект переведён на модульную структуру: routes/, services/, storage/, models/, config.py. app.py остаётся точкой входа без factory-функции create_app(). На frontend основной app.js теперь работает как orchestration-layer и лениво подключает page-specific модули.</w:t>
       </w:r>
     </w:p>
     <w:p>
@@ -5896,7 +5022,7 @@
         <w:spacing w:before="30" w:after="80"/>
       </w:pPr>
       <w:r>
-        <w:t>JSON-хранилище теперь используется как локальный режим без DATABASE_URL. Если DATABASE_URL задан, backend работает только через Postgres/Neon и завершается на старте при недоступности БД. На HF Secrets DATABASE_URL и FLASK_SECRET_KEY обязательны; без них приложение остаётся в JSON-режиме. Для меню добавлен опциональный Redis-кэш по REDIS_URL с TTL, без влияния на основное хранилище пользователей, броней и заказов.</w:t>
+        <w:t>JSON-хранилище теперь используется как локальный режим без DATABASE_URL. Если DATABASE_URL задан, backend работает только через Postgres/Neon и завершается на старте при недоступности БД. Для меню добавлен опциональный Redis-кэш по REDIS_URL с TTL, без влияния на основное хранилище пользователей, броней и заказов. Дополнительно на backend используется request-scoped cache текущего пользователя и уведомлений в рамках одного HTTP-запроса.</w:t>
       </w:r>
     </w:p>
     <w:p>
@@ -5915,30 +5041,7 @@
         <w:spacing w:before="30" w:after="80"/>
       </w:pPr>
       <w:r>
-        <w:rPr>
-          <w:color w:val="000000"/>
-          <w:sz w:val="22"/>
-          <w:szCs w:val="22"/>
-        </w:rPr>
-        <w:t>Учебная безопасность паролей: SHA-256 без соли — приемлемо для учебного проекта, недостаточно для продакшена. CSRF-защита реализована (</w:t>
-      </w:r>
-      <w:proofErr w:type="spellStart"/>
-      <w:r>
-        <w:rPr>
-          <w:color w:val="000000"/>
-          <w:sz w:val="22"/>
-          <w:szCs w:val="22"/>
-        </w:rPr>
-        <w:t>before_request</w:t>
-      </w:r>
-      <w:proofErr w:type="spellEnd"/>
-      <w:r>
-        <w:rPr>
-          <w:color w:val="000000"/>
-          <w:sz w:val="22"/>
-          <w:szCs w:val="22"/>
-        </w:rPr>
-        <w:t xml:space="preserve"> + токен в формах и заголовках). Управление сессиями базовое: нет ротации токена, явного срока жизни и привязки к IP.</w:t>
+        <w:t>Учебная безопасность паролей: SHA-256 без соли — приемлемо для учебного проекта, недостаточно для продакшена. CSRF-защита реализована (before_request + токен в формах и заголовках). В текущем прод-режиме основная авторизация держится на долгоживущем signed auth_token в localStorage с восстановлением server-session; cookie-only режим признан нестабильным для части клиентов и вынесен в план обратного перехода через режимы token / hybrid / session.</w:t>
       </w:r>
     </w:p>
     <w:p>
@@ -5999,7 +5102,7 @@
         <w:spacing w:before="30" w:after="80"/>
       </w:pPr>
       <w:r>
-        <w:t>Авто-очистка заказов выполняется лениво при чтении orders через load_orders() → prune_orders(), а не отдельным фоновым воркером. Параметры задаются через переменные окружения: ORDER_RETENTION_DAYS (по умолчанию 7) — срок хранения завершённых заказов в днях; ORDER_PRUNE_INTERVAL_SECONDS (по умолчанию 60) — минимальный интервал между циклами очистки. Отдельно для Postgres/Neon работает keepalive: DB_KEEPALIVE_ENABLED и DB_KEEPALIVE_INTERVAL_SECONDS. Старт backend и сами операции БД выполняются с повторными попытками; в режиме Postgres запись больше не зависит от локальных lock-файлов.</w:t>
+        <w:t>Авто-очистка заказов выполняется лениво при чтении orders через load_orders() → prune_orders(), а не отдельным фоновым воркером. Параметры задаются через переменные окружения: ORDER_RETENTION_DAYS (по умолчанию 7) — срок хранения завершённых заказов в днях; ORDER_PRUNE_INTERVAL_SECONDS (по умолчанию 60) — минимальный интервал между циклами очистки. Отдельно для Postgres/Neon работает keepalive: DB_KEEPALIVE_ENABLED и DB_KEEPALIVE_INTERVAL_SECONDS.</w:t>
       </w:r>
     </w:p>
     <w:p>
@@ -6108,90 +5211,7 @@
         </w:rPr>
       </w:pPr>
       <w:r>
-        <w:rPr>
-          <w:b/>
-          <w:bCs/>
-          <w:color w:val="595959"/>
-          <w:sz w:val="20"/>
-          <w:szCs w:val="20"/>
-        </w:rPr>
-        <w:t>Ответственные</w:t>
-      </w:r>
-      <w:r>
-        <w:rPr>
-          <w:b/>
-          <w:bCs/>
-          <w:color w:val="595959"/>
-          <w:sz w:val="20"/>
-          <w:szCs w:val="20"/>
-          <w:lang w:val="en-US"/>
-        </w:rPr>
-        <w:t xml:space="preserve"> </w:t>
-      </w:r>
-      <w:r>
-        <w:rPr>
-          <w:b/>
-          <w:bCs/>
-          <w:color w:val="595959"/>
-          <w:sz w:val="20"/>
-          <w:szCs w:val="20"/>
-        </w:rPr>
-        <w:t>функции</w:t>
-      </w:r>
-      <w:r>
-        <w:rPr>
-          <w:b/>
-          <w:bCs/>
-          <w:color w:val="595959"/>
-          <w:sz w:val="20"/>
-          <w:szCs w:val="20"/>
-          <w:lang w:val="en-US"/>
-        </w:rPr>
-        <w:t xml:space="preserve">: </w:t>
-      </w:r>
-      <w:proofErr w:type="gramStart"/>
-      <w:r>
-        <w:rPr>
-          <w:rFonts w:ascii="Courier New" w:eastAsia="Courier New" w:hAnsi="Courier New" w:cs="Courier New"/>
-          <w:color w:val="C7254E"/>
-          <w:sz w:val="20"/>
-          <w:szCs w:val="20"/>
-          <w:lang w:val="en-US"/>
-        </w:rPr>
-        <w:t>points(</w:t>
-      </w:r>
-      <w:proofErr w:type="gramEnd"/>
-      <w:r>
-        <w:rPr>
-          <w:rFonts w:ascii="Courier New" w:eastAsia="Courier New" w:hAnsi="Courier New" w:cs="Courier New"/>
-          <w:color w:val="C7254E"/>
-          <w:sz w:val="20"/>
-          <w:szCs w:val="20"/>
-          <w:lang w:val="en-US"/>
-        </w:rPr>
-        <w:t xml:space="preserve">), delivery(), reviews(), </w:t>
-      </w:r>
-      <w:proofErr w:type="spellStart"/>
-      <w:r>
-        <w:rPr>
-          <w:rFonts w:ascii="Courier New" w:eastAsia="Courier New" w:hAnsi="Courier New" w:cs="Courier New"/>
-          <w:color w:val="C7254E"/>
-          <w:sz w:val="20"/>
-          <w:szCs w:val="20"/>
-          <w:lang w:val="en-US"/>
-        </w:rPr>
-        <w:t>release_table</w:t>
-      </w:r>
-      <w:proofErr w:type="spellEnd"/>
-      <w:r>
-        <w:rPr>
-          <w:rFonts w:ascii="Courier New" w:eastAsia="Courier New" w:hAnsi="Courier New" w:cs="Courier New"/>
-          <w:color w:val="C7254E"/>
-          <w:sz w:val="20"/>
-          <w:szCs w:val="20"/>
-          <w:lang w:val="en-US"/>
-        </w:rPr>
-        <w:t>()</w:t>
+        <w:t>Ответственные функции: points() (redirect на главную), delivery() (каталог доставки), reviews(), release_table()</w:t>
       </w:r>
     </w:p>
     <w:tbl>
@@ -6325,212 +5345,8 @@
             </w:tcMar>
           </w:tcPr>
           <w:p>
-            <w:pPr>
-              <w:numPr>
-                <w:ilvl w:val="0"/>
-                <w:numId w:val="1"/>
-              </w:numPr>
-              <w:pBdr>
-                <w:top w:val="nil"/>
-                <w:left w:val="nil"/>
-                <w:bottom w:val="nil"/>
-                <w:right w:val="nil"/>
-                <w:between w:val="nil"/>
-              </w:pBdr>
-              <w:spacing w:before="20" w:after="20"/>
-            </w:pPr>
-            <w:r>
-              <w:rPr>
-                <w:color w:val="000000"/>
-                <w:sz w:val="20"/>
-                <w:szCs w:val="20"/>
-              </w:rPr>
-              <w:t>Открыть /</w:t>
-            </w:r>
-            <w:proofErr w:type="spellStart"/>
-            <w:r>
-              <w:rPr>
-                <w:color w:val="000000"/>
-                <w:sz w:val="20"/>
-                <w:szCs w:val="20"/>
-              </w:rPr>
-              <w:t>points</w:t>
-            </w:r>
-            <w:proofErr w:type="spellEnd"/>
-            <w:r>
-              <w:rPr>
-                <w:color w:val="000000"/>
-                <w:sz w:val="20"/>
-                <w:szCs w:val="20"/>
-              </w:rPr>
-              <w:t>, /</w:t>
-            </w:r>
-            <w:proofErr w:type="spellStart"/>
-            <w:r>
-              <w:rPr>
-                <w:color w:val="000000"/>
-                <w:sz w:val="20"/>
-                <w:szCs w:val="20"/>
-              </w:rPr>
-              <w:t>reviews</w:t>
-            </w:r>
-            <w:proofErr w:type="spellEnd"/>
-            <w:r>
-              <w:rPr>
-                <w:color w:val="000000"/>
-                <w:sz w:val="20"/>
-                <w:szCs w:val="20"/>
-              </w:rPr>
-              <w:t xml:space="preserve"> — должны отображаться </w:t>
-            </w:r>
-            <w:proofErr w:type="spellStart"/>
-            <w:r>
-              <w:rPr>
-                <w:color w:val="000000"/>
-                <w:sz w:val="20"/>
-                <w:szCs w:val="20"/>
-              </w:rPr>
-              <w:t>placeholder</w:t>
-            </w:r>
-            <w:proofErr w:type="spellEnd"/>
-            <w:r>
-              <w:rPr>
-                <w:color w:val="000000"/>
-                <w:sz w:val="20"/>
-                <w:szCs w:val="20"/>
-              </w:rPr>
-              <w:t>-страницы без ошибок 500.</w:t>
-            </w:r>
-          </w:p>
-          <w:p>
-            <w:pPr>
-              <w:numPr>
-                <w:ilvl w:val="0"/>
-                <w:numId w:val="1"/>
-              </w:numPr>
-              <w:pBdr>
-                <w:top w:val="nil"/>
-                <w:left w:val="nil"/>
-                <w:bottom w:val="nil"/>
-                <w:right w:val="nil"/>
-                <w:between w:val="nil"/>
-              </w:pBdr>
-              <w:spacing w:before="20" w:after="20"/>
-              <w:rPr>
-                <w:color w:val="000000"/>
-                <w:sz w:val="22"/>
-                <w:szCs w:val="22"/>
-                <w:lang w:val="en-US"/>
-              </w:rPr>
-            </w:pPr>
-            <w:r>
-              <w:rPr>
-                <w:color w:val="000000"/>
-                <w:sz w:val="20"/>
-                <w:szCs w:val="20"/>
-              </w:rPr>
-              <w:t>Вызвать</w:t>
-            </w:r>
-            <w:r>
-              <w:rPr>
-                <w:color w:val="000000"/>
-                <w:sz w:val="20"/>
-                <w:szCs w:val="20"/>
-                <w:lang w:val="en-US"/>
-              </w:rPr>
-              <w:t xml:space="preserve"> POST /release — </w:t>
-            </w:r>
-            <w:r>
-              <w:rPr>
-                <w:color w:val="000000"/>
-                <w:sz w:val="20"/>
-                <w:szCs w:val="20"/>
-              </w:rPr>
-              <w:t>должен</w:t>
-            </w:r>
-            <w:r>
-              <w:rPr>
-                <w:color w:val="000000"/>
-                <w:sz w:val="20"/>
-                <w:szCs w:val="20"/>
-                <w:lang w:val="en-US"/>
-              </w:rPr>
-              <w:t xml:space="preserve"> </w:t>
-            </w:r>
-            <w:r>
-              <w:rPr>
-                <w:color w:val="000000"/>
-                <w:sz w:val="20"/>
-                <w:szCs w:val="20"/>
-              </w:rPr>
-              <w:t>вернуться</w:t>
-            </w:r>
-            <w:r>
-              <w:rPr>
-                <w:color w:val="000000"/>
-                <w:sz w:val="20"/>
-                <w:szCs w:val="20"/>
-                <w:lang w:val="en-US"/>
-              </w:rPr>
-              <w:t xml:space="preserve"> JSON-</w:t>
-            </w:r>
-            <w:r>
-              <w:rPr>
-                <w:color w:val="000000"/>
-                <w:sz w:val="20"/>
-                <w:szCs w:val="20"/>
-              </w:rPr>
-              <w:t>ответ</w:t>
-            </w:r>
-            <w:r>
-              <w:rPr>
-                <w:color w:val="000000"/>
-                <w:sz w:val="20"/>
-                <w:szCs w:val="20"/>
-                <w:lang w:val="en-US"/>
-              </w:rPr>
-              <w:t xml:space="preserve"> </w:t>
-            </w:r>
-            <w:r>
-              <w:rPr>
-                <w:color w:val="000000"/>
-                <w:sz w:val="20"/>
-                <w:szCs w:val="20"/>
-              </w:rPr>
-              <w:t>с</w:t>
-            </w:r>
-            <w:r>
-              <w:rPr>
-                <w:color w:val="000000"/>
-                <w:sz w:val="20"/>
-                <w:szCs w:val="20"/>
-                <w:lang w:val="en-US"/>
-              </w:rPr>
-              <w:t xml:space="preserve"> HTTP 501 (Not Implemented).</w:t>
-            </w:r>
-          </w:p>
-          <w:p>
-            <w:pPr>
-              <w:numPr>
-                <w:ilvl w:val="0"/>
-                <w:numId w:val="1"/>
-              </w:numPr>
-              <w:pBdr>
-                <w:top w:val="nil"/>
-                <w:left w:val="nil"/>
-                <w:bottom w:val="nil"/>
-                <w:right w:val="nil"/>
-                <w:between w:val="nil"/>
-              </w:pBdr>
-              <w:spacing w:before="20" w:after="20"/>
-            </w:pPr>
-            <w:r>
-              <w:rPr>
-                <w:color w:val="000000"/>
-                <w:sz w:val="20"/>
-                <w:szCs w:val="20"/>
-              </w:rPr>
-              <w:t>Убедиться, что все страницы-заглушки возвращают код 200 и корректный HTML без исключений на сервере.</w:t>
+            <w:r>
+              <w:t>Открыть /points, /reviews — должны отображаться без ошибок 500; /points в текущей реализации перенаправляет на главную, /reviews остаётся placeholder-страницей. | Вызвать POST /release — должен вернуться JSON-ответ с HTTP 501 (Not Implemented). | Убедиться, что все страницы-заглушки/редиректы возвращают ожидаемое поведение без исключений на сервере.</w:t>
             </w:r>
           </w:p>
         </w:tc>
@@ -7237,7 +6053,7 @@
           </w:tcPr>
           <w:p>
             <w:r>
-              <w:t>Хранилища данных и backend-режимы: json_store.py (локальный JSON-режим без DATABASE_URL) и pg_store.py (PostgreSQL/Neon, обязателен при наличии DATABASE_URL). При заданном DATABASE_URL приложение не откатывается на JSON и завершается на старте при недоступности Postgres. Старт backend и операции БД используют ретраи и переподключение. Таблица app_state хранит users, bookings и orders как JSONB. Эндпойнт /debug/storage по умолчанию закрыт и доступен только при DEBUG_STORAGE_ENABLED=true. Для каталога блюд в app.py добавлен опциональный Redis-кэш по REDIS_URL, но он не является основным хранилищем. В режиме Postgres запись не зависит от локальных файловых lock-файлов.</w:t>
+              <w:t>Хранилища данных и backend-режимы: json_store.py (локальный JSON-режим без DATABASE_URL) и pg_store.py (PostgreSQL/Neon, обязателен при наличии DATABASE_URL). При заданном DATABASE_URL приложение не откатывается на JSON и завершается на старте при недоступности Postgres. Таблица app_state хранит users, bookings и orders как JSONB. Эндпойнт /debug/storage показывает активный backend и счётчики записей. Для каталога блюд в app.py добавлен опциональный Redis-кэш по REDIS_URL, но он не является основным хранилищем.</w:t>
             </w:r>
           </w:p>
         </w:tc>
@@ -7483,7 +6299,7 @@
           </w:tcPr>
           <w:p>
             <w:r>
-              <w:t>Инициализация БД | Выполнить SQL-скрипт backend/sql/neon_init.sql через консоль Neon или psql. Скрипт создаёт таблицу app_state и seed-записи users/bookings/orders; дополнительная таблица reservations остаётся как пример/заготовка. | Миграция данных из JSON | Скрипт backend/ops/migrate_json_to_neon.py читает текущие JSON-файлы (users.json, bookings.json, orders.json) и записывает их содержимое в таблицу app_state Neon. Требует наличия переменной окружения DATABASE_URL. Запускать однократно при первом переезде на Neon. | Поведение backend | Если DATABASE_URL задан, приложение работает только через Postgres/Neon и не переключается обратно на JSON. При ошибке подключения backend завершается на старте после заданного числа retry-попыток. Для предотвращения «засыпания» Neon используется keepalive-поток с регулярным SELECT 1. | Redis-кэш меню | При наличии REDIS_URL каталог меню может кэшироваться в Redis по TTL; это серверный кэш, не основная БД. | Обязательные/важные переменные окружения в продакшене | Secrets: DATABASE_URL, FLASK_SECRET_KEY, при необходимости REDIS_URL. Variables: DB_KEEPALIVE_ENABLED, DB_KEEPALIVE_INTERVAL_SECONDS, POSTGRES_STARTUP_RETRIES, POSTGRES_STARTUP_RETRY_DELAY_SECONDS, DB_OPERATION_RETRIES, DB_RETRY_DELAY_SECONDS, а также cookie-настройки SESSION_COOKIE_SECURE, SESSION_COOKIE_SAMESITE, SESSION_COOKIE_PARTITIONED и TRUST_PROXY_HEADERS для hosted-сценария.</w:t>
+              <w:t>Инициализация БД | Выполнить SQL-скрипт backend/sql/neon_init.sql через консоль Neon или psql. Скрипт создаёт таблицу app_state и seed-записи users/bookings/orders; дополнительная таблица reservations остаётся как пример/заготовка. | Миграция данных из JSON | Скрипт backend/ops/migrate_json_to_neon.py читает текущие JSON-файлы (users.json, bookings.json, orders.json) и записывает их содержимое в таблицу app_state Neon. Требует наличия переменной окружения DATABASE_URL. Запускать однократно при первом переезде на Neon. | Поведение backend | Если DATABASE_URL задан, приложение работает только через Postgres/Neon и не переключается обратно на JSON. При ошибке подключения backend завершается на старте. Для предотвращения «засыпания» Neon используется keepalive-поток с регулярным SELECT 1. | Redis-кэш меню | При наличии REDIS_URL каталог меню может кэшироваться в Redis по TTL; это серверный кэш, не основная БД. | Обязательные/важные переменные окружения в продакшене | DATABASE_URL — строка подключения PostgreSQL/Neon. FLASK_SECRET_KEY — секретный ключ Flask-сессии. DB_KEEPALIVE_ENABLED и DB_KEEPALIVE_INTERVAL_SECONDS — параметры keepalive. REDIS_URL, MENU_CACHE_ENABLED, MENU_CACHE_TTL_SECONDS и MENU_CACHE_KEY — параметры Redis-кэша меню.</w:t>
             </w:r>
           </w:p>
         </w:tc>
@@ -7577,709 +6393,7 @@
           </w:tcPr>
           <w:p>
             <w:r>
-              <w:rPr>
-                <w:sz w:val="20"/>
-                <w:szCs w:val="20"/>
-              </w:rPr>
-              <w:t xml:space="preserve">При развёртывании на </w:t>
-            </w:r>
-            <w:proofErr w:type="spellStart"/>
-            <w:r>
-              <w:rPr>
-                <w:sz w:val="20"/>
-                <w:szCs w:val="20"/>
-              </w:rPr>
-              <w:t>Hugging</w:t>
-            </w:r>
-            <w:proofErr w:type="spellEnd"/>
-            <w:r>
-              <w:rPr>
-                <w:sz w:val="20"/>
-                <w:szCs w:val="20"/>
-              </w:rPr>
-              <w:t xml:space="preserve"> Face </w:t>
-            </w:r>
-            <w:proofErr w:type="spellStart"/>
-            <w:r>
-              <w:rPr>
-                <w:sz w:val="20"/>
-                <w:szCs w:val="20"/>
-              </w:rPr>
-              <w:t>Spaces</w:t>
-            </w:r>
-            <w:proofErr w:type="spellEnd"/>
-            <w:r>
-              <w:rPr>
-                <w:sz w:val="20"/>
-                <w:szCs w:val="20"/>
-              </w:rPr>
-              <w:t xml:space="preserve"> или в любом </w:t>
-            </w:r>
-            <w:proofErr w:type="spellStart"/>
-            <w:r>
-              <w:rPr>
-                <w:sz w:val="20"/>
-                <w:szCs w:val="20"/>
-              </w:rPr>
-              <w:t>iframe</w:t>
-            </w:r>
-            <w:proofErr w:type="spellEnd"/>
-            <w:r>
-              <w:rPr>
-                <w:sz w:val="20"/>
-                <w:szCs w:val="20"/>
-              </w:rPr>
-              <w:t xml:space="preserve">-хостинге браузер блокирует сторонние куки по умолчанию, что ломает авторизацию </w:t>
-            </w:r>
-            <w:proofErr w:type="spellStart"/>
-            <w:r>
-              <w:rPr>
-                <w:sz w:val="20"/>
-                <w:szCs w:val="20"/>
-              </w:rPr>
-              <w:t>Flask</w:t>
-            </w:r>
-            <w:proofErr w:type="spellEnd"/>
-            <w:r>
-              <w:rPr>
-                <w:sz w:val="20"/>
-                <w:szCs w:val="20"/>
-              </w:rPr>
-              <w:t xml:space="preserve">. Для корректной работы сессий необходимо задать следующие настройки в </w:t>
-            </w:r>
-            <w:r>
-              <w:rPr>
-                <w:rFonts w:ascii="Courier New" w:eastAsia="Courier New" w:hAnsi="Courier New" w:cs="Courier New"/>
-                <w:color w:val="C7254E"/>
-                <w:sz w:val="20"/>
-                <w:szCs w:val="20"/>
-              </w:rPr>
-              <w:t>config.py</w:t>
-            </w:r>
-            <w:r>
-              <w:rPr>
-                <w:sz w:val="20"/>
-                <w:szCs w:val="20"/>
-              </w:rPr>
-              <w:t xml:space="preserve"> или через переменные окружения:</w:t>
-            </w:r>
-          </w:p>
-          <w:p>
-            <w:r>
-              <w:rPr>
-                <w:rFonts w:ascii="Courier New" w:eastAsia="Courier New" w:hAnsi="Courier New" w:cs="Courier New"/>
-                <w:color w:val="C7254E"/>
-                <w:sz w:val="20"/>
-                <w:szCs w:val="20"/>
-              </w:rPr>
-              <w:t>SESSION_COOKIE_SAMESITE = "</w:t>
-            </w:r>
-            <w:proofErr w:type="spellStart"/>
-            <w:r>
-              <w:rPr>
-                <w:rFonts w:ascii="Courier New" w:eastAsia="Courier New" w:hAnsi="Courier New" w:cs="Courier New"/>
-                <w:color w:val="C7254E"/>
-                <w:sz w:val="20"/>
-                <w:szCs w:val="20"/>
-              </w:rPr>
-              <w:t>None</w:t>
-            </w:r>
-            <w:proofErr w:type="spellEnd"/>
-            <w:r>
-              <w:rPr>
-                <w:rFonts w:ascii="Courier New" w:eastAsia="Courier New" w:hAnsi="Courier New" w:cs="Courier New"/>
-                <w:color w:val="C7254E"/>
-                <w:sz w:val="20"/>
-                <w:szCs w:val="20"/>
-              </w:rPr>
-              <w:t>"</w:t>
-            </w:r>
-            <w:r>
-              <w:rPr>
-                <w:sz w:val="20"/>
-                <w:szCs w:val="20"/>
-              </w:rPr>
-              <w:t xml:space="preserve"> — разрешает передачу куки в кросс-</w:t>
-            </w:r>
-            <w:proofErr w:type="spellStart"/>
-            <w:r>
-              <w:rPr>
-                <w:sz w:val="20"/>
-                <w:szCs w:val="20"/>
-              </w:rPr>
-              <w:t>сайтовых</w:t>
-            </w:r>
-            <w:proofErr w:type="spellEnd"/>
-            <w:r>
-              <w:rPr>
-                <w:sz w:val="20"/>
-                <w:szCs w:val="20"/>
-              </w:rPr>
-              <w:t xml:space="preserve"> запросах (обязательно при работе в </w:t>
-            </w:r>
-            <w:proofErr w:type="spellStart"/>
-            <w:r>
-              <w:rPr>
-                <w:sz w:val="20"/>
-                <w:szCs w:val="20"/>
-              </w:rPr>
-              <w:t>iframe</w:t>
-            </w:r>
-            <w:proofErr w:type="spellEnd"/>
-            <w:r>
-              <w:rPr>
-                <w:sz w:val="20"/>
-                <w:szCs w:val="20"/>
-              </w:rPr>
-              <w:t>).</w:t>
-            </w:r>
-          </w:p>
-          <w:p>
-            <w:r>
-              <w:rPr>
-                <w:rFonts w:ascii="Courier New" w:eastAsia="Courier New" w:hAnsi="Courier New" w:cs="Courier New"/>
-                <w:color w:val="C7254E"/>
-                <w:sz w:val="20"/>
-                <w:szCs w:val="20"/>
-              </w:rPr>
-              <w:t>SESSION_COOKIE_SECURE = True</w:t>
-            </w:r>
-            <w:r>
-              <w:rPr>
-                <w:sz w:val="20"/>
-                <w:szCs w:val="20"/>
-              </w:rPr>
-              <w:t xml:space="preserve"> — передача куки только по HTTPS; обязательно при </w:t>
-            </w:r>
-            <w:proofErr w:type="spellStart"/>
-            <w:r>
-              <w:rPr>
-                <w:sz w:val="20"/>
-                <w:szCs w:val="20"/>
-              </w:rPr>
-              <w:t>SameSite</w:t>
-            </w:r>
-            <w:proofErr w:type="spellEnd"/>
-            <w:r>
-              <w:rPr>
-                <w:sz w:val="20"/>
-                <w:szCs w:val="20"/>
-              </w:rPr>
-              <w:t>=</w:t>
-            </w:r>
-            <w:proofErr w:type="spellStart"/>
-            <w:r>
-              <w:rPr>
-                <w:sz w:val="20"/>
-                <w:szCs w:val="20"/>
-              </w:rPr>
-              <w:t>None</w:t>
-            </w:r>
-            <w:proofErr w:type="spellEnd"/>
-            <w:r>
-              <w:rPr>
-                <w:sz w:val="20"/>
-                <w:szCs w:val="20"/>
-              </w:rPr>
-              <w:t>, иначе браузер отклоняет куки.</w:t>
-            </w:r>
-          </w:p>
-          <w:p>
-            <w:pPr>
-              <w:rPr>
-                <w:lang w:val="en-US"/>
-              </w:rPr>
-            </w:pPr>
-            <w:r>
-              <w:rPr>
-                <w:rFonts w:ascii="Courier New" w:eastAsia="Courier New" w:hAnsi="Courier New" w:cs="Courier New"/>
-                <w:color w:val="C7254E"/>
-                <w:sz w:val="20"/>
-                <w:szCs w:val="20"/>
-                <w:lang w:val="en-US"/>
-              </w:rPr>
-              <w:t>SESSION_COOKIE_PARTITIONED = True</w:t>
-            </w:r>
-            <w:r>
-              <w:rPr>
-                <w:sz w:val="20"/>
-                <w:szCs w:val="20"/>
-                <w:lang w:val="en-US"/>
-              </w:rPr>
-              <w:t xml:space="preserve"> — </w:t>
-            </w:r>
-            <w:r>
-              <w:rPr>
-                <w:sz w:val="20"/>
-                <w:szCs w:val="20"/>
-              </w:rPr>
-              <w:t>поддержка</w:t>
-            </w:r>
-            <w:r>
-              <w:rPr>
-                <w:sz w:val="20"/>
-                <w:szCs w:val="20"/>
-                <w:lang w:val="en-US"/>
-              </w:rPr>
-              <w:t xml:space="preserve"> CHIPS (Cookies Having Independent Partitioned State); </w:t>
-            </w:r>
-            <w:r>
-              <w:rPr>
-                <w:sz w:val="20"/>
-                <w:szCs w:val="20"/>
-              </w:rPr>
-              <w:t>необходима</w:t>
-            </w:r>
-            <w:r>
-              <w:rPr>
-                <w:sz w:val="20"/>
-                <w:szCs w:val="20"/>
-                <w:lang w:val="en-US"/>
-              </w:rPr>
-              <w:t xml:space="preserve"> </w:t>
-            </w:r>
-            <w:r>
-              <w:rPr>
-                <w:sz w:val="20"/>
-                <w:szCs w:val="20"/>
-              </w:rPr>
-              <w:t>для</w:t>
-            </w:r>
-            <w:r>
-              <w:rPr>
-                <w:sz w:val="20"/>
-                <w:szCs w:val="20"/>
-                <w:lang w:val="en-US"/>
-              </w:rPr>
-              <w:t xml:space="preserve"> Chrome </w:t>
-            </w:r>
-            <w:r>
-              <w:rPr>
-                <w:sz w:val="20"/>
-                <w:szCs w:val="20"/>
-              </w:rPr>
-              <w:t>при</w:t>
-            </w:r>
-            <w:r>
-              <w:rPr>
-                <w:sz w:val="20"/>
-                <w:szCs w:val="20"/>
-                <w:lang w:val="en-US"/>
-              </w:rPr>
-              <w:t xml:space="preserve"> </w:t>
-            </w:r>
-            <w:r>
-              <w:rPr>
-                <w:sz w:val="20"/>
-                <w:szCs w:val="20"/>
-              </w:rPr>
-              <w:t>работе</w:t>
-            </w:r>
-            <w:r>
-              <w:rPr>
-                <w:sz w:val="20"/>
-                <w:szCs w:val="20"/>
-                <w:lang w:val="en-US"/>
-              </w:rPr>
-              <w:t xml:space="preserve"> </w:t>
-            </w:r>
-            <w:r>
-              <w:rPr>
-                <w:sz w:val="20"/>
-                <w:szCs w:val="20"/>
-              </w:rPr>
-              <w:t>в</w:t>
-            </w:r>
-            <w:r>
-              <w:rPr>
-                <w:sz w:val="20"/>
-                <w:szCs w:val="20"/>
-                <w:lang w:val="en-US"/>
-              </w:rPr>
-              <w:t xml:space="preserve"> </w:t>
-            </w:r>
-            <w:proofErr w:type="spellStart"/>
-            <w:r>
-              <w:rPr>
-                <w:sz w:val="20"/>
-                <w:szCs w:val="20"/>
-                <w:lang w:val="en-US"/>
-              </w:rPr>
-              <w:t>iframe</w:t>
-            </w:r>
-            <w:proofErr w:type="spellEnd"/>
-            <w:r>
-              <w:rPr>
-                <w:sz w:val="20"/>
-                <w:szCs w:val="20"/>
-                <w:lang w:val="en-US"/>
-              </w:rPr>
-              <w:t xml:space="preserve"> </w:t>
-            </w:r>
-            <w:r>
-              <w:rPr>
-                <w:sz w:val="20"/>
-                <w:szCs w:val="20"/>
-              </w:rPr>
-              <w:t>на</w:t>
-            </w:r>
-            <w:r>
-              <w:rPr>
-                <w:sz w:val="20"/>
-                <w:szCs w:val="20"/>
-                <w:lang w:val="en-US"/>
-              </w:rPr>
-              <w:t xml:space="preserve"> </w:t>
-            </w:r>
-            <w:r>
-              <w:rPr>
-                <w:sz w:val="20"/>
-                <w:szCs w:val="20"/>
-              </w:rPr>
-              <w:t>сторонних</w:t>
-            </w:r>
-            <w:r>
-              <w:rPr>
-                <w:sz w:val="20"/>
-                <w:szCs w:val="20"/>
-                <w:lang w:val="en-US"/>
-              </w:rPr>
-              <w:t xml:space="preserve"> </w:t>
-            </w:r>
-            <w:r>
-              <w:rPr>
-                <w:sz w:val="20"/>
-                <w:szCs w:val="20"/>
-              </w:rPr>
-              <w:t>доменах</w:t>
-            </w:r>
-            <w:r>
-              <w:rPr>
-                <w:sz w:val="20"/>
-                <w:szCs w:val="20"/>
-                <w:lang w:val="en-US"/>
-              </w:rPr>
-              <w:t>.</w:t>
-            </w:r>
-          </w:p>
-          <w:p>
-            <w:pPr>
-              <w:rPr>
-                <w:lang w:val="en-US"/>
-              </w:rPr>
-            </w:pPr>
-            <w:r>
-              <w:rPr>
-                <w:rFonts w:ascii="Courier New" w:eastAsia="Courier New" w:hAnsi="Courier New" w:cs="Courier New"/>
-                <w:color w:val="C7254E"/>
-                <w:sz w:val="20"/>
-                <w:szCs w:val="20"/>
-                <w:lang w:val="en-US"/>
-              </w:rPr>
-              <w:t>TRUST_PROXY_HEADERS = True</w:t>
-            </w:r>
-            <w:r>
-              <w:rPr>
-                <w:sz w:val="20"/>
-                <w:szCs w:val="20"/>
-                <w:lang w:val="en-US"/>
-              </w:rPr>
-              <w:t xml:space="preserve"> — </w:t>
-            </w:r>
-            <w:r>
-              <w:rPr>
-                <w:sz w:val="20"/>
-                <w:szCs w:val="20"/>
-              </w:rPr>
-              <w:t>доверие</w:t>
-            </w:r>
-            <w:r>
-              <w:rPr>
-                <w:sz w:val="20"/>
-                <w:szCs w:val="20"/>
-                <w:lang w:val="en-US"/>
-              </w:rPr>
-              <w:t xml:space="preserve"> </w:t>
-            </w:r>
-            <w:r>
-              <w:rPr>
-                <w:sz w:val="20"/>
-                <w:szCs w:val="20"/>
-              </w:rPr>
-              <w:t>заголовкам</w:t>
-            </w:r>
-            <w:r>
-              <w:rPr>
-                <w:sz w:val="20"/>
-                <w:szCs w:val="20"/>
-                <w:lang w:val="en-US"/>
-              </w:rPr>
-              <w:t xml:space="preserve"> </w:t>
-            </w:r>
-            <w:r>
-              <w:rPr>
-                <w:rFonts w:ascii="Courier New" w:eastAsia="Courier New" w:hAnsi="Courier New" w:cs="Courier New"/>
-                <w:color w:val="C7254E"/>
-                <w:sz w:val="20"/>
-                <w:szCs w:val="20"/>
-                <w:lang w:val="en-US"/>
-              </w:rPr>
-              <w:t>X-Forwarded-Proto</w:t>
-            </w:r>
-            <w:r>
-              <w:rPr>
-                <w:sz w:val="20"/>
-                <w:szCs w:val="20"/>
-                <w:lang w:val="en-US"/>
-              </w:rPr>
-              <w:t xml:space="preserve"> </w:t>
-            </w:r>
-            <w:r>
-              <w:rPr>
-                <w:sz w:val="20"/>
-                <w:szCs w:val="20"/>
-              </w:rPr>
-              <w:t>от</w:t>
-            </w:r>
-            <w:r>
-              <w:rPr>
-                <w:sz w:val="20"/>
-                <w:szCs w:val="20"/>
-                <w:lang w:val="en-US"/>
-              </w:rPr>
-              <w:t xml:space="preserve"> </w:t>
-            </w:r>
-            <w:r>
-              <w:rPr>
-                <w:sz w:val="20"/>
-                <w:szCs w:val="20"/>
-              </w:rPr>
-              <w:t>обратного</w:t>
-            </w:r>
-            <w:r>
-              <w:rPr>
-                <w:sz w:val="20"/>
-                <w:szCs w:val="20"/>
-                <w:lang w:val="en-US"/>
-              </w:rPr>
-              <w:t xml:space="preserve"> </w:t>
-            </w:r>
-            <w:r>
-              <w:rPr>
-                <w:sz w:val="20"/>
-                <w:szCs w:val="20"/>
-              </w:rPr>
-              <w:t>прокси</w:t>
-            </w:r>
-            <w:r>
-              <w:rPr>
-                <w:sz w:val="20"/>
-                <w:szCs w:val="20"/>
-                <w:lang w:val="en-US"/>
-              </w:rPr>
-              <w:t xml:space="preserve"> Hugging Face; </w:t>
-            </w:r>
-            <w:r>
-              <w:rPr>
-                <w:sz w:val="20"/>
-                <w:szCs w:val="20"/>
-              </w:rPr>
-              <w:t>без</w:t>
-            </w:r>
-            <w:r>
-              <w:rPr>
-                <w:sz w:val="20"/>
-                <w:szCs w:val="20"/>
-                <w:lang w:val="en-US"/>
-              </w:rPr>
-              <w:t xml:space="preserve"> </w:t>
-            </w:r>
-            <w:r>
-              <w:rPr>
-                <w:sz w:val="20"/>
-                <w:szCs w:val="20"/>
-              </w:rPr>
-              <w:t>этого</w:t>
-            </w:r>
-            <w:r>
-              <w:rPr>
-                <w:sz w:val="20"/>
-                <w:szCs w:val="20"/>
-                <w:lang w:val="en-US"/>
-              </w:rPr>
-              <w:t xml:space="preserve"> Flask </w:t>
-            </w:r>
-            <w:r>
-              <w:rPr>
-                <w:sz w:val="20"/>
-                <w:szCs w:val="20"/>
-              </w:rPr>
-              <w:t>считает</w:t>
-            </w:r>
-            <w:r>
-              <w:rPr>
-                <w:sz w:val="20"/>
-                <w:szCs w:val="20"/>
-                <w:lang w:val="en-US"/>
-              </w:rPr>
-              <w:t xml:space="preserve"> </w:t>
-            </w:r>
-            <w:r>
-              <w:rPr>
-                <w:sz w:val="20"/>
-                <w:szCs w:val="20"/>
-              </w:rPr>
-              <w:t>соединение</w:t>
-            </w:r>
-            <w:r>
-              <w:rPr>
-                <w:sz w:val="20"/>
-                <w:szCs w:val="20"/>
-                <w:lang w:val="en-US"/>
-              </w:rPr>
-              <w:t xml:space="preserve"> HTTP </w:t>
-            </w:r>
-            <w:r>
-              <w:rPr>
-                <w:sz w:val="20"/>
-                <w:szCs w:val="20"/>
-              </w:rPr>
-              <w:t>и</w:t>
-            </w:r>
-            <w:r>
-              <w:rPr>
-                <w:sz w:val="20"/>
-                <w:szCs w:val="20"/>
-                <w:lang w:val="en-US"/>
-              </w:rPr>
-              <w:t xml:space="preserve"> </w:t>
-            </w:r>
-            <w:r>
-              <w:rPr>
-                <w:sz w:val="20"/>
-                <w:szCs w:val="20"/>
-              </w:rPr>
-              <w:t>отказывается</w:t>
-            </w:r>
-            <w:r>
-              <w:rPr>
-                <w:sz w:val="20"/>
-                <w:szCs w:val="20"/>
-                <w:lang w:val="en-US"/>
-              </w:rPr>
-              <w:t xml:space="preserve"> </w:t>
-            </w:r>
-            <w:r>
-              <w:rPr>
-                <w:sz w:val="20"/>
-                <w:szCs w:val="20"/>
-              </w:rPr>
-              <w:t>выставлять</w:t>
-            </w:r>
-            <w:r>
-              <w:rPr>
-                <w:sz w:val="20"/>
-                <w:szCs w:val="20"/>
-                <w:lang w:val="en-US"/>
-              </w:rPr>
-              <w:t xml:space="preserve"> Secure-</w:t>
-            </w:r>
-            <w:r>
-              <w:rPr>
-                <w:sz w:val="20"/>
-                <w:szCs w:val="20"/>
-              </w:rPr>
-              <w:t>куки</w:t>
-            </w:r>
-            <w:r>
-              <w:rPr>
-                <w:sz w:val="20"/>
-                <w:szCs w:val="20"/>
-                <w:lang w:val="en-US"/>
-              </w:rPr>
-              <w:t>.</w:t>
-            </w:r>
-          </w:p>
-          <w:p>
-            <w:r>
-              <w:rPr>
-                <w:color w:val="7F6000"/>
-                <w:sz w:val="20"/>
-                <w:szCs w:val="20"/>
-              </w:rPr>
-              <w:t xml:space="preserve">⚠️ Без перечисленных настроек авторизация в </w:t>
-            </w:r>
-            <w:proofErr w:type="spellStart"/>
-            <w:r>
-              <w:rPr>
-                <w:color w:val="7F6000"/>
-                <w:sz w:val="20"/>
-                <w:szCs w:val="20"/>
-              </w:rPr>
-              <w:t>iframe</w:t>
-            </w:r>
-            <w:proofErr w:type="spellEnd"/>
-            <w:r>
-              <w:rPr>
-                <w:color w:val="7F6000"/>
-                <w:sz w:val="20"/>
-                <w:szCs w:val="20"/>
-              </w:rPr>
-              <w:t>-хостинге (</w:t>
-            </w:r>
-            <w:proofErr w:type="spellStart"/>
-            <w:r>
-              <w:rPr>
-                <w:color w:val="7F6000"/>
-                <w:sz w:val="20"/>
-                <w:szCs w:val="20"/>
-              </w:rPr>
-              <w:t>Hugging</w:t>
-            </w:r>
-            <w:proofErr w:type="spellEnd"/>
-            <w:r>
-              <w:rPr>
-                <w:color w:val="7F6000"/>
-                <w:sz w:val="20"/>
-                <w:szCs w:val="20"/>
-              </w:rPr>
-              <w:t xml:space="preserve"> Face </w:t>
-            </w:r>
-            <w:proofErr w:type="spellStart"/>
-            <w:r>
-              <w:rPr>
-                <w:color w:val="7F6000"/>
-                <w:sz w:val="20"/>
-                <w:szCs w:val="20"/>
-              </w:rPr>
-              <w:t>Spaces</w:t>
-            </w:r>
-            <w:proofErr w:type="spellEnd"/>
-            <w:r>
-              <w:rPr>
-                <w:color w:val="7F6000"/>
-                <w:sz w:val="20"/>
-                <w:szCs w:val="20"/>
-              </w:rPr>
-              <w:t xml:space="preserve">, встраивание в сторонний сайт) будет ломаться: браузер не сохраняет куки сессии, пользователь не остаётся </w:t>
-            </w:r>
-            <w:proofErr w:type="spellStart"/>
-            <w:r>
-              <w:rPr>
-                <w:color w:val="7F6000"/>
-                <w:sz w:val="20"/>
-                <w:szCs w:val="20"/>
-              </w:rPr>
-              <w:t>залогиненным</w:t>
-            </w:r>
-            <w:proofErr w:type="spellEnd"/>
-            <w:r>
-              <w:rPr>
-                <w:color w:val="7F6000"/>
-                <w:sz w:val="20"/>
-                <w:szCs w:val="20"/>
-              </w:rPr>
-              <w:t xml:space="preserve"> между запросами.</w:t>
+              <w:t>Текущая боевая реальность для Hugging Face Spaces и мобильных клиентов | Cookie-only схема оказалась нестабильной: часть клиентов теряла server-session на первой загрузке, из-за чего баллы, статусы заказов и профильные данные появлялись только после следующего перехода. Поэтому текущий production использует долгоживущий signed auth_token, который хранится в localStorage, передаётся в Authorization для fetch и при необходимости переносится между страницами через auth_token. Сервер восстанавливает session из токена в before_request. | Практические правила эксплуатации | Рабочим адресом считать только mayaran-mdk2.hf.space. Адрес huggingface.co/spaces/... не использовать как основной пользовательский URL. | План обратного перехода на cookie | Безопасный путь: ввести AUTH_MODE=token / hybrid / session, оставить token как fallback, перевести first-load данные на API-догрузку, затем протестировать cookie-first режим только на hf.space и лишь после стабильности отключать token fallback.</w:t>
             </w:r>
           </w:p>
         </w:tc>
@@ -8596,13 +6710,7 @@
           </w:tcPr>
           <w:p>
             <w:r>
-              <w:rPr>
-                <w:rFonts w:ascii="Courier New" w:eastAsia="Courier New" w:hAnsi="Courier New" w:cs="Courier New"/>
-                <w:color w:val="C7254E"/>
-                <w:sz w:val="20"/>
-                <w:szCs w:val="20"/>
-              </w:rPr>
-              <w:t>menuHoverMood.js</w:t>
+              <w:t>authToken.js</w:t>
             </w:r>
           </w:p>
         </w:tc>
@@ -8624,21 +6732,8 @@
             </w:tcMar>
           </w:tcPr>
           <w:p>
-            <w:proofErr w:type="spellStart"/>
-            <w:r>
-              <w:rPr>
-                <w:sz w:val="20"/>
-                <w:szCs w:val="20"/>
-              </w:rPr>
-              <w:t>Hover</w:t>
-            </w:r>
-            <w:proofErr w:type="spellEnd"/>
-            <w:r>
-              <w:rPr>
-                <w:sz w:val="20"/>
-                <w:szCs w:val="20"/>
-              </w:rPr>
-              <w:t>-эффекты и анимации настроения на странице меню при наведении на карточки блюд.</w:t>
+            <w:r>
+              <w:t>Токен-авторизация: хранение auth_token, декорирование ссылок и форм, Authorization для same-origin fetch и bootstrap первой загрузки.</w:t>
             </w:r>
           </w:p>
         </w:tc>
@@ -8663,13 +6758,7 @@
           </w:tcPr>
           <w:p>
             <w:r>
-              <w:rPr>
-                <w:rFonts w:ascii="Courier New" w:eastAsia="Courier New" w:hAnsi="Courier New" w:cs="Courier New"/>
-                <w:color w:val="C7254E"/>
-                <w:sz w:val="20"/>
-                <w:szCs w:val="20"/>
-              </w:rPr>
-              <w:t>bottomNavMotion.js</w:t>
+              <w:t>menuCatalog.js</w:t>
             </w:r>
           </w:p>
         </w:tc>
@@ -8692,7 +6781,7 @@
           </w:tcPr>
           <w:p>
             <w:r>
-              <w:t>Анимация нижней навигации и индикация активного раздела.</w:t>
+              <w:t>Фильтрация, сортировка и анимации каталога меню.</w:t>
             </w:r>
           </w:p>
         </w:tc>
@@ -8717,13 +6806,7 @@
           </w:tcPr>
           <w:p>
             <w:r>
-              <w:rPr>
-                <w:rFonts w:ascii="Courier New" w:eastAsia="Courier New" w:hAnsi="Courier New" w:cs="Courier New"/>
-                <w:color w:val="C7254E"/>
-                <w:sz w:val="20"/>
-                <w:szCs w:val="20"/>
-              </w:rPr>
-              <w:t>tableTooltip.js</w:t>
+              <w:t>cartDrawer.js</w:t>
             </w:r>
           </w:p>
         </w:tc>
@@ -8746,7 +6829,7 @@
           </w:tcPr>
           <w:p>
             <w:r>
-              <w:t>Логика схемы зала и мобильных sheet-панелей бронирования.</w:t>
+              <w:t>Корзина, mobile drawer/bottom sheet и синхронизация кнопок «В корзину».</w:t>
             </w:r>
           </w:p>
         </w:tc>
@@ -8771,12 +6854,6 @@
           </w:tcPr>
           <w:p>
             <w:r>
-              <w:rPr>
-                <w:rFonts w:ascii="Courier New" w:eastAsia="Courier New" w:hAnsi="Courier New" w:cs="Courier New"/>
-                <w:color w:val="C7254E"/>
-                <w:sz w:val="20"/>
-                <w:szCs w:val="20"/>
-              </w:rPr>
               <w:t>orderStatusBar.js</w:t>
             </w:r>
           </w:p>
@@ -8799,53 +6876,8 @@
             </w:tcMar>
           </w:tcPr>
           <w:p>
-            <w:proofErr w:type="spellStart"/>
-            <w:r>
-              <w:t>Now-bar</w:t>
-            </w:r>
-            <w:proofErr w:type="spellEnd"/>
-            <w:r>
-              <w:t xml:space="preserve"> статусов заказа: </w:t>
-            </w:r>
-            <w:proofErr w:type="spellStart"/>
-            <w:r>
-              <w:t>polling</w:t>
-            </w:r>
-            <w:proofErr w:type="spellEnd"/>
-            <w:r>
-              <w:t xml:space="preserve"> GET /</w:t>
-            </w:r>
-            <w:proofErr w:type="spellStart"/>
-            <w:r>
-              <w:t>api</w:t>
-            </w:r>
-            <w:proofErr w:type="spellEnd"/>
-            <w:r>
-              <w:t>/</w:t>
-            </w:r>
-            <w:proofErr w:type="spellStart"/>
-            <w:r>
-              <w:t>order-statuses</w:t>
-            </w:r>
-            <w:proofErr w:type="spellEnd"/>
-            <w:r>
-              <w:t xml:space="preserve"> каждые 5 секунд, локальный таймер (1 с), отдельные стадии для </w:t>
-            </w:r>
-            <w:proofErr w:type="spellStart"/>
-            <w:r>
-              <w:t>dine-in</w:t>
-            </w:r>
-            <w:proofErr w:type="spellEnd"/>
-            <w:r>
-              <w:t xml:space="preserve"> и </w:t>
-            </w:r>
-            <w:proofErr w:type="spellStart"/>
-            <w:r>
-              <w:t>delivery</w:t>
-            </w:r>
-            <w:proofErr w:type="spellEnd"/>
-            <w:r>
-              <w:t>, дорожный прогресс доставки.</w:t>
+            <w:r>
+              <w:t>Now-bar статусов заказа: таймер каждую секунду, polling GET /api/order-statuses каждые 5 секунд только при активных заказах, отдельные стадии для dine-in и delivery.</w:t>
             </w:r>
           </w:p>
         </w:tc>
@@ -8870,12 +6902,6 @@
           </w:tcPr>
           <w:p>
             <w:r>
-              <w:rPr>
-                <w:rFonts w:ascii="Courier New" w:eastAsia="Courier New" w:hAnsi="Courier New" w:cs="Courier New"/>
-                <w:color w:val="C7254E"/>
-                <w:sz w:val="20"/>
-                <w:szCs w:val="20"/>
-              </w:rPr>
               <w:t>pointsBalanceCard.js</w:t>
             </w:r>
           </w:p>
@@ -8924,12 +6950,6 @@
           </w:tcPr>
           <w:p>
             <w:r>
-              <w:rPr>
-                <w:rFonts w:ascii="Courier New" w:eastAsia="Courier New" w:hAnsi="Courier New" w:cs="Courier New"/>
-                <w:color w:val="C7254E"/>
-                <w:sz w:val="20"/>
-                <w:szCs w:val="20"/>
-              </w:rPr>
               <w:t>deliveryFlow.js</w:t>
             </w:r>
           </w:p>
@@ -8954,6 +6974,72 @@
           <w:p>
             <w:r>
               <w:t>Клиентская логика сценария доставки: данные формы, предпросмотр оплаты и подтверждение заказа.</w:t>
+            </w:r>
+          </w:p>
+        </w:tc>
+      </w:tr>
+      <w:tr>
+        <w:tc>
+          <w:tcPr>
+            <w:tcW w:type="dxa" w:w="3081"/>
+          </w:tcPr>
+          <w:p>
+            <w:r>
+              <w:t>checkoutPaymentFlow.js</w:t>
+            </w:r>
+          </w:p>
+        </w:tc>
+        <w:tc>
+          <w:tcPr>
+            <w:tcW w:type="dxa" w:w="6279"/>
+          </w:tcPr>
+          <w:p>
+            <w:r>
+              <w:t>Логика checkout и обычной оплаты, включая подготовку данных и подтверждение платежа.</w:t>
+            </w:r>
+          </w:p>
+        </w:tc>
+      </w:tr>
+      <w:tr>
+        <w:tc>
+          <w:tcPr>
+            <w:tcW w:type="dxa" w:w="3081"/>
+          </w:tcPr>
+          <w:p>
+            <w:r>
+              <w:t>formEnhancements.js</w:t>
+            </w:r>
+          </w:p>
+        </w:tc>
+        <w:tc>
+          <w:tcPr>
+            <w:tcW w:type="dxa" w:w="6279"/>
+          </w:tcPr>
+          <w:p>
+            <w:r>
+              <w:t>Маски и валидация полей карты, срока действия, имени держателя и телефона.</w:t>
+            </w:r>
+          </w:p>
+        </w:tc>
+      </w:tr>
+      <w:tr>
+        <w:tc>
+          <w:tcPr>
+            <w:tcW w:type="dxa" w:w="3081"/>
+          </w:tcPr>
+          <w:p>
+            <w:r>
+              <w:t>indexSummaryHydration.js</w:t>
+            </w:r>
+          </w:p>
+        </w:tc>
+        <w:tc>
+          <w:tcPr>
+            <w:tcW w:type="dxa" w:w="6279"/>
+          </w:tcPr>
+          <w:p>
+            <w:r>
+              <w:t>Одноразовая догрузка баллов и активных статусов заказа на главной через GET /api/index-summary.</w:t>
             </w:r>
           </w:p>
         </w:tc>
@@ -9136,155 +7222,7 @@
         <w:spacing w:before="20" w:after="80"/>
       </w:pPr>
       <w:r>
-        <w:rPr>
-          <w:b/>
-          <w:bCs/>
-          <w:color w:val="595959"/>
-          <w:sz w:val="20"/>
-          <w:szCs w:val="20"/>
-        </w:rPr>
-        <w:t>Примечание</w:t>
-      </w:r>
-      <w:r>
-        <w:rPr>
-          <w:b/>
-          <w:bCs/>
-          <w:color w:val="595959"/>
-          <w:sz w:val="20"/>
-          <w:szCs w:val="20"/>
-          <w:lang w:val="en-US"/>
-        </w:rPr>
-        <w:t xml:space="preserve"> </w:t>
-      </w:r>
-      <w:r>
-        <w:rPr>
-          <w:b/>
-          <w:bCs/>
-          <w:color w:val="595959"/>
-          <w:sz w:val="20"/>
-          <w:szCs w:val="20"/>
-        </w:rPr>
-        <w:t>по</w:t>
-      </w:r>
-      <w:r>
-        <w:rPr>
-          <w:b/>
-          <w:bCs/>
-          <w:color w:val="595959"/>
-          <w:sz w:val="20"/>
-          <w:szCs w:val="20"/>
-          <w:lang w:val="en-US"/>
-        </w:rPr>
-        <w:t xml:space="preserve"> </w:t>
-      </w:r>
-      <w:r>
-        <w:rPr>
-          <w:b/>
-          <w:bCs/>
-          <w:color w:val="595959"/>
-          <w:sz w:val="20"/>
-          <w:szCs w:val="20"/>
-        </w:rPr>
-        <w:t>подключению</w:t>
-      </w:r>
-      <w:r>
-        <w:rPr>
-          <w:b/>
-          <w:bCs/>
-          <w:color w:val="595959"/>
-          <w:sz w:val="20"/>
-          <w:szCs w:val="20"/>
-          <w:lang w:val="en-US"/>
-        </w:rPr>
-        <w:t xml:space="preserve">: </w:t>
-      </w:r>
-      <w:r>
-        <w:rPr>
-          <w:color w:val="595959"/>
-          <w:sz w:val="20"/>
-          <w:szCs w:val="20"/>
-          <w:lang w:val="en-US"/>
-        </w:rPr>
-        <w:t xml:space="preserve">base.html </w:t>
-      </w:r>
-      <w:r>
-        <w:rPr>
-          <w:color w:val="595959"/>
-          <w:sz w:val="20"/>
-          <w:szCs w:val="20"/>
-        </w:rPr>
-        <w:t>подключает</w:t>
-      </w:r>
-      <w:r>
-        <w:rPr>
-          <w:color w:val="595959"/>
-          <w:sz w:val="20"/>
-          <w:szCs w:val="20"/>
-          <w:lang w:val="en-US"/>
-        </w:rPr>
-        <w:t xml:space="preserve"> app.js </w:t>
-      </w:r>
-      <w:r>
-        <w:rPr>
-          <w:color w:val="595959"/>
-          <w:sz w:val="20"/>
-          <w:szCs w:val="20"/>
-        </w:rPr>
-        <w:t>как</w:t>
-      </w:r>
-      <w:r>
-        <w:rPr>
-          <w:color w:val="595959"/>
-          <w:sz w:val="20"/>
-          <w:szCs w:val="20"/>
-          <w:lang w:val="en-US"/>
-        </w:rPr>
-        <w:t xml:space="preserve"> </w:t>
-      </w:r>
-      <w:r>
-        <w:rPr>
-          <w:rFonts w:ascii="Courier New" w:eastAsia="Courier New" w:hAnsi="Courier New" w:cs="Courier New"/>
-          <w:color w:val="C7254E"/>
-          <w:sz w:val="20"/>
-          <w:szCs w:val="20"/>
-          <w:lang w:val="en-US"/>
-        </w:rPr>
-        <w:t>&lt;script type="module"&gt;</w:t>
-      </w:r>
-      <w:r>
-        <w:rPr>
-          <w:color w:val="595959"/>
-          <w:sz w:val="20"/>
-          <w:szCs w:val="20"/>
-          <w:lang w:val="en-US"/>
-        </w:rPr>
-        <w:t xml:space="preserve">. </w:t>
-      </w:r>
-      <w:r>
-        <w:rPr>
-          <w:color w:val="595959"/>
-          <w:sz w:val="20"/>
-          <w:szCs w:val="20"/>
-        </w:rPr>
-        <w:t xml:space="preserve">Это означает </w:t>
-      </w:r>
-      <w:proofErr w:type="spellStart"/>
-      <w:r>
-        <w:rPr>
-          <w:color w:val="595959"/>
-          <w:sz w:val="20"/>
-          <w:szCs w:val="20"/>
-        </w:rPr>
-        <w:t>defer</w:t>
-      </w:r>
-      <w:proofErr w:type="spellEnd"/>
-      <w:r>
-        <w:rPr>
-          <w:color w:val="595959"/>
-          <w:sz w:val="20"/>
-          <w:szCs w:val="20"/>
-        </w:rPr>
-        <w:t>-загрузку и изолированную область видимости — глобальные переменные недоступны без явного экспорта.</w:t>
+        <w:t>Примечание по подключению: base.html подключает app.js как &lt;script type="module"&gt;. Это означает defer-загрузку и изолированную область видимости. До app.js шаблон также пробрасывает auth globals (ключ токена, query-параметр и current_user_id) для bootstrap логики авторизации.</w:t>
       </w:r>
     </w:p>
     <w:tbl>
@@ -9419,7 +7357,7 @@
           </w:tcPr>
           <w:p>
             <w:r>
-              <w:t>Загрузка модулей: убедиться, что app.js успешно импортирует все модули из static/js/modules/ без ошибок в консоли. / Корзина — открытие/закрытие: при нажатии кнопки корзина открывается с анимацией, при повторном нажатии — закрывается без рывка контента; анимация доходит до конца. / Добавление в корзину: товар добавляется через JS без перезагрузки страницы; счётчик в шапке обновляется. / Уведомления: модуль уведомлений инициализируется и отображает/скрывает badge при наличии/отсутствии активных событий. / Телефонная маска: +7 не стирается, лишние 7 не добавляются, валидное поле получает корректное визуальное состояние. / При наличии REDIS_URL каталог меню в UI должен совпадать с исходными item.txt и не зависеть от того, пришли данные из Redis или с диска.</w:t>
+              <w:t>Загрузка модулей: убедиться, что app.js успешно импортирует нужные модули из static/js/modules/ без ошибок в консоли. / Токен-мост: при наличии auth_token same-origin fetch получает Authorization, а внутренние формы и ссылки не теряют авторизацию. / Корзина — открытие/закрытие: при нажатии кнопки корзина открывается с анимацией, при повторном нажатии — закрывается без рывка контента; анимация доходит до конца. / Добавление в корзину: товар добавляется через JS без перезагрузки страницы; счётчик обновляется. / Телефонная маска: +7 не стирается, лишние 7 не добавляются, валидное поле получает корректное визуальное состояние. / На главной первая загрузка должна один раз догружать баллы и status bar через /api/index-summary, если первый HTML-рендер пришёл без полного состояния. / При наличии REDIS_URL каталог меню в UI должен совпадать с исходными item.txt и не зависеть от того, пришли данные из Redis или с диска.</w:t>
             </w:r>
           </w:p>
         </w:tc>
@@ -9474,7 +7412,7 @@
           </w:tcPr>
           <w:p>
             <w:r>
-              <w:t>Меню при большом zoom (150-200%): когда корзина открыта и места мало, карточки переходят в одноколоночный режим — проверить, что они не перекрываются и сохраняют корректный порядок. | Категории меню: переключение между типами блюд анимируется направленным слайдом без растягивания карточек. | Mobile-меню: вместо длинной ленты категорий доступны два компактных контрола — Тип и Сортировать. | Во встроенных мобильных браузерах проверить отображение подсказки про открытие сайта в Chrome, если вход не удерживается.</w:t>
+              <w:t>Меню при большом zoom (150-200%): когда корзина открыта и места мало, карточки переходят в одноколоночный режим — проверить, что они не перекрываются и сохраняют корректный порядок. | Категории меню: переключение между типами блюд анимируется направленным слайдом без растягивания карточек. | Mobile-меню: вместо длинной ленты категорий доступны два компактных контрола — Тип и Сортировать.</w:t>
             </w:r>
           </w:p>
         </w:tc>
@@ -10310,7 +8248,7 @@
           </w:tcPr>
           <w:p>
             <w:r>
-              <w:t>??????? ???????????, prom?-???? ? ???????????? ???????????? ??? ??????; hero-?????? ?????????? ?????? ? ???????????? table.svg ??? ?????? CTA.</w:t>
+              <w:t>Главная открывается, промо-блок и «Популярное» отображаются без ошибок; hero-плитка отображает декор с внутренним table.svg без сдвига CTA; при наличии сохранённого токена баллы и active status bar подтягиваются без ручного клика.</w:t>
             </w:r>
           </w:p>
         </w:tc>
@@ -10403,7 +8341,7 @@
           </w:tcPr>
           <w:p>
             <w:r>
-              <w:t>??????? ???????????, ???????? ? ????, ?????? ? ?????????? ???????????? ? ?????????? ???????; ????????? ????????? ?????? ???? ?????.</w:t>
+              <w:t>Каталог загружается, карточки с фото, ценами и граммовкой отображаются в правильном порядке; overlay граммовки выглядит консистентно.</w:t>
             </w:r>
           </w:p>
         </w:tc>
@@ -11109,7 +9047,7 @@
           </w:tcPr>
           <w:p>
             <w:r>
-              <w:t>???????? ??????????? ??????????? ??? ??????; ??? ??????? ???????? ?????? ? ??????? ??? ???????????? ?????????; ???????????? webp-??????????? ?? ????????? ??? ???????.</w:t>
+              <w:t>Страница уведомлений открывается без ошибок; при наличии активных броней и заказов они отображаются корректно; декоративные webp-изображения не требуются для рендера.</w:t>
             </w:r>
           </w:p>
         </w:tc>
@@ -11179,56 +9117,7 @@
         </w:rPr>
       </w:pPr>
       <w:r>
-        <w:rPr>
-          <w:b/>
-          <w:bCs/>
-          <w:color w:val="595959"/>
-          <w:sz w:val="20"/>
-          <w:szCs w:val="20"/>
-        </w:rPr>
-        <w:t>Ответственные</w:t>
-      </w:r>
-      <w:r>
-        <w:rPr>
-          <w:b/>
-          <w:bCs/>
-          <w:color w:val="595959"/>
-          <w:sz w:val="20"/>
-          <w:szCs w:val="20"/>
-          <w:lang w:val="en-US"/>
-        </w:rPr>
-        <w:t xml:space="preserve"> </w:t>
-      </w:r>
-      <w:r>
-        <w:rPr>
-          <w:b/>
-          <w:bCs/>
-          <w:color w:val="595959"/>
-          <w:sz w:val="20"/>
-          <w:szCs w:val="20"/>
-        </w:rPr>
-        <w:t>маршруты</w:t>
-      </w:r>
-      <w:r>
-        <w:rPr>
-          <w:b/>
-          <w:bCs/>
-          <w:color w:val="595959"/>
-          <w:sz w:val="20"/>
-          <w:szCs w:val="20"/>
-          <w:lang w:val="en-US"/>
-        </w:rPr>
-        <w:t xml:space="preserve">: </w:t>
-      </w:r>
-      <w:r>
-        <w:rPr>
-          <w:rFonts w:ascii="Courier New" w:eastAsia="Courier New" w:hAnsi="Courier New" w:cs="Courier New"/>
-          <w:color w:val="C7254E"/>
-          <w:sz w:val="20"/>
-          <w:szCs w:val="20"/>
-          <w:lang w:val="en-US"/>
-        </w:rPr>
-        <w:t>GET /delivery · GET /delivery/checkout · GET /delivery/payment · POST /delivery/payment · POST /delivery/confirm</w:t>
+        <w:t>Ответственные маршруты: GET /delivery · GET /delivery/checkout · GET /delivery/payment · POST /delivery/payment · POST /delivery/confirm. Для подтверждения оплаты доставки используется signed preview-token fallback.</w:t>
       </w:r>
     </w:p>
     <w:p>
@@ -11239,7 +9128,7 @@
         </w:rPr>
       </w:pPr>
       <w:r>
-        <w:t>Шаблоны: templates/menu.html (режим delivery_mode=True) · templates/delivery_checkout.html · templates/delivery_payment.html</w:t>
+        <w:t>Шаблоны: templates/menu.html (режим delivery_mode=True) · templates/delivery_checkout.html · templates/delivery_payment.html. Шаги оплаты используют signed preview-token, чтобы не зависеть только от server-session preview.</w:t>
       </w:r>
     </w:p>
     <w:tbl>
@@ -11350,7 +9239,7 @@
           </w:tcPr>
           <w:p>
             <w:r>
-              <w:t>GET /delivery открывает страницу меню доставки (menu.html в режиме delivery_mode=True) без ошибок 500; авторизация для просмотра каталога не требуется. | GET /delivery/checkout требует авторизацию и показывает форму адреса; для неавторизованного пользователя выполняется редирект на /login. | POST /delivery/payment принимает данные адреса, сохраняет delivery_checkout_preview в сессии и выполняет редирект на GET /delivery/payment. | GET /delivery/payment отображает предпросмотр суммы, адрес и данные доставки. | POST /delivery/confirm создаёт delivery-заказ в активном backend-хранилище (orders.json локально или app_state в Postgres); при AJAX-запросе возвращает JSON с order_url.</w:t>
+              <w:t>GET /delivery открывает страницу меню доставки (menu.html в режиме delivery_mode=True) без ошибок 500; авторизация для просмотра каталога не требуется. | GET /delivery/checkout требует авторизацию и показывает форму адреса; для неавторизованного пользователя выполняется редирект на /login. | POST /delivery/payment принимает данные адреса, формирует preview и signed preview-token, после чего выполняет переход на GET /delivery/payment. | GET /delivery/payment отображает предпросмотр суммы, адрес и данные доставки. | POST /delivery/confirm создаёт delivery-заказ в активном backend-хранилище (orders.json локально или app_state в Postgres); при потере session preview использует signed preview-token fallback; при AJAX-запросе возвращает JSON с order_url.</w:t>
             </w:r>
           </w:p>
         </w:tc>
@@ -11521,68 +9410,7 @@
           </w:tcPr>
           <w:p>
             <w:r>
-              <w:t>Повторный POST /</w:t>
-            </w:r>
-            <w:proofErr w:type="spellStart"/>
-            <w:r>
-              <w:t>delivery</w:t>
-            </w:r>
-            <w:proofErr w:type="spellEnd"/>
-            <w:r>
-              <w:t>/</w:t>
-            </w:r>
-            <w:proofErr w:type="spellStart"/>
-            <w:r>
-              <w:t>confirm</w:t>
-            </w:r>
-            <w:proofErr w:type="spellEnd"/>
-            <w:r>
-              <w:t xml:space="preserve"> с устаревшим </w:t>
-            </w:r>
-            <w:proofErr w:type="spellStart"/>
-            <w:r>
-              <w:t>preview</w:t>
-            </w:r>
-            <w:proofErr w:type="spellEnd"/>
-            <w:r>
-              <w:t xml:space="preserve"> — должен обрабатываться корректно без </w:t>
-            </w:r>
-            <w:proofErr w:type="spellStart"/>
-            <w:r>
-              <w:t>задвоения</w:t>
-            </w:r>
-            <w:proofErr w:type="spellEnd"/>
-            <w:r>
-              <w:t xml:space="preserve"> заказа.</w:t>
-            </w:r>
-          </w:p>
-          <w:p>
-            <w:r>
-              <w:t>Утверждение про обязательную активную карту или обязательное списание баллов для /</w:t>
-            </w:r>
-            <w:proofErr w:type="spellStart"/>
-            <w:r>
-              <w:t>delivery</w:t>
-            </w:r>
-            <w:proofErr w:type="spellEnd"/>
-            <w:r>
-              <w:t>/</w:t>
-            </w:r>
-            <w:proofErr w:type="spellStart"/>
-            <w:r>
-              <w:t>confirm</w:t>
-            </w:r>
-            <w:proofErr w:type="spellEnd"/>
-            <w:r>
-              <w:t xml:space="preserve"> из документа исключено: это не следует из текущего </w:t>
-            </w:r>
-            <w:proofErr w:type="spellStart"/>
-            <w:r>
-              <w:t>route</w:t>
-            </w:r>
-            <w:proofErr w:type="spellEnd"/>
-            <w:r>
-              <w:t>-описания.</w:t>
+              <w:t>Повторный POST /delivery/confirm с устаревшим preview должен обрабатываться корректно без задвоения заказа. | Подтверждение оплаты доставки не должно падать только из-за потери server-session между экраном проверки и подтверждением — signed preview-token обязан восстановить preview. | Утверждение про обязательную активную карту или обязательное списание баллов для /delivery/confirm из документа исключено: это не следует из текущего route-описания.</w:t>
             </w:r>
           </w:p>
         </w:tc>
@@ -11664,7 +9492,7 @@
         <w:spacing w:before="80" w:after="80"/>
       </w:pPr>
       <w:r>
-        <w:t>Компонент now-bar отображается на главной странице и обновляется в реальном времени без перезагрузки. Таймер пересчитывается на клиенте каждую секунду, а серверные статусы подтягиваются polling-запросом через GET /api/order-statuses.</w:t>
+        <w:t>Компонент now-bar отображается на главной странице и обновляется в реальном времени без перезагрузки. Баллы и статусы на первой загрузке дополнительно подтягиваются одноразовым GET /api/index-summary, а polling GET /api/order-statuses запускается только когда у пользователя реально есть активный заказ.</w:t>
       </w:r>
     </w:p>
     <w:p>
@@ -11783,7 +9611,7 @@
           </w:tcPr>
           <w:p>
             <w:r>
-              <w:t>GET /api/order-statuses возвращает 200 + JSON для авторизованного пользователя с активными заказами; для неавторизованного — 200 с пустым массивом order_statuses. | Now-bar отображается на главной странице и показывает активные стадии заказа без перезагрузки страницы. | Для delivery-заказа progress bar использует грузовик и дорожный прогресс; для dine-in отображается обычный прогресс без дорожной анимации. | При наличии нескольких активных заказов now-bar приоритизирует ближайший по time_to_target_seconds. | Таймер обновляется каждую секунду, а polling серверных статусов выполняется каждые 5 секунд. | Хранилище заказов не должно влиять на поведение now-bar: сценарий одинаков для JSON и Postgres.</w:t>
+              <w:t>GET /api/order-statuses возвращает 200 + JSON для авторизованного пользователя с активными заказами; для неавторизованного — 200 с пустым массивом order_statuses. | Now-bar отображается на главной странице и показывает активные стадии заказа без перезагрузки страницы. | Для delivery-заказа progress bar использует грузовик и дорожный прогресс; для dine-in отображается обычный прогресс без дорожной анимации. | При наличии нескольких активных заказов now-bar приоритизирует ближайший по time_to_target_seconds. | Таймер обновляется каждую секунду, а polling серверных статусов выполняется каждые 5 секунд только после появления активного status bar. | При отсутствии активных заказов секция status bar скрыта полностью и не оставляет пустое место. | Хранилище заказов не должно влиять на поведение now-bar: сценарий одинаков для JSON и Postgres.</w:t>
             </w:r>
           </w:p>
         </w:tc>
@@ -12251,21 +10079,7 @@
         </w:rPr>
       </w:pPr>
       <w:r>
-        <w:rPr>
-          <w:rFonts w:ascii="Courier New" w:eastAsia="Courier New" w:hAnsi="Courier New" w:cs="Courier New"/>
-          <w:color w:val="C7254E"/>
-          <w:sz w:val="20"/>
-          <w:szCs w:val="20"/>
-        </w:rPr>
-        <w:t xml:space="preserve">delivery_checkout.html </w:t>
-      </w:r>
-      <w:r>
-        <w:rPr>
-          <w:color w:val="000000"/>
-          <w:sz w:val="20"/>
-          <w:szCs w:val="20"/>
-        </w:rPr>
-        <w:t>— этап ввода адреса и времени доставки.</w:t>
+        <w:t>menu.html — основной каталог блюд с анимированным переключением категорий, mobile-фильтрами, мобильной bottom-sheet корзиной, overlay-граммовкой на фото блюда и layered-layout карточек на desktop и mobile.</w:t>
       </w:r>
     </w:p>
     <w:p>
@@ -12321,182 +10135,7 @@
         </w:rPr>
       </w:pPr>
       <w:r>
-        <w:rPr>
-          <w:rFonts w:ascii="Courier New" w:eastAsia="Courier New" w:hAnsi="Courier New" w:cs="Courier New"/>
-          <w:color w:val="C7254E"/>
-          <w:sz w:val="20"/>
-          <w:szCs w:val="20"/>
-        </w:rPr>
-        <w:t xml:space="preserve">base.html </w:t>
-      </w:r>
-      <w:r>
-        <w:rPr>
-          <w:color w:val="000000"/>
-          <w:sz w:val="20"/>
-          <w:szCs w:val="20"/>
-        </w:rPr>
-        <w:t xml:space="preserve">— базовый шаблон подключает </w:t>
-      </w:r>
-      <w:proofErr w:type="spellStart"/>
-      <w:r>
-        <w:rPr>
-          <w:rFonts w:ascii="Courier New" w:eastAsia="Courier New" w:hAnsi="Courier New" w:cs="Courier New"/>
-          <w:color w:val="C7254E"/>
-          <w:sz w:val="20"/>
-          <w:szCs w:val="20"/>
-        </w:rPr>
-        <w:t>static</w:t>
-      </w:r>
-      <w:proofErr w:type="spellEnd"/>
-      <w:r>
-        <w:rPr>
-          <w:rFonts w:ascii="Courier New" w:eastAsia="Courier New" w:hAnsi="Courier New" w:cs="Courier New"/>
-          <w:color w:val="C7254E"/>
-          <w:sz w:val="20"/>
-          <w:szCs w:val="20"/>
-        </w:rPr>
-        <w:t>/</w:t>
-      </w:r>
-      <w:proofErr w:type="spellStart"/>
-      <w:r>
-        <w:rPr>
-          <w:rFonts w:ascii="Courier New" w:eastAsia="Courier New" w:hAnsi="Courier New" w:cs="Courier New"/>
-          <w:color w:val="C7254E"/>
-          <w:sz w:val="20"/>
-          <w:szCs w:val="20"/>
-        </w:rPr>
-        <w:t>js</w:t>
-      </w:r>
-      <w:proofErr w:type="spellEnd"/>
-      <w:r>
-        <w:rPr>
-          <w:rFonts w:ascii="Courier New" w:eastAsia="Courier New" w:hAnsi="Courier New" w:cs="Courier New"/>
-          <w:color w:val="C7254E"/>
-          <w:sz w:val="20"/>
-          <w:szCs w:val="20"/>
-        </w:rPr>
-        <w:t xml:space="preserve">/app.js </w:t>
-      </w:r>
-      <w:r>
-        <w:rPr>
-          <w:color w:val="000000"/>
-          <w:sz w:val="20"/>
-          <w:szCs w:val="20"/>
-        </w:rPr>
-        <w:t xml:space="preserve">как </w:t>
-      </w:r>
-      <w:r>
-        <w:rPr>
-          <w:rFonts w:ascii="Courier New" w:eastAsia="Courier New" w:hAnsi="Courier New" w:cs="Courier New"/>
-          <w:color w:val="C7254E"/>
-          <w:sz w:val="20"/>
-          <w:szCs w:val="20"/>
-        </w:rPr>
-        <w:t>&lt;</w:t>
-      </w:r>
-      <w:proofErr w:type="spellStart"/>
-      <w:r>
-        <w:rPr>
-          <w:rFonts w:ascii="Courier New" w:eastAsia="Courier New" w:hAnsi="Courier New" w:cs="Courier New"/>
-          <w:color w:val="C7254E"/>
-          <w:sz w:val="20"/>
-          <w:szCs w:val="20"/>
-        </w:rPr>
-        <w:t>script</w:t>
-      </w:r>
-      <w:proofErr w:type="spellEnd"/>
-      <w:r>
-        <w:rPr>
-          <w:rFonts w:ascii="Courier New" w:eastAsia="Courier New" w:hAnsi="Courier New" w:cs="Courier New"/>
-          <w:color w:val="C7254E"/>
-          <w:sz w:val="20"/>
-          <w:szCs w:val="20"/>
-        </w:rPr>
-        <w:t xml:space="preserve"> </w:t>
-      </w:r>
-      <w:proofErr w:type="spellStart"/>
-      <w:r>
-        <w:rPr>
-          <w:rFonts w:ascii="Courier New" w:eastAsia="Courier New" w:hAnsi="Courier New" w:cs="Courier New"/>
-          <w:color w:val="C7254E"/>
-          <w:sz w:val="20"/>
-          <w:szCs w:val="20"/>
-        </w:rPr>
-        <w:t>type</w:t>
-      </w:r>
-      <w:proofErr w:type="spellEnd"/>
-      <w:r>
-        <w:rPr>
-          <w:rFonts w:ascii="Courier New" w:eastAsia="Courier New" w:hAnsi="Courier New" w:cs="Courier New"/>
-          <w:color w:val="C7254E"/>
-          <w:sz w:val="20"/>
-          <w:szCs w:val="20"/>
-        </w:rPr>
-        <w:t>="</w:t>
-      </w:r>
-      <w:proofErr w:type="spellStart"/>
-      <w:r>
-        <w:rPr>
-          <w:rFonts w:ascii="Courier New" w:eastAsia="Courier New" w:hAnsi="Courier New" w:cs="Courier New"/>
-          <w:color w:val="C7254E"/>
-          <w:sz w:val="20"/>
-          <w:szCs w:val="20"/>
-        </w:rPr>
-        <w:t>module</w:t>
-      </w:r>
-      <w:proofErr w:type="spellEnd"/>
-      <w:r>
-        <w:rPr>
-          <w:rFonts w:ascii="Courier New" w:eastAsia="Courier New" w:hAnsi="Courier New" w:cs="Courier New"/>
-          <w:color w:val="C7254E"/>
-          <w:sz w:val="20"/>
-          <w:szCs w:val="20"/>
-        </w:rPr>
-        <w:t>"&gt;</w:t>
-      </w:r>
-      <w:r>
-        <w:rPr>
-          <w:color w:val="000000"/>
-          <w:sz w:val="20"/>
-          <w:szCs w:val="20"/>
-        </w:rPr>
-        <w:t xml:space="preserve">, что обеспечивает </w:t>
-      </w:r>
-      <w:proofErr w:type="spellStart"/>
-      <w:r>
-        <w:rPr>
-          <w:color w:val="000000"/>
-          <w:sz w:val="20"/>
-          <w:szCs w:val="20"/>
-        </w:rPr>
-        <w:t>defer</w:t>
-      </w:r>
-      <w:proofErr w:type="spellEnd"/>
-      <w:r>
-        <w:rPr>
-          <w:color w:val="000000"/>
-          <w:sz w:val="20"/>
-          <w:szCs w:val="20"/>
-        </w:rPr>
-        <w:t xml:space="preserve">-загрузку и изолированный </w:t>
-      </w:r>
-      <w:proofErr w:type="spellStart"/>
-      <w:r>
-        <w:rPr>
-          <w:color w:val="000000"/>
-          <w:sz w:val="20"/>
-          <w:szCs w:val="20"/>
-        </w:rPr>
-        <w:t>scope</w:t>
-      </w:r>
-      <w:proofErr w:type="spellEnd"/>
-      <w:r>
-        <w:rPr>
-          <w:color w:val="000000"/>
-          <w:sz w:val="20"/>
-          <w:szCs w:val="20"/>
-        </w:rPr>
-        <w:t xml:space="preserve"> ES-модулей.</w:t>
+        <w:t>base.html — базовый шаблон подключает static/js/app.js как &lt;script type="module"&gt;, а также пробрасывает auth globals для token-bootstrap и первой инициализации страниц.</w:t>
       </w:r>
     </w:p>
     <w:sectPr>

</xml_diff>

<commit_message>
Update booking, checkout, delivery and docs
</commit_message>
<xml_diff>
--- a/backend/Модульная_документация_СВОЙ_РЕСТОРАН_v6.docx
+++ b/backend/Модульная_документация_СВОЙ_РЕСТОРАН_v6.docx
@@ -144,18 +144,6 @@
         </w:p>
       </w:sdtContent>
     </w:sdt>
-    <w:p>
-      <w:pPr>
-        <w:spacing w:after="80"/>
-      </w:pPr>
-      <w:r>
-        <w:rPr>
-          <w:i/>
-          <w:iCs/>
-        </w:rPr>
-        <w:t>Обновите поле в Word: ПКМ по оглавлению → Обновить поле → Обновить целиком.</w:t>
-      </w:r>
-    </w:p>
     <w:tbl>
       <w:tblPr>
         <w:tblStyle w:val="a5"/>
@@ -347,7 +335,177 @@
         </w:rPr>
       </w:pPr>
       <w:r>
-        <w:t>Backend: Python / Flask · Хранилище: JSON-файлы (локальный режим без DATABASE_URL) или Postgres (Neon, основной backend при наличии DATABASE_URL) · Кэш меню: Redis по REDIS_URL · Авторизация: долгоживущий signed auth_token + восстановление server-session · Архитектура: модульная (routes/, services/, storage/, models/, config.py)</w:t>
+        <w:rPr>
+          <w:lang w:val="en-US"/>
+        </w:rPr>
+        <w:t xml:space="preserve">Backend: Python / Flask · </w:t>
+      </w:r>
+      <w:r>
+        <w:t>Хранилище</w:t>
+      </w:r>
+      <w:r>
+        <w:rPr>
+          <w:lang w:val="en-US"/>
+        </w:rPr>
+        <w:t>: JSON-</w:t>
+      </w:r>
+      <w:r>
+        <w:t>файлы</w:t>
+      </w:r>
+      <w:r>
+        <w:rPr>
+          <w:lang w:val="en-US"/>
+        </w:rPr>
+        <w:t xml:space="preserve"> (</w:t>
+      </w:r>
+      <w:r>
+        <w:t>локальный</w:t>
+      </w:r>
+      <w:r>
+        <w:rPr>
+          <w:lang w:val="en-US"/>
+        </w:rPr>
+        <w:t xml:space="preserve"> </w:t>
+      </w:r>
+      <w:r>
+        <w:t>режим</w:t>
+      </w:r>
+      <w:r>
+        <w:rPr>
+          <w:lang w:val="en-US"/>
+        </w:rPr>
+        <w:t xml:space="preserve"> </w:t>
+      </w:r>
+      <w:r>
+        <w:t>без</w:t>
+      </w:r>
+      <w:r>
+        <w:rPr>
+          <w:lang w:val="en-US"/>
+        </w:rPr>
+        <w:t xml:space="preserve"> DATABASE_URL) </w:t>
+      </w:r>
+      <w:r>
+        <w:t>или</w:t>
+      </w:r>
+      <w:r>
+        <w:rPr>
+          <w:lang w:val="en-US"/>
+        </w:rPr>
+        <w:t xml:space="preserve"> Postgres/Neon (</w:t>
+      </w:r>
+      <w:r>
+        <w:t>основной</w:t>
+      </w:r>
+      <w:r>
+        <w:rPr>
+          <w:lang w:val="en-US"/>
+        </w:rPr>
+        <w:t xml:space="preserve"> backend </w:t>
+      </w:r>
+      <w:r>
+        <w:t>при</w:t>
+      </w:r>
+      <w:r>
+        <w:rPr>
+          <w:lang w:val="en-US"/>
+        </w:rPr>
+        <w:t xml:space="preserve"> </w:t>
+      </w:r>
+      <w:r>
+        <w:t>наличии</w:t>
+      </w:r>
+      <w:r>
+        <w:rPr>
+          <w:lang w:val="en-US"/>
+        </w:rPr>
+        <w:t xml:space="preserve"> DATABASE_URL) · </w:t>
+      </w:r>
+      <w:r>
+        <w:t>Кэш</w:t>
+      </w:r>
+      <w:r>
+        <w:rPr>
+          <w:lang w:val="en-US"/>
+        </w:rPr>
+        <w:t xml:space="preserve"> </w:t>
+      </w:r>
+      <w:r>
+        <w:t>меню</w:t>
+      </w:r>
+      <w:r>
+        <w:rPr>
+          <w:lang w:val="en-US"/>
+        </w:rPr>
+        <w:t xml:space="preserve">: Redis </w:t>
+      </w:r>
+      <w:r>
+        <w:t>по</w:t>
+      </w:r>
+      <w:r>
+        <w:rPr>
+          <w:lang w:val="en-US"/>
+        </w:rPr>
+        <w:t xml:space="preserve"> REDIS_URL · </w:t>
+      </w:r>
+      <w:r>
+        <w:t>Авторизация</w:t>
+      </w:r>
+      <w:r>
+        <w:rPr>
+          <w:lang w:val="en-US"/>
+        </w:rPr>
+        <w:t xml:space="preserve">: cookie-only Flask session + signed </w:t>
+      </w:r>
+      <w:proofErr w:type="spellStart"/>
+      <w:r>
+        <w:rPr>
+          <w:lang w:val="en-US"/>
+        </w:rPr>
+        <w:t>auth_session</w:t>
+      </w:r>
+      <w:proofErr w:type="spellEnd"/>
+      <w:r>
+        <w:rPr>
+          <w:lang w:val="en-US"/>
+        </w:rPr>
+        <w:t xml:space="preserve"> cookie </w:t>
+      </w:r>
+      <w:r>
+        <w:t>для</w:t>
+      </w:r>
+      <w:r>
+        <w:rPr>
+          <w:lang w:val="en-US"/>
+        </w:rPr>
+        <w:t xml:space="preserve"> </w:t>
+      </w:r>
+      <w:r>
+        <w:t>восстановления</w:t>
+      </w:r>
+      <w:r>
+        <w:rPr>
+          <w:lang w:val="en-US"/>
+        </w:rPr>
+        <w:t xml:space="preserve"> server-session · </w:t>
+      </w:r>
+      <w:r>
+        <w:t>Архитектура</w:t>
+      </w:r>
+      <w:r>
+        <w:rPr>
+          <w:lang w:val="en-US"/>
+        </w:rPr>
+        <w:t xml:space="preserve">: </w:t>
+      </w:r>
+      <w:r>
+        <w:t>модульная</w:t>
+      </w:r>
+      <w:r>
+        <w:rPr>
+          <w:lang w:val="en-US"/>
+        </w:rPr>
+        <w:t xml:space="preserve"> (routes/, services/, storage/, models/, config.py, services/order_totals.py)</w:t>
       </w:r>
     </w:p>
     <w:p>
@@ -358,7 +516,134 @@
         </w:rPr>
       </w:pPr>
       <w:r>
-        <w:t>Ответственные функции: login_route(), register_route(), logout_route() (routes/auth_routes.py) → login(), register(), logout(), restore_auth_from_token(), api_auth_session(), preserve_auth_token_on_redirects(), keep_user_session() (backend/app.py)</w:t>
+        <w:t>Ответственные</w:t>
+      </w:r>
+      <w:r>
+        <w:rPr>
+          <w:lang w:val="en-US"/>
+        </w:rPr>
+        <w:t xml:space="preserve"> </w:t>
+      </w:r>
+      <w:r>
+        <w:t>функции</w:t>
+      </w:r>
+      <w:r>
+        <w:rPr>
+          <w:lang w:val="en-US"/>
+        </w:rPr>
+        <w:t xml:space="preserve">: </w:t>
+      </w:r>
+      <w:proofErr w:type="spellStart"/>
+      <w:r>
+        <w:rPr>
+          <w:lang w:val="en-US"/>
+        </w:rPr>
+        <w:t>login_</w:t>
+      </w:r>
+      <w:proofErr w:type="gramStart"/>
+      <w:r>
+        <w:rPr>
+          <w:lang w:val="en-US"/>
+        </w:rPr>
+        <w:t>route</w:t>
+      </w:r>
+      <w:proofErr w:type="spellEnd"/>
+      <w:r>
+        <w:rPr>
+          <w:lang w:val="en-US"/>
+        </w:rPr>
+        <w:t>(</w:t>
+      </w:r>
+      <w:proofErr w:type="gramEnd"/>
+      <w:r>
+        <w:rPr>
+          <w:lang w:val="en-US"/>
+        </w:rPr>
+        <w:t xml:space="preserve">), </w:t>
+      </w:r>
+      <w:proofErr w:type="spellStart"/>
+      <w:r>
+        <w:rPr>
+          <w:lang w:val="en-US"/>
+        </w:rPr>
+        <w:t>register_route</w:t>
+      </w:r>
+      <w:proofErr w:type="spellEnd"/>
+      <w:r>
+        <w:rPr>
+          <w:lang w:val="en-US"/>
+        </w:rPr>
+        <w:t xml:space="preserve">(), </w:t>
+      </w:r>
+      <w:proofErr w:type="spellStart"/>
+      <w:r>
+        <w:rPr>
+          <w:lang w:val="en-US"/>
+        </w:rPr>
+        <w:t>logout_route</w:t>
+      </w:r>
+      <w:proofErr w:type="spellEnd"/>
+      <w:r>
+        <w:rPr>
+          <w:lang w:val="en-US"/>
+        </w:rPr>
+        <w:t xml:space="preserve">() (routes/auth_routes.py) → login(), register(), logout(), </w:t>
+      </w:r>
+      <w:proofErr w:type="spellStart"/>
+      <w:r>
+        <w:rPr>
+          <w:lang w:val="en-US"/>
+        </w:rPr>
+        <w:t>issue_auth_session_cookie</w:t>
+      </w:r>
+      <w:proofErr w:type="spellEnd"/>
+      <w:r>
+        <w:rPr>
+          <w:lang w:val="en-US"/>
+        </w:rPr>
+        <w:t xml:space="preserve">(), </w:t>
+      </w:r>
+      <w:proofErr w:type="spellStart"/>
+      <w:r>
+        <w:rPr>
+          <w:lang w:val="en-US"/>
+        </w:rPr>
+        <w:t>verify_auth_session_cookie</w:t>
+      </w:r>
+      <w:proofErr w:type="spellEnd"/>
+      <w:r>
+        <w:rPr>
+          <w:lang w:val="en-US"/>
+        </w:rPr>
+        <w:t xml:space="preserve">(), </w:t>
+      </w:r>
+      <w:proofErr w:type="spellStart"/>
+      <w:r>
+        <w:rPr>
+          <w:lang w:val="en-US"/>
+        </w:rPr>
+        <w:t>keep_user_session</w:t>
+      </w:r>
+      <w:proofErr w:type="spellEnd"/>
+      <w:r>
+        <w:rPr>
+          <w:lang w:val="en-US"/>
+        </w:rPr>
+        <w:t xml:space="preserve">(), </w:t>
+      </w:r>
+      <w:proofErr w:type="spellStart"/>
+      <w:r>
+        <w:rPr>
+          <w:lang w:val="en-US"/>
+        </w:rPr>
+        <w:t>get_request_user</w:t>
+      </w:r>
+      <w:proofErr w:type="spellEnd"/>
+      <w:r>
+        <w:rPr>
+          <w:lang w:val="en-US"/>
+        </w:rPr>
+        <w:t>() (backend/app.py)</w:t>
       </w:r>
     </w:p>
     <w:p>
@@ -636,7 +921,11 @@
           </w:tcPr>
           <w:p>
             <w:r>
-              <w:t>Проверить отображение текста ошибок на формах входа и регистрации. | Проверить, что после успешного логина пользователь попадает на главную и остаётся авторизованным на следующем переходе. | Проверить, что при сохранённом токене auth_token первая закрытая страница открывается без повторного логина. | Проверить фронтенд-маску телефона: префикс +7 не стирается, формат ввода остаётся стабильным при редактировании.</w:t>
+              <w:t xml:space="preserve">Проверить отображение текста ошибок на формах входа и регистрации. | Проверить, что после успешного логина пользователь попадает на главную и остаётся авторизованным на следующем переходе. | Проверить, что при сохранённом токене auth_token первая закрытая страница открывается без повторного логина. | </w:t>
+            </w:r>
+            <w:r>
+              <w:lastRenderedPageBreak/>
+              <w:t>Проверить фронтенд-маску телефона: префикс +7 не стирается, формат ввода остаётся стабильным при редактировании.</w:t>
             </w:r>
           </w:p>
         </w:tc>
@@ -1748,6 +2037,7 @@
               <w:pStyle w:val="1"/>
             </w:pPr>
             <w:r>
+              <w:lastRenderedPageBreak/>
               <w:t>3. Модуль «Меню и карточки блюд»</w:t>
             </w:r>
           </w:p>
@@ -1835,7 +2125,148 @@
         </w:rPr>
       </w:pPr>
       <w:r>
-        <w:t>Ответственные функции: menu_route(), menu_item_route() (routes/menu_routes.py) → load_menu_items(), load_menu_items_from_disk(), get_redis_client(), parse_menu_meta(), parse_menu_item(), menu(), menu_item() (backend/app.py)</w:t>
+        <w:t>Ответственные</w:t>
+      </w:r>
+      <w:r>
+        <w:rPr>
+          <w:lang w:val="en-US"/>
+        </w:rPr>
+        <w:t xml:space="preserve"> </w:t>
+      </w:r>
+      <w:r>
+        <w:t>функции</w:t>
+      </w:r>
+      <w:r>
+        <w:rPr>
+          <w:lang w:val="en-US"/>
+        </w:rPr>
+        <w:t xml:space="preserve">: </w:t>
+      </w:r>
+      <w:proofErr w:type="spellStart"/>
+      <w:r>
+        <w:rPr>
+          <w:lang w:val="en-US"/>
+        </w:rPr>
+        <w:t>menu_</w:t>
+      </w:r>
+      <w:proofErr w:type="gramStart"/>
+      <w:r>
+        <w:rPr>
+          <w:lang w:val="en-US"/>
+        </w:rPr>
+        <w:t>route</w:t>
+      </w:r>
+      <w:proofErr w:type="spellEnd"/>
+      <w:r>
+        <w:rPr>
+          <w:lang w:val="en-US"/>
+        </w:rPr>
+        <w:t>(</w:t>
+      </w:r>
+      <w:proofErr w:type="gramEnd"/>
+      <w:r>
+        <w:rPr>
+          <w:lang w:val="en-US"/>
+        </w:rPr>
+        <w:t xml:space="preserve">), </w:t>
+      </w:r>
+      <w:proofErr w:type="spellStart"/>
+      <w:r>
+        <w:rPr>
+          <w:lang w:val="en-US"/>
+        </w:rPr>
+        <w:t>menu_item_route</w:t>
+      </w:r>
+      <w:proofErr w:type="spellEnd"/>
+      <w:r>
+        <w:rPr>
+          <w:lang w:val="en-US"/>
+        </w:rPr>
+        <w:t xml:space="preserve">() (routes/menu_routes.py) → </w:t>
+      </w:r>
+      <w:proofErr w:type="spellStart"/>
+      <w:r>
+        <w:rPr>
+          <w:lang w:val="en-US"/>
+        </w:rPr>
+        <w:t>load_menu_items</w:t>
+      </w:r>
+      <w:proofErr w:type="spellEnd"/>
+      <w:r>
+        <w:rPr>
+          <w:lang w:val="en-US"/>
+        </w:rPr>
+        <w:t xml:space="preserve">(), </w:t>
+      </w:r>
+      <w:proofErr w:type="spellStart"/>
+      <w:r>
+        <w:rPr>
+          <w:lang w:val="en-US"/>
+        </w:rPr>
+        <w:t>load_menu_items_from_disk</w:t>
+      </w:r>
+      <w:proofErr w:type="spellEnd"/>
+      <w:r>
+        <w:rPr>
+          <w:lang w:val="en-US"/>
+        </w:rPr>
+        <w:t xml:space="preserve">(), </w:t>
+      </w:r>
+      <w:proofErr w:type="spellStart"/>
+      <w:r>
+        <w:rPr>
+          <w:lang w:val="en-US"/>
+        </w:rPr>
+        <w:t>get_redis_client</w:t>
+      </w:r>
+      <w:proofErr w:type="spellEnd"/>
+      <w:r>
+        <w:rPr>
+          <w:lang w:val="en-US"/>
+        </w:rPr>
+        <w:t xml:space="preserve">(), </w:t>
+      </w:r>
+      <w:proofErr w:type="spellStart"/>
+      <w:r>
+        <w:rPr>
+          <w:lang w:val="en-US"/>
+        </w:rPr>
+        <w:t>parse_menu_meta</w:t>
+      </w:r>
+      <w:proofErr w:type="spellEnd"/>
+      <w:r>
+        <w:rPr>
+          <w:lang w:val="en-US"/>
+        </w:rPr>
+        <w:t xml:space="preserve">(), </w:t>
+      </w:r>
+      <w:proofErr w:type="spellStart"/>
+      <w:r>
+        <w:rPr>
+          <w:lang w:val="en-US"/>
+        </w:rPr>
+        <w:t>parse_menu_item</w:t>
+      </w:r>
+      <w:proofErr w:type="spellEnd"/>
+      <w:r>
+        <w:rPr>
+          <w:lang w:val="en-US"/>
+        </w:rPr>
+        <w:t xml:space="preserve">(), menu(), </w:t>
+      </w:r>
+      <w:proofErr w:type="spellStart"/>
+      <w:r>
+        <w:rPr>
+          <w:lang w:val="en-US"/>
+        </w:rPr>
+        <w:t>menu_item</w:t>
+      </w:r>
+      <w:proofErr w:type="spellEnd"/>
+      <w:r>
+        <w:rPr>
+          <w:lang w:val="en-US"/>
+        </w:rPr>
+        <w:t>() (backend/app.py)</w:t>
       </w:r>
     </w:p>
     <w:p>
@@ -2291,7 +2722,145 @@
         </w:rPr>
       </w:pPr>
       <w:r>
-        <w:t>Ответственные функции: checkout_route(), payment_route(), payment_confirm_route() (routes/orders_routes.py) → checkout(), payment(), payment_confirm(), resolve_order_items(), parse_serving_option(), latest_user_booking_status() (services/business_logic.py). Подтверждение оплаты использует signed preview-token fallback при потере session preview.</w:t>
+        <w:t>Ответственные</w:t>
+      </w:r>
+      <w:r>
+        <w:rPr>
+          <w:lang w:val="en-US"/>
+        </w:rPr>
+        <w:t xml:space="preserve"> </w:t>
+      </w:r>
+      <w:r>
+        <w:t>функции</w:t>
+      </w:r>
+      <w:r>
+        <w:rPr>
+          <w:lang w:val="en-US"/>
+        </w:rPr>
+        <w:t xml:space="preserve">: </w:t>
+      </w:r>
+      <w:proofErr w:type="spellStart"/>
+      <w:r>
+        <w:rPr>
+          <w:lang w:val="en-US"/>
+        </w:rPr>
+        <w:t>checkout_</w:t>
+      </w:r>
+      <w:proofErr w:type="gramStart"/>
+      <w:r>
+        <w:rPr>
+          <w:lang w:val="en-US"/>
+        </w:rPr>
+        <w:t>route</w:t>
+      </w:r>
+      <w:proofErr w:type="spellEnd"/>
+      <w:r>
+        <w:rPr>
+          <w:lang w:val="en-US"/>
+        </w:rPr>
+        <w:t>(</w:t>
+      </w:r>
+      <w:proofErr w:type="gramEnd"/>
+      <w:r>
+        <w:rPr>
+          <w:lang w:val="en-US"/>
+        </w:rPr>
+        <w:t xml:space="preserve">), </w:t>
+      </w:r>
+      <w:proofErr w:type="spellStart"/>
+      <w:r>
+        <w:rPr>
+          <w:lang w:val="en-US"/>
+        </w:rPr>
+        <w:t>payment_route</w:t>
+      </w:r>
+      <w:proofErr w:type="spellEnd"/>
+      <w:r>
+        <w:rPr>
+          <w:lang w:val="en-US"/>
+        </w:rPr>
+        <w:t xml:space="preserve">(), </w:t>
+      </w:r>
+      <w:proofErr w:type="spellStart"/>
+      <w:r>
+        <w:rPr>
+          <w:lang w:val="en-US"/>
+        </w:rPr>
+        <w:t>payment_confirm_route</w:t>
+      </w:r>
+      <w:proofErr w:type="spellEnd"/>
+      <w:r>
+        <w:rPr>
+          <w:lang w:val="en-US"/>
+        </w:rPr>
+        <w:t xml:space="preserve">() (routes/orders_routes.py) → checkout(), payment(), </w:t>
+      </w:r>
+      <w:proofErr w:type="spellStart"/>
+      <w:r>
+        <w:rPr>
+          <w:lang w:val="en-US"/>
+        </w:rPr>
+        <w:t>payment_confirm</w:t>
+      </w:r>
+      <w:proofErr w:type="spellEnd"/>
+      <w:r>
+        <w:rPr>
+          <w:lang w:val="en-US"/>
+        </w:rPr>
+        <w:t xml:space="preserve">(), </w:t>
+      </w:r>
+      <w:proofErr w:type="spellStart"/>
+      <w:r>
+        <w:rPr>
+          <w:lang w:val="en-US"/>
+        </w:rPr>
+        <w:t>resolve_order_items</w:t>
+      </w:r>
+      <w:proofErr w:type="spellEnd"/>
+      <w:r>
+        <w:rPr>
+          <w:lang w:val="en-US"/>
+        </w:rPr>
+        <w:t xml:space="preserve">(), </w:t>
+      </w:r>
+      <w:proofErr w:type="spellStart"/>
+      <w:r>
+        <w:rPr>
+          <w:lang w:val="en-US"/>
+        </w:rPr>
+        <w:t>parse_serving_option</w:t>
+      </w:r>
+      <w:proofErr w:type="spellEnd"/>
+      <w:r>
+        <w:rPr>
+          <w:lang w:val="en-US"/>
+        </w:rPr>
+        <w:t xml:space="preserve">(), </w:t>
+      </w:r>
+      <w:proofErr w:type="spellStart"/>
+      <w:r>
+        <w:rPr>
+          <w:lang w:val="en-US"/>
+        </w:rPr>
+        <w:t>latest_user_booking_status</w:t>
+      </w:r>
+      <w:proofErr w:type="spellEnd"/>
+      <w:r>
+        <w:rPr>
+          <w:lang w:val="en-US"/>
+        </w:rPr>
+        <w:t xml:space="preserve">() (services/business_logic.py). </w:t>
+      </w:r>
+      <w:r>
+        <w:t xml:space="preserve">Подтверждение оплаты использует </w:t>
+      </w:r>
+      <w:proofErr w:type="spellStart"/>
+      <w:r>
+        <w:t>signed</w:t>
+      </w:r>
+      <w:proofErr w:type="spellEnd"/>
+      <w:r>
+        <w:t xml:space="preserve"> preview-token fallback при потере session preview.</w:t>
       </w:r>
     </w:p>
     <w:tbl>
@@ -2426,7 +2995,11 @@
           </w:tcPr>
           <w:p>
             <w:r>
-              <w:t>Без авторизации — редирект на /login для всех маршрутов раздела. / Валидации оплаты: нет активной брони; бронь просрочена; пустая корзина; нет активной карты — каждая ситуация выдаёт понятное сообщение об ошибке. / Предпросмотр оплаты: после POST /payment проверить корректные суммы items_total, points_applied, payable_total. / Подтверждение: POST /payment/confirm создаёт заказ в активном backend-хранилище (orders.json локально или app_state в Postgres). / Баллы: при use_points=1 баллы корректно списываются из активного user-store (users.json локально или app_state в Postgres). / AJAX-подтверждение: при заголовке X-Requested-With: XMLHttpRequest возвращается JSON с полем order_url.</w:t>
+              <w:t xml:space="preserve">Без авторизации — редирект на /login для всех маршрутов раздела. / Валидации оплаты: нет активной брони; бронь просрочена; пустая корзина; нет активной карты — каждая ситуация выдаёт понятное сообщение об ошибке. / Предпросмотр оплаты: после POST /payment </w:t>
+            </w:r>
+            <w:r>
+              <w:lastRenderedPageBreak/>
+              <w:t>проверить корректные суммы items_total, points_applied, payable_total. / Подтверждение: POST /payment/confirm создаёт заказ в активном backend-хранилище (orders.json локально или app_state в Postgres). / Баллы: при use_points=1 баллы корректно списываются из активного user-store (users.json локально или app_state в Postgres). / AJAX-подтверждение: при заголовке X-Requested-With: XMLHttpRequest возвращается JSON с полем order_url.</w:t>
             </w:r>
           </w:p>
         </w:tc>
@@ -2458,6 +3031,7 @@
                 <w:sz w:val="20"/>
                 <w:szCs w:val="20"/>
               </w:rPr>
+              <w:lastRenderedPageBreak/>
               <w:t xml:space="preserve">Edge </w:t>
             </w:r>
             <w:proofErr w:type="spellStart"/>
@@ -3572,6 +4146,7 @@
           <w:sz w:val="20"/>
           <w:szCs w:val="20"/>
         </w:rPr>
+        <w:lastRenderedPageBreak/>
         <w:t>Ответственные</w:t>
       </w:r>
       <w:r>
@@ -3925,7 +4500,6 @@
                 <w:sz w:val="20"/>
                 <w:szCs w:val="20"/>
               </w:rPr>
-              <w:lastRenderedPageBreak/>
               <w:t xml:space="preserve">Edge </w:t>
             </w:r>
             <w:proofErr w:type="spellStart"/>
@@ -4210,7 +4784,22 @@
         </w:rPr>
       </w:pPr>
       <w:r>
-        <w:t>Ответственные функции: index_route(), notifications_route() (routes/main_routes.py) → index(), notifications(), load_promo_items(), parse_promo_item(), promo_items_to_news_cards(), api_order_statuses(), api_index_summary() (backend/app.py)</w:t>
+        <w:t>Ответственные</w:t>
+      </w:r>
+      <w:r>
+        <w:rPr>
+          <w:lang w:val="en-US"/>
+        </w:rPr>
+        <w:t xml:space="preserve"> </w:t>
+      </w:r>
+      <w:r>
+        <w:t>функции</w:t>
+      </w:r>
+      <w:r>
+        <w:rPr>
+          <w:lang w:val="en-US"/>
+        </w:rPr>
+        <w:t>: index_route(), notifications_route() (routes/main_routes.py) → index(), notifications(), load_promo_items(), parse_promo_item(), promo_items_to_news_cards(), api_order_statuses(), api_index_summary() (backend/app.py)</w:t>
       </w:r>
     </w:p>
     <w:p>
@@ -4221,7 +4810,22 @@
         </w:rPr>
       </w:pPr>
       <w:r>
-        <w:t>Файлы данных: static/promo_items/*, templates/index.html, templates/notifications.html</w:t>
+        <w:t>Файлы</w:t>
+      </w:r>
+      <w:r>
+        <w:rPr>
+          <w:lang w:val="en-US"/>
+        </w:rPr>
+        <w:t xml:space="preserve"> </w:t>
+      </w:r>
+      <w:r>
+        <w:t>данных</w:t>
+      </w:r>
+      <w:r>
+        <w:rPr>
+          <w:lang w:val="en-US"/>
+        </w:rPr>
+        <w:t>: static/promo_items/*, templates/index.html, templates/notifications.html</w:t>
       </w:r>
     </w:p>
     <w:tbl>
@@ -4481,6 +5085,7 @@
               <w:pStyle w:val="1"/>
             </w:pPr>
             <w:r>
+              <w:lastRenderedPageBreak/>
               <w:t>8. Глобальное интеграционное тестирование</w:t>
             </w:r>
           </w:p>
@@ -4726,7 +5331,7 @@
         <w:spacing w:before="30" w:after="80"/>
       </w:pPr>
       <w:r>
-        <w:t>После полного сценария (бронь + заказ + оплата) проверить согласованность активного backend: users/bookings/orders в JSON-файлах или в app_state (Postgres/Neon) через /debug/storage. При включённом Redis убедиться отдельно, что menu-кэш не расходится с данными на диске.</w:t>
+        <w:t>После полного сценария (бронь + заказ + оплата) проверить согласованность активного backend: users/bookings/orders в JSON-файлах или в таблицах users / bookings / orders (Postgres/Neon) через /debug/storage. При включённом Redis убедиться отдельно, что menu-кэш не расходится с данными на диске.</w:t>
       </w:r>
     </w:p>
     <w:p>
@@ -5041,7 +5646,7 @@
         <w:spacing w:before="30" w:after="80"/>
       </w:pPr>
       <w:r>
-        <w:t>Учебная безопасность паролей: SHA-256 без соли — приемлемо для учебного проекта, недостаточно для продакшена. CSRF-защита реализована (before_request + токен в формах и заголовках). В текущем прод-режиме основная авторизация держится на долгоживущем signed auth_token в localStorage с восстановлением server-session; cookie-only режим признан нестабильным для части клиентов и вынесен в план обратного перехода через режимы token / hybrid / session.</w:t>
+        <w:t>Пароли хранятся через современный password hash `pbkdf2:sha256` с мягкой миграцией legacy SHA-256 при первом успешном входе. CSRF-защита реализована (before_request + токен в формах и заголовках). Текущая схема авторизации cookie-only: основой является Flask session, а signed auth_session cookie используется для восстановления server-session на первом запросе.</w:t>
       </w:r>
     </w:p>
     <w:p>
@@ -5102,7 +5707,11 @@
         <w:spacing w:before="30" w:after="80"/>
       </w:pPr>
       <w:r>
-        <w:t>Авто-очистка заказов выполняется лениво при чтении orders через load_orders() → prune_orders(), а не отдельным фоновым воркером. Параметры задаются через переменные окружения: ORDER_RETENTION_DAYS (по умолчанию 7) — срок хранения завершённых заказов в днях; ORDER_PRUNE_INTERVAL_SECONDS (по умолчанию 60) — минимальный интервал между циклами очистки. Отдельно для Postgres/Neon работает keepalive: DB_KEEPALIVE_ENABLED и DB_KEEPALIVE_INTERVAL_SECONDS.</w:t>
+        <w:t xml:space="preserve">Авто-очистка заказов выполняется лениво при чтении orders через load_orders() → prune_orders(), а не отдельным фоновым воркером. Параметры задаются через переменные окружения: ORDER_RETENTION_DAYS (по умолчанию 7) — срок хранения завершённых заказов в днях; ORDER_PRUNE_INTERVAL_SECONDS (по умолчанию 60) </w:t>
+      </w:r>
+      <w:r>
+        <w:lastRenderedPageBreak/>
+        <w:t>— минимальный интервал между циклами очистки. Отдельно для Postgres/Neon работает keepalive: DB_KEEPALIVE_ENABLED и DB_KEEPALIVE_INTERVAL_SECONDS.</w:t>
       </w:r>
     </w:p>
     <w:p>
@@ -5211,7 +5820,58 @@
         </w:rPr>
       </w:pPr>
       <w:r>
-        <w:t>Ответственные функции: points() (redirect на главную), delivery() (каталог доставки), reviews(), release_table()</w:t>
+        <w:t>Ответственные</w:t>
+      </w:r>
+      <w:r>
+        <w:rPr>
+          <w:lang w:val="en-US"/>
+        </w:rPr>
+        <w:t xml:space="preserve"> </w:t>
+      </w:r>
+      <w:r>
+        <w:t>функции</w:t>
+      </w:r>
+      <w:r>
+        <w:rPr>
+          <w:lang w:val="en-US"/>
+        </w:rPr>
+        <w:t xml:space="preserve">: points() (redirect </w:t>
+      </w:r>
+      <w:r>
+        <w:t>на</w:t>
+      </w:r>
+      <w:r>
+        <w:rPr>
+          <w:lang w:val="en-US"/>
+        </w:rPr>
+        <w:t xml:space="preserve"> </w:t>
+      </w:r>
+      <w:r>
+        <w:t>главную</w:t>
+      </w:r>
+      <w:r>
+        <w:rPr>
+          <w:lang w:val="en-US"/>
+        </w:rPr>
+        <w:t>), delivery() (</w:t>
+      </w:r>
+      <w:r>
+        <w:t>каталог</w:t>
+      </w:r>
+      <w:r>
+        <w:rPr>
+          <w:lang w:val="en-US"/>
+        </w:rPr>
+        <w:t xml:space="preserve"> </w:t>
+      </w:r>
+      <w:r>
+        <w:t>доставки</w:t>
+      </w:r>
+      <w:r>
+        <w:rPr>
+          <w:lang w:val="en-US"/>
+        </w:rPr>
+        <w:t>), reviews(), release_table()</w:t>
       </w:r>
     </w:p>
     <w:tbl>
@@ -5346,7 +6006,61 @@
           </w:tcPr>
           <w:p>
             <w:r>
-              <w:t>Открыть /points, /reviews — должны отображаться без ошибок 500; /points в текущей реализации перенаправляет на главную, /reviews остаётся placeholder-страницей. | Вызвать POST /release — должен вернуться JSON-ответ с HTTP 501 (Not Implemented). | Убедиться, что все страницы-заглушки/редиректы возвращают ожидаемое поведение без исключений на сервере.</w:t>
+              <w:t xml:space="preserve">Открыть /points, /reviews — должны отображаться без ошибок 500; /points в текущей реализации перенаправляет на главную, /reviews остаётся placeholder-страницей. </w:t>
+            </w:r>
+            <w:r>
+              <w:rPr>
+                <w:lang w:val="en-US"/>
+              </w:rPr>
+              <w:t xml:space="preserve">| </w:t>
+            </w:r>
+            <w:r>
+              <w:t>Вызвать</w:t>
+            </w:r>
+            <w:r>
+              <w:rPr>
+                <w:lang w:val="en-US"/>
+              </w:rPr>
+              <w:t xml:space="preserve"> POST /release — </w:t>
+            </w:r>
+            <w:r>
+              <w:t>должен</w:t>
+            </w:r>
+            <w:r>
+              <w:rPr>
+                <w:lang w:val="en-US"/>
+              </w:rPr>
+              <w:t xml:space="preserve"> </w:t>
+            </w:r>
+            <w:r>
+              <w:t>вернуться</w:t>
+            </w:r>
+            <w:r>
+              <w:rPr>
+                <w:lang w:val="en-US"/>
+              </w:rPr>
+              <w:t xml:space="preserve"> JSON-</w:t>
+            </w:r>
+            <w:r>
+              <w:t>ответ</w:t>
+            </w:r>
+            <w:r>
+              <w:rPr>
+                <w:lang w:val="en-US"/>
+              </w:rPr>
+              <w:t xml:space="preserve"> </w:t>
+            </w:r>
+            <w:r>
+              <w:t>с</w:t>
+            </w:r>
+            <w:r>
+              <w:rPr>
+                <w:lang w:val="en-US"/>
+              </w:rPr>
+              <w:t xml:space="preserve"> HTTP 501 (Not Implemented). </w:t>
+            </w:r>
+            <w:r>
+              <w:t>| Убедиться, что все страницы-заглушки/редиректы возвращают ожидаемое поведение без исключений на сервере.</w:t>
             </w:r>
           </w:p>
         </w:tc>
@@ -5378,7 +6092,6 @@
                 <w:sz w:val="20"/>
                 <w:szCs w:val="20"/>
               </w:rPr>
-              <w:lastRenderedPageBreak/>
               <w:t xml:space="preserve">Edge </w:t>
             </w:r>
             <w:proofErr w:type="spellStart"/>
@@ -6053,7 +6766,43 @@
           </w:tcPr>
           <w:p>
             <w:r>
-              <w:t>Хранилища данных и backend-режимы: json_store.py (локальный JSON-режим без DATABASE_URL) и pg_store.py (PostgreSQL/Neon, обязателен при наличии DATABASE_URL). При заданном DATABASE_URL приложение не откатывается на JSON и завершается на старте при недоступности Postgres. Таблица app_state хранит users, bookings и orders как JSONB. Эндпойнт /debug/storage показывает активный backend и счётчики записей. Для каталога блюд в app.py добавлен опциональный Redis-кэш по REDIS_URL, но он не является основным хранилищем.</w:t>
+              <w:t>Хранилища данных и backend-режимы: json_store.py (локальный JSON-режим без DATABASE_URL) и pg_store.py (PostgreSQL/Neon, обязателен при наличии DATABASE_URL). При заданном DATABASE_URL приложение не откатывается на JSON и завершается на старте при недоступности Postgres. Таблица</w:t>
+            </w:r>
+            <w:r>
+              <w:rPr>
+                <w:lang w:val="en-US"/>
+              </w:rPr>
+              <w:t xml:space="preserve"> app_state </w:t>
+            </w:r>
+            <w:r>
+              <w:t>хранит</w:t>
+            </w:r>
+            <w:r>
+              <w:rPr>
+                <w:lang w:val="en-US"/>
+              </w:rPr>
+              <w:t xml:space="preserve"> users, bookings </w:t>
+            </w:r>
+            <w:r>
+              <w:t>и</w:t>
+            </w:r>
+            <w:r>
+              <w:rPr>
+                <w:lang w:val="en-US"/>
+              </w:rPr>
+              <w:t xml:space="preserve"> orders </w:t>
+            </w:r>
+            <w:r>
+              <w:t>как</w:t>
+            </w:r>
+            <w:r>
+              <w:rPr>
+                <w:lang w:val="en-US"/>
+              </w:rPr>
+              <w:t xml:space="preserve"> JSONB. </w:t>
+            </w:r>
+            <w:r>
+              <w:t>Эндпойнт /debug/storage показывает активный backend и счётчики записей. Для каталога блюд в app.py добавлен опциональный Redis-кэш по REDIS_URL, но он не является основным хранилищем.</w:t>
             </w:r>
           </w:p>
         </w:tc>
@@ -6085,6 +6834,7 @@
                 <w:sz w:val="20"/>
                 <w:szCs w:val="20"/>
               </w:rPr>
+              <w:lastRenderedPageBreak/>
               <w:t>models</w:t>
             </w:r>
             <w:proofErr w:type="spellEnd"/>
@@ -6298,8 +7048,100 @@
             </w:tcMar>
           </w:tcPr>
           <w:p>
-            <w:r>
-              <w:t>Инициализация БД | Выполнить SQL-скрипт backend/sql/neon_init.sql через консоль Neon или psql. Скрипт создаёт таблицу app_state и seed-записи users/bookings/orders; дополнительная таблица reservations остаётся как пример/заготовка. | Миграция данных из JSON | Скрипт backend/ops/migrate_json_to_neon.py читает текущие JSON-файлы (users.json, bookings.json, orders.json) и записывает их содержимое в таблицу app_state Neon. Требует наличия переменной окружения DATABASE_URL. Запускать однократно при первом переезде на Neon. | Поведение backend | Если DATABASE_URL задан, приложение работает только через Postgres/Neon и не переключается обратно на JSON. При ошибке подключения backend завершается на старте. Для предотвращения «засыпания» Neon используется keepalive-поток с регулярным SELECT 1. | Redis-кэш меню | При наличии REDIS_URL каталог меню может кэшироваться в Redis по TTL; это серверный кэш, не основная БД. | Обязательные/важные переменные окружения в продакшене | DATABASE_URL — строка подключения PostgreSQL/Neon. FLASK_SECRET_KEY — секретный ключ Flask-сессии. DB_KEEPALIVE_ENABLED и DB_KEEPALIVE_INTERVAL_SECONDS — параметры keepalive. REDIS_URL, MENU_CACHE_ENABLED, MENU_CACHE_TTL_SECONDS и MENU_CACHE_KEY — параметры Redis-кэша меню.</w:t>
+            <w:pPr>
+              <w:rPr>
+                <w:lang w:val="en-US"/>
+              </w:rPr>
+            </w:pPr>
+            <w:r>
+              <w:t xml:space="preserve">Инициализация БД | Выполнить SQL-скрипт backend/sql/neon_init.sql через консоль Neon или psql. Скрипт подготавливает актуальную схему хранения пользователей, броней и заказов в отдельных таблицах; legacy app_state может использоваться только как источник одноразовой миграции старых данных, если такая таблица уже существует. | Миграция данных из JSON | Скрипт backend/ops/migrate_json_to_neon.py читает текущие JSON-файлы (users.json, bookings.json, orders.json) и записывает их содержимое в актуальные таблицы Neon/Postgres. Требует наличия переменной окружения DATABASE_URL. Запускать однократно при первом переезде на Neon. | Поведение backend | Если DATABASE_URL задан, приложение работает только через Postgres/Neon и не переключается обратно на JSON. При ошибке подключения backend завершается на старте. Для предотвращения «засыпания» Neon используется keepalive-поток с регулярным SELECT 1. | Redis-кэш меню | При наличии REDIS_URL каталог меню может кэшироваться в Redis по TTL; это серверный кэш, не основная БД. | Обязательные/важные переменные окружения в продакшене | DATABASE_URL — строка подключения PostgreSQL/Neon. </w:t>
+            </w:r>
+            <w:r>
+              <w:rPr>
+                <w:lang w:val="en-US"/>
+              </w:rPr>
+              <w:t xml:space="preserve">FLASK_SECRET_KEY — </w:t>
+            </w:r>
+            <w:r>
+              <w:t>секретный</w:t>
+            </w:r>
+            <w:r>
+              <w:rPr>
+                <w:lang w:val="en-US"/>
+              </w:rPr>
+              <w:t xml:space="preserve"> </w:t>
+            </w:r>
+            <w:r>
+              <w:t>ключ</w:t>
+            </w:r>
+            <w:r>
+              <w:rPr>
+                <w:lang w:val="en-US"/>
+              </w:rPr>
+              <w:t xml:space="preserve"> Flask-</w:t>
+            </w:r>
+            <w:r>
+              <w:t>сессий</w:t>
+            </w:r>
+            <w:r>
+              <w:rPr>
+                <w:lang w:val="en-US"/>
+              </w:rPr>
+              <w:t xml:space="preserve">. DB_KEEPALIVE_ENABLED </w:t>
+            </w:r>
+            <w:r>
+              <w:t>и</w:t>
+            </w:r>
+            <w:r>
+              <w:rPr>
+                <w:lang w:val="en-US"/>
+              </w:rPr>
+              <w:t xml:space="preserve"> DB_KEEPALIVE_INTERVAL_SECONDS — </w:t>
+            </w:r>
+            <w:r>
+              <w:t>параметры</w:t>
+            </w:r>
+            <w:r>
+              <w:rPr>
+                <w:lang w:val="en-US"/>
+              </w:rPr>
+              <w:t xml:space="preserve"> keepalive. REDIS_URL, MENU_CACHE_ENABLED, MENU_CACHE_TTL_SECONDS </w:t>
+            </w:r>
+            <w:r>
+              <w:t>и</w:t>
+            </w:r>
+            <w:r>
+              <w:rPr>
+                <w:lang w:val="en-US"/>
+              </w:rPr>
+              <w:t xml:space="preserve"> MENU_CACHE_KEY — </w:t>
+            </w:r>
+            <w:r>
+              <w:t>параметры</w:t>
+            </w:r>
+            <w:r>
+              <w:rPr>
+                <w:lang w:val="en-US"/>
+              </w:rPr>
+              <w:t xml:space="preserve"> Redis-</w:t>
+            </w:r>
+            <w:r>
+              <w:t>кэша</w:t>
+            </w:r>
+            <w:r>
+              <w:rPr>
+                <w:lang w:val="en-US"/>
+              </w:rPr>
+              <w:t xml:space="preserve"> </w:t>
+            </w:r>
+            <w:r>
+              <w:t>меню</w:t>
+            </w:r>
+            <w:r>
+              <w:rPr>
+                <w:lang w:val="en-US"/>
+              </w:rPr>
+              <w:t>.</w:t>
             </w:r>
           </w:p>
         </w:tc>
@@ -6308,6 +7150,9 @@
     <w:p>
       <w:pPr>
         <w:spacing w:before="160" w:after="80"/>
+        <w:rPr>
+          <w:lang w:val="en-US"/>
+        </w:rPr>
       </w:pPr>
     </w:p>
     <w:tbl>
@@ -6393,7 +7238,7 @@
           </w:tcPr>
           <w:p>
             <w:r>
-              <w:t>Текущая боевая реальность для Hugging Face Spaces и мобильных клиентов | Cookie-only схема оказалась нестабильной: часть клиентов теряла server-session на первой загрузке, из-за чего баллы, статусы заказов и профильные данные появлялись только после следующего перехода. Поэтому текущий production использует долгоживущий signed auth_token, который хранится в localStorage, передаётся в Authorization для fetch и при необходимости переносится между страницами через auth_token. Сервер восстанавливает session из токена в before_request. | Практические правила эксплуатации | Рабочим адресом считать только mayaran-mdk2.hf.space. Адрес huggingface.co/spaces/... не использовать как основной пользовательский URL. | План обратного перехода на cookie | Безопасный путь: ввести AUTH_MODE=token / hybrid / session, оставить token как fallback, перевести first-load данные на API-догрузку, затем протестировать cookie-first режим только на hf.space и лишь после стабильности отключать token fallback.</w:t>
+              <w:t>Текущая схема для Hugging Face Spaces и мобильных клиентов | Текущий production работает в cookie-only режиме: основой служит Flask session, а signed auth_session cookie помогает восстановить server-session на первом запросе. Для первой загрузки главной используются /api/index-summary и request-scoped cache, чтобы баллы и статусы не зависели только от server-render. | Практические правила эксплуатации | Рабочим адресом считать только mayaran-mdk2.hf.space. Адрес huggingface.co/spaces/... не использовать как основной пользовательский URL. | Актуальная схема cookie-only авторизации | Для hosted-окружения следует корректно настраивать secure/samesite/partitioned cookie и отдельно проверять first-load сценарии через /api/index-summary и /api/order-statuses.</w:t>
             </w:r>
           </w:p>
         </w:tc>
@@ -6710,6 +7555,7 @@
           </w:tcPr>
           <w:p>
             <w:r>
+              <w:lastRenderedPageBreak/>
               <w:t>authToken.js</w:t>
             </w:r>
           </w:p>
@@ -6733,7 +7579,7 @@
           </w:tcPr>
           <w:p>
             <w:r>
-              <w:t>Токен-авторизация: хранение auth_token, декорирование ссылок и форм, Authorization для same-origin fetch и bootstrap первой загрузки.</w:t>
+              <w:t>Лёгкая навигационная обёртка без token-авторизации; используется как безопасный bootstrap клиентских модулей и единая точка инициализации внутренних переходов.</w:t>
             </w:r>
           </w:p>
         </w:tc>
@@ -6981,7 +7827,7 @@
       <w:tr>
         <w:tc>
           <w:tcPr>
-            <w:tcW w:type="dxa" w:w="3081"/>
+            <w:tcW w:w="3081" w:type="dxa"/>
           </w:tcPr>
           <w:p>
             <w:r>
@@ -6991,7 +7837,7 @@
         </w:tc>
         <w:tc>
           <w:tcPr>
-            <w:tcW w:type="dxa" w:w="6279"/>
+            <w:tcW w:w="6279" w:type="dxa"/>
           </w:tcPr>
           <w:p>
             <w:r>
@@ -7003,7 +7849,7 @@
       <w:tr>
         <w:tc>
           <w:tcPr>
-            <w:tcW w:type="dxa" w:w="3081"/>
+            <w:tcW w:w="3081" w:type="dxa"/>
           </w:tcPr>
           <w:p>
             <w:r>
@@ -7013,7 +7859,7 @@
         </w:tc>
         <w:tc>
           <w:tcPr>
-            <w:tcW w:type="dxa" w:w="6279"/>
+            <w:tcW w:w="6279" w:type="dxa"/>
           </w:tcPr>
           <w:p>
             <w:r>
@@ -7025,7 +7871,7 @@
       <w:tr>
         <w:tc>
           <w:tcPr>
-            <w:tcW w:type="dxa" w:w="3081"/>
+            <w:tcW w:w="3081" w:type="dxa"/>
           </w:tcPr>
           <w:p>
             <w:r>
@@ -7035,7 +7881,7 @@
         </w:tc>
         <w:tc>
           <w:tcPr>
-            <w:tcW w:type="dxa" w:w="6279"/>
+            <w:tcW w:w="6279" w:type="dxa"/>
           </w:tcPr>
           <w:p>
             <w:r>
@@ -7098,7 +7944,6 @@
               <w:rPr>
                 <w:lang w:val="en-US"/>
               </w:rPr>
-              <w:lastRenderedPageBreak/>
               <w:t>13.  «Frontend (JS-</w:t>
             </w:r>
             <w:proofErr w:type="gramStart"/>
@@ -7222,7 +8067,52 @@
         <w:spacing w:before="20" w:after="80"/>
       </w:pPr>
       <w:r>
-        <w:t>Примечание по подключению: base.html подключает app.js как &lt;script type="module"&gt;. Это означает defer-загрузку и изолированную область видимости. До app.js шаблон также пробрасывает auth globals (ключ токена, query-параметр и current_user_id) для bootstrap логики авторизации.</w:t>
+        <w:t>Примечание</w:t>
+      </w:r>
+      <w:r>
+        <w:rPr>
+          <w:lang w:val="en-US"/>
+        </w:rPr>
+        <w:t xml:space="preserve"> </w:t>
+      </w:r>
+      <w:r>
+        <w:t>по</w:t>
+      </w:r>
+      <w:r>
+        <w:rPr>
+          <w:lang w:val="en-US"/>
+        </w:rPr>
+        <w:t xml:space="preserve"> </w:t>
+      </w:r>
+      <w:r>
+        <w:t>подключению</w:t>
+      </w:r>
+      <w:r>
+        <w:rPr>
+          <w:lang w:val="en-US"/>
+        </w:rPr>
+        <w:t xml:space="preserve">: base.html </w:t>
+      </w:r>
+      <w:r>
+        <w:t>подключает</w:t>
+      </w:r>
+      <w:r>
+        <w:rPr>
+          <w:lang w:val="en-US"/>
+        </w:rPr>
+        <w:t xml:space="preserve"> app.js </w:t>
+      </w:r>
+      <w:r>
+        <w:t>как</w:t>
+      </w:r>
+      <w:r>
+        <w:rPr>
+          <w:lang w:val="en-US"/>
+        </w:rPr>
+        <w:t xml:space="preserve"> &lt;script type="module"&gt;. </w:t>
+      </w:r>
+      <w:r>
+        <w:t>Это означает defer-загрузку и изолированную область видимости. До app.js шаблон пробрасывает только `window.__SESSION_USER_ID` для безопасной bootstrap-инициализации клиентских модулей без token-логики.</w:t>
       </w:r>
     </w:p>
     <w:tbl>
@@ -7357,7 +8247,7 @@
           </w:tcPr>
           <w:p>
             <w:r>
-              <w:t>Загрузка модулей: убедиться, что app.js успешно импортирует нужные модули из static/js/modules/ без ошибок в консоли. / Токен-мост: при наличии auth_token same-origin fetch получает Authorization, а внутренние формы и ссылки не теряют авторизацию. / Корзина — открытие/закрытие: при нажатии кнопки корзина открывается с анимацией, при повторном нажатии — закрывается без рывка контента; анимация доходит до конца. / Добавление в корзину: товар добавляется через JS без перезагрузки страницы; счётчик обновляется. / Телефонная маска: +7 не стирается, лишние 7 не добавляются, валидное поле получает корректное визуальное состояние. / На главной первая загрузка должна один раз догружать баллы и status bar через /api/index-summary, если первый HTML-рендер пришёл без полного состояния. / При наличии REDIS_URL каталог меню в UI должен совпадать с исходными item.txt и не зависеть от того, пришли данные из Redis или с диска.</w:t>
+              <w:t>Загрузка модулей: убедиться, что app.js успешно импортирует нужные модули из static/js/modules/ без ошибок в консоли. / Session/cookie-механика: same-origin fetch, формы и внутренняя навигация работают без token-моста и не теряют авторизацию при наличии активной cookie-session. / Корзина — открытие/закрытие: при нажатии кнопки корзина открывается с анимацией, при повторном нажатии — закрывается без рывка контента; анимация доходит до конца. / Добавление в корзину: товар добавляется через JS без перезагрузки страницы; счётчик обновляется. / Телефонная маска: +7 не стирается, лишние 7 не добавляются, валидное поле получает корректное визуальное состояние. / На главной первая загрузка должна один раз догружать баллы и status bar через /api/index-summary, если первый HTML-рендер пришёл без полного состояния. / При наличии REDIS_URL каталог меню в UI должен совпадать с исходными item.txt и не зависеть от того, пришли данные из Redis или с диска.</w:t>
             </w:r>
           </w:p>
         </w:tc>
@@ -7832,7 +8722,6 @@
                 <w:sz w:val="20"/>
                 <w:szCs w:val="20"/>
               </w:rPr>
-              <w:lastRenderedPageBreak/>
               <w:t>Expiry</w:t>
             </w:r>
             <w:proofErr w:type="spellEnd"/>
@@ -8499,6 +9388,7 @@
                 <w:sz w:val="20"/>
                 <w:szCs w:val="20"/>
               </w:rPr>
+              <w:lastRenderedPageBreak/>
               <w:t>S-04</w:t>
             </w:r>
           </w:p>
@@ -9078,14 +9968,41 @@
           <w:p>
             <w:pPr>
               <w:pStyle w:val="1"/>
+              <w:rPr>
+                <w:lang w:val="en-US"/>
+              </w:rPr>
             </w:pPr>
             <w:r>
-              <w:t>16. Модуль «Доставка»</w:t>
+              <w:rPr>
+                <w:lang w:val="en-US"/>
+              </w:rPr>
+              <w:t xml:space="preserve">16. </w:t>
+            </w:r>
+            <w:r>
+              <w:t>Модуль</w:t>
+            </w:r>
+            <w:r>
+              <w:rPr>
+                <w:lang w:val="en-US"/>
+              </w:rPr>
+              <w:t xml:space="preserve"> «</w:t>
+            </w:r>
+            <w:r>
+              <w:t>Доставка</w:t>
+            </w:r>
+            <w:r>
+              <w:rPr>
+                <w:lang w:val="en-US"/>
+              </w:rPr>
+              <w:t>»</w:t>
             </w:r>
           </w:p>
           <w:p>
             <w:pPr>
               <w:pStyle w:val="1"/>
+              <w:rPr>
+                <w:lang w:val="en-US"/>
+              </w:rPr>
             </w:pPr>
             <w:r>
               <w:t>Ответственный</w:t>
@@ -9117,7 +10034,67 @@
         </w:rPr>
       </w:pPr>
       <w:r>
-        <w:t>Ответственные маршруты: GET /delivery · GET /delivery/checkout · GET /delivery/payment · POST /delivery/payment · POST /delivery/confirm. Для подтверждения оплаты доставки используется signed preview-token fallback.</w:t>
+        <w:t>Ответственные</w:t>
+      </w:r>
+      <w:r>
+        <w:rPr>
+          <w:lang w:val="en-US"/>
+        </w:rPr>
+        <w:t xml:space="preserve"> </w:t>
+      </w:r>
+      <w:r>
+        <w:t>маршруты</w:t>
+      </w:r>
+      <w:r>
+        <w:rPr>
+          <w:lang w:val="en-US"/>
+        </w:rPr>
+        <w:t xml:space="preserve">: GET /delivery · GET /delivery/checkout · GET /delivery/payment · POST /delivery/payment · POST /delivery/confirm. </w:t>
+      </w:r>
+      <w:r>
+        <w:t>Для</w:t>
+      </w:r>
+      <w:r>
+        <w:rPr>
+          <w:lang w:val="en-US"/>
+        </w:rPr>
+        <w:t xml:space="preserve"> </w:t>
+      </w:r>
+      <w:r>
+        <w:t>подтверждения</w:t>
+      </w:r>
+      <w:r>
+        <w:rPr>
+          <w:lang w:val="en-US"/>
+        </w:rPr>
+        <w:t xml:space="preserve"> </w:t>
+      </w:r>
+      <w:r>
+        <w:t>оплаты</w:t>
+      </w:r>
+      <w:r>
+        <w:rPr>
+          <w:lang w:val="en-US"/>
+        </w:rPr>
+        <w:t xml:space="preserve"> </w:t>
+      </w:r>
+      <w:r>
+        <w:t>доставки</w:t>
+      </w:r>
+      <w:r>
+        <w:rPr>
+          <w:lang w:val="en-US"/>
+        </w:rPr>
+        <w:t xml:space="preserve"> </w:t>
+      </w:r>
+      <w:r>
+        <w:t>используется</w:t>
+      </w:r>
+      <w:r>
+        <w:rPr>
+          <w:lang w:val="en-US"/>
+        </w:rPr>
+        <w:t xml:space="preserve"> signed preview-token fallback.</w:t>
       </w:r>
     </w:p>
     <w:p>
@@ -9128,7 +10105,94 @@
         </w:rPr>
       </w:pPr>
       <w:r>
-        <w:t>Шаблоны: templates/menu.html (режим delivery_mode=True) · templates/delivery_checkout.html · templates/delivery_payment.html. Шаги оплаты используют signed preview-token, чтобы не зависеть только от server-session preview.</w:t>
+        <w:t>Шаблоны</w:t>
+      </w:r>
+      <w:r>
+        <w:rPr>
+          <w:lang w:val="en-US"/>
+        </w:rPr>
+        <w:t>: templates/menu.html (</w:t>
+      </w:r>
+      <w:r>
+        <w:t>режим</w:t>
+      </w:r>
+      <w:r>
+        <w:rPr>
+          <w:lang w:val="en-US"/>
+        </w:rPr>
+        <w:t xml:space="preserve"> delivery_mode=True) · templates/delivery_checkout.html · templates/delivery_payment.html. </w:t>
+      </w:r>
+      <w:r>
+        <w:t>Шаги</w:t>
+      </w:r>
+      <w:r>
+        <w:rPr>
+          <w:lang w:val="en-US"/>
+        </w:rPr>
+        <w:t xml:space="preserve"> </w:t>
+      </w:r>
+      <w:r>
+        <w:t>оплаты</w:t>
+      </w:r>
+      <w:r>
+        <w:rPr>
+          <w:lang w:val="en-US"/>
+        </w:rPr>
+        <w:t xml:space="preserve"> </w:t>
+      </w:r>
+      <w:r>
+        <w:t>используют</w:t>
+      </w:r>
+      <w:r>
+        <w:rPr>
+          <w:lang w:val="en-US"/>
+        </w:rPr>
+        <w:t xml:space="preserve"> signed preview-token, </w:t>
+      </w:r>
+      <w:r>
+        <w:t>чтобы</w:t>
+      </w:r>
+      <w:r>
+        <w:rPr>
+          <w:lang w:val="en-US"/>
+        </w:rPr>
+        <w:t xml:space="preserve"> </w:t>
+      </w:r>
+      <w:r>
+        <w:t>не</w:t>
+      </w:r>
+      <w:r>
+        <w:rPr>
+          <w:lang w:val="en-US"/>
+        </w:rPr>
+        <w:t xml:space="preserve"> </w:t>
+      </w:r>
+      <w:r>
+        <w:t>зависеть</w:t>
+      </w:r>
+      <w:r>
+        <w:rPr>
+          <w:lang w:val="en-US"/>
+        </w:rPr>
+        <w:t xml:space="preserve"> </w:t>
+      </w:r>
+      <w:r>
+        <w:t>только</w:t>
+      </w:r>
+      <w:r>
+        <w:rPr>
+          <w:lang w:val="en-US"/>
+        </w:rPr>
+        <w:t xml:space="preserve"> </w:t>
+      </w:r>
+      <w:r>
+        <w:t>от</w:t>
+      </w:r>
+      <w:r>
+        <w:rPr>
+          <w:lang w:val="en-US"/>
+        </w:rPr>
+        <w:t xml:space="preserve"> server-session preview.</w:t>
       </w:r>
     </w:p>
     <w:tbl>
@@ -9239,7 +10303,7 @@
           </w:tcPr>
           <w:p>
             <w:r>
-              <w:t>GET /delivery открывает страницу меню доставки (menu.html в режиме delivery_mode=True) без ошибок 500; авторизация для просмотра каталога не требуется. | GET /delivery/checkout требует авторизацию и показывает форму адреса; для неавторизованного пользователя выполняется редирект на /login. | POST /delivery/payment принимает данные адреса, формирует preview и signed preview-token, после чего выполняет переход на GET /delivery/payment. | GET /delivery/payment отображает предпросмотр суммы, адрес и данные доставки. | POST /delivery/confirm создаёт delivery-заказ в активном backend-хранилище (orders.json локально или app_state в Postgres); при потере session preview использует signed preview-token fallback; при AJAX-запросе возвращает JSON с order_url.</w:t>
+              <w:t>GET /delivery открывает страницу меню доставки (menu.html в режиме delivery_mode=True) без ошибок 500; авторизация для просмотра каталога не требуется. | GET /delivery/checkout требует авторизацию и показывает форму адреса; для неавторизованного пользователя выполняется редирект на /login. | POST /delivery/payment принимает данные адреса, формирует preview и signed preview-token, после чего выполняет переход на GET /delivery/payment. | GET /delivery/payment отображает предпросмотр суммы, адрес и данные доставки. | POST /delivery/confirm создаёт delivery-заказ в активном backend-хранилище (orders.json локально или в таблицах orders / order_items в Postgres); при потере session preview использует signed preview-token fallback; при AJAX-запросе возвращает JSON с order_url.</w:t>
             </w:r>
           </w:p>
         </w:tc>
@@ -9410,7 +10474,11 @@
           </w:tcPr>
           <w:p>
             <w:r>
-              <w:t>Повторный POST /delivery/confirm с устаревшим preview должен обрабатываться корректно без задвоения заказа. | Подтверждение оплаты доставки не должно падать только из-за потери server-session между экраном проверки и подтверждением — signed preview-token обязан восстановить preview. | Утверждение про обязательную активную карту или обязательное списание баллов для /delivery/confirm из документа исключено: это не следует из текущего route-описания.</w:t>
+              <w:t xml:space="preserve">Повторный POST /delivery/confirm с устаревшим preview должен обрабатываться корректно без задвоения заказа. | Подтверждение оплаты доставки не должно падать только из-за потери server-session между экраном проверки и подтверждением — signed preview-token обязан восстановить preview. | Утверждение про обязательную активную карту или обязательное списание баллов для </w:t>
+            </w:r>
+            <w:r>
+              <w:lastRenderedPageBreak/>
+              <w:t>/delivery/confirm из документа исключено: это не следует из текущего route-описания.</w:t>
             </w:r>
           </w:p>
         </w:tc>
@@ -9658,7 +10726,6 @@
               <w:pStyle w:val="1"/>
             </w:pPr>
             <w:r>
-              <w:lastRenderedPageBreak/>
               <w:t>18. UI меню на мобильных устройствах</w:t>
             </w:r>
           </w:p>
@@ -9891,6 +10958,7 @@
                 <w:sz w:val="20"/>
                 <w:szCs w:val="20"/>
               </w:rPr>
+              <w:lastRenderedPageBreak/>
               <w:t>Свайп</w:t>
             </w:r>
             <w:proofErr w:type="spellEnd"/>
@@ -9985,7 +11053,76 @@
           </w:tcPr>
           <w:p>
             <w:r>
-              <w:t>Bottom sheet учитывает safe-area (env(safe-area-inset-bottom)) на устройствах с вырезом/домашней кнопкой. При открытии корзины основной layout страницы не сдвигается. Дополнительно: на mobile каталог имеет отдельный выпадающий фильтр Тип рядом с сортировкой, а переключение категорий остаётся синхронизированным с общей логикой меню.</w:t>
+              <w:rPr>
+                <w:lang w:val="en-US"/>
+              </w:rPr>
+              <w:t xml:space="preserve">Bottom sheet </w:t>
+            </w:r>
+            <w:r>
+              <w:t>учитывает</w:t>
+            </w:r>
+            <w:r>
+              <w:rPr>
+                <w:lang w:val="en-US"/>
+              </w:rPr>
+              <w:t xml:space="preserve"> safe-area (env(safe-area-inset-bottom)) </w:t>
+            </w:r>
+            <w:r>
+              <w:t>на</w:t>
+            </w:r>
+            <w:r>
+              <w:rPr>
+                <w:lang w:val="en-US"/>
+              </w:rPr>
+              <w:t xml:space="preserve"> </w:t>
+            </w:r>
+            <w:r>
+              <w:t>устройствах</w:t>
+            </w:r>
+            <w:r>
+              <w:rPr>
+                <w:lang w:val="en-US"/>
+              </w:rPr>
+              <w:t xml:space="preserve"> </w:t>
+            </w:r>
+            <w:r>
+              <w:t>с</w:t>
+            </w:r>
+            <w:r>
+              <w:rPr>
+                <w:lang w:val="en-US"/>
+              </w:rPr>
+              <w:t xml:space="preserve"> </w:t>
+            </w:r>
+            <w:r>
+              <w:t>вырезом</w:t>
+            </w:r>
+            <w:r>
+              <w:rPr>
+                <w:lang w:val="en-US"/>
+              </w:rPr>
+              <w:t>/</w:t>
+            </w:r>
+            <w:r>
+              <w:t>домашней</w:t>
+            </w:r>
+            <w:r>
+              <w:rPr>
+                <w:lang w:val="en-US"/>
+              </w:rPr>
+              <w:t xml:space="preserve"> </w:t>
+            </w:r>
+            <w:r>
+              <w:t>кнопкой</w:t>
+            </w:r>
+            <w:r>
+              <w:rPr>
+                <w:lang w:val="en-US"/>
+              </w:rPr>
+              <w:t xml:space="preserve">. </w:t>
+            </w:r>
+            <w:r>
+              <w:t>При открытии корзины основной layout страницы не сдвигается. Дополнительно: на mobile каталог имеет отдельный выпадающий фильтр Тип рядом с сортировкой, а переключение категорий остаётся синхронизированным с общей логикой меню.</w:t>
             </w:r>
           </w:p>
         </w:tc>
@@ -10135,7 +11272,60 @@
         </w:rPr>
       </w:pPr>
       <w:r>
-        <w:t>base.html — базовый шаблон подключает static/js/app.js как &lt;script type="module"&gt;, а также пробрасывает auth globals для token-bootstrap и первой инициализации страниц.</w:t>
+        <w:t>base.html — базовый шаблон подключает static/js/app.js как &lt;script type="module"&gt; и пробрасывает `window.__SESSION_USER_ID` для первой инициализации страниц без token-bootstrap.</w:t>
+      </w:r>
+    </w:p>
+    <w:p>
+      <w:pPr>
+        <w:pStyle w:val="1"/>
+      </w:pPr>
+      <w:r>
+        <w:t>20. Актуализация документации на 19.03.2026</w:t>
+      </w:r>
+    </w:p>
+    <w:p>
+      <w:r>
+        <w:t>- Авторизация окончательно переведена на cookie-only схему: используются Flask session и signed `auth_session` cookie; token-bridge и `auth_token` больше не являются актуальной частью проекта.</w:t>
+      </w:r>
+    </w:p>
+    <w:p>
+      <w:r>
+        <w:t>- Для расчёта денег добавлен единый модуль `backend/services/order_totals.py`, который централизованно считает `items_total`, `service_fee`, `points_applied`, `payable_total` и `bonus_earned`.</w:t>
+      </w:r>
+    </w:p>
+    <w:p>
+      <w:r>
+        <w:t>- Доставка использует отдельный service fee `42 ₽`, который отображается на этапе оформления, сохраняется в заказе и входит в расчёт бонусов.</w:t>
+      </w:r>
+    </w:p>
+    <w:p>
+      <w:r>
+        <w:t>- Логика времени унифицирована через `APP_TIMEZONE` и `backend/services/business_logic.py`; одинаковая схема применяется для JSON-хранилища, Postgres-ветки, бронирований, ETA доставки и status bar.</w:t>
+      </w:r>
+    </w:p>
+    <w:p>
+      <w:r>
+        <w:t>- В профиль добавлены: анимированное раскрытие блока `+ Привязать новую карту`, подтверждение успешного добавления карты, live-валидация номера/срока/держателя и автоподгонка длинного имени пользователя.</w:t>
+      </w:r>
+    </w:p>
+    <w:p>
+      <w:r>
+        <w:t>- Уведомления теперь включают не только бронирования и статусы заказов, но и одну случайную promo-карточку из `backend/static/promo_items`; карточка адаптирована под mobile и desktop.</w:t>
+      </w:r>
+    </w:p>
+    <w:p>
+      <w:r>
+        <w:t>- Status bar на главной и уведомления используют уточнённый тайминг фаз заказа; отдельно исправлен сценарий, когда delivery-статус `Готовим заказ` мог преждевременно показывать `00:00`.</w:t>
+      </w:r>
+    </w:p>
+    <w:p>
+      <w:r>
+        <w:t>- Для проекта актуализированы автотесты: покрыты обычная оплата, доставка, бонусы, service fee и timezone-aware активность брони через `backend/tests/test_auth_and_flows.py`.</w:t>
+      </w:r>
+    </w:p>
+    <w:p>
+      <w:r>
+        <w:t>Примечание: после открытия документа в Microsoft Word рекомендуется обновить оглавление целиком, чтобы новый раздел попал в содержание.</w:t>
       </w:r>
     </w:p>
     <w:sectPr>

</xml_diff>